<commit_message>
Correct data-visibility claim per Vincent: exclusion filter is unbuilt
Vincent confirmed the archive/training flag exists but the filtering that
hides that data from live surfaces does not exist yet ('still visible in
prod', 'filtering is an enhancement ... at a later stage'). Propagate this
correction throughout: the spec no longer claims practice data is hidden in
production. It now states the mark is available now, the exclusion filter is
a required not-yet-built enhancement, and production go-live is blocked until
that filter is built and verified — until then the exercise runs only in
DEV/UAT. Re-passed the independent verifier on all gates.

Co-Authored-By: Claude Opus 4.8 <noreply@anthropic.com>
Claude-Session: https://claude.ai/code/session_018gbuxK96fv3iC6hdg5uCm7
</commit_message>
<xml_diff>
--- a/deliverables/US1117/SAM_OnSite_Guard_Onboarding_Spec.docx
+++ b/deliverables/US1117/SAM_OnSite_Guard_Onboarding_Spec.docx
@@ -295,7 +295,7 @@
                 <w:sz w:val="19"/>
                 <w:szCs w:val="19"/>
               </w:rPr>
-              <w:t xml:space="preserve">The first time a guard signs in, SAM — the in-app voice assistant — runs a short, required voice exercise that teaches the three things they will do every day: ask a question, report an incident, and correct a report. It uses a made-up incident so nothing real is affected, cannot be skipped, takes a few minutes, saves progress, and is marked complete only after the guard actually performs each step. All practice data is hidden from every live report and dashboard, and a guard can reopen the exercise later as a refresher.</w:t>
+              <w:t xml:space="preserve">The first time a guard signs in, SAM — the in-app voice assistant — runs a short, required voice exercise that teaches the three things they will do every day: ask a question, report an incident, and correct a report. It uses a made-up incident so nothing real is affected, cannot be skipped, takes a few minutes, saves progress, and is marked complete only after the guard actually performs each step. All practice data must be kept out of every live report and dashboard — and because the filter that enforces this is not built yet, the exercise runs in the internal test environments until it is. A guard can reopen the exercise later as a refresher.</w:t>
             </w:r>
           </w:p>
         </w:tc>
@@ -555,7 +555,7 @@
           <w:sz w:val="18"/>
           <w:szCs w:val="18"/>
         </w:rPr>
-        <w:t xml:space="preserve">Throughout, the practice report is marked as training the instant it is created, so it never appears in any live report, dashboard, analytics view, export, automated alert or integration, or the guard’s own activity list and search. An always-visible </w:t>
+        <w:t xml:space="preserve">Throughout, the practice report carries a training mark from the instant it is created; that mark is what must keep it out of every live report, dashboard, analytics view, export, automated alert or integration, and the guard’s own activity list and search. An always-visible </w:t>
       </w:r>
       <w:r>
         <w:rPr>
@@ -1591,7 +1591,7 @@
                 <w:sz w:val="18"/>
                 <w:szCs w:val="18"/>
               </w:rPr>
-              <w:t xml:space="preserve">Practice data stays invisible</w:t>
+              <w:t xml:space="preserve">Marked as training at creation</w:t>
             </w:r>
           </w:p>
           <w:p>
@@ -1644,7 +1644,7 @@
                 <w:sz w:val="18"/>
                 <w:szCs w:val="18"/>
               </w:rPr>
-              <w:t xml:space="preserve">The practice report is hidden from every live surface — reports, dashboards, analytics, exports, automated alerts and integrations, and the guard’s own activity list and search — for its whole life.</w:t>
+              <w:t xml:space="preserve">Every practice report is flagged as training (archive / soft-delete) the moment it is created — the platform already has this flag for exactly this purpose — so a report never exists un-marked.</w:t>
             </w:r>
           </w:p>
         </w:tc>
@@ -1685,7 +1685,7 @@
                 <w:sz w:val="18"/>
                 <w:szCs w:val="18"/>
               </w:rPr>
-              <w:t xml:space="preserve">Nothing leaks, even briefly</w:t>
+              <w:t xml:space="preserve">Kept out of every live surface</w:t>
             </w:r>
           </w:p>
           <w:p>
@@ -1700,9 +1700,9 @@
                 <w:color w:val="FFFFFF"/>
                 <w:sz w:val="15"/>
                 <w:szCs w:val="15"/>
-                <w:shd w:fill="8A6100" w:color="auto" w:val="clear"/>
-              </w:rPr>
-              <w:t xml:space="preserve"> Proposed </w:t>
+                <w:shd w:fill="2F6E4E" w:color="auto" w:val="clear"/>
+              </w:rPr>
+              <w:t xml:space="preserve"> Confirmed </w:t>
             </w:r>
           </w:p>
         </w:tc>
@@ -1738,7 +1738,7 @@
                 <w:sz w:val="18"/>
                 <w:szCs w:val="18"/>
               </w:rPr>
-              <w:t xml:space="preserve">Because an alert or integration message cannot be recalled once sent, nothing about the practice report is sent anywhere until the “training” mark is in place. If that cannot be guaranteed, the report is not created.</w:t>
+              <w:t xml:space="preserve">The practice report must appear in no live surface — reports, dashboards, analytics, exports, automated alerts and integrations, and the guard’s own activity list and search. The filter that excludes training-marked data does not exist yet, so archived data is currently still visible in production; this exclusion filter must be built and verified before go-live. Until then the exercise runs only in the internal test environments.</w:t>
             </w:r>
           </w:p>
         </w:tc>
@@ -2092,7 +2092,7 @@
           <w:sz w:val="19"/>
           <w:szCs w:val="19"/>
         </w:rPr>
-        <w:t xml:space="preserve">The made-up incident must never trigger a real response. It is marked as training in the same moment it is created — before anything is sent onward — and that mark is applied at the shared data layer as a </w:t>
+        <w:t xml:space="preserve">The made-up incident must never trigger a real response. Every practice report is marked as training the moment it is created — the platform already has this archive / soft-delete flag. </w:t>
       </w:r>
       <w:r>
         <w:rPr>
@@ -2105,7 +2105,7 @@
           <w:sz w:val="19"/>
           <w:szCs w:val="19"/>
         </w:rPr>
-        <w:t xml:space="preserve">hide-by-default</w:t>
+        <w:t xml:space="preserve">The dependency to be clear about:</w:t>
       </w:r>
       <w:r>
         <w:rPr>
@@ -2118,7 +2118,33 @@
           <w:sz w:val="19"/>
           <w:szCs w:val="19"/>
         </w:rPr>
-        <w:t xml:space="preserve"> rule: every current and future live surface hides it automatically, rather than each one having to remember to exclude it. If the system cannot create the report with that mark in a single step, it does not create the report at all. Permanent deletion of practice data is a separate clean-up done later; it is not needed for this release.</w:t>
+        <w:t xml:space="preserve"> the filtering that actually keeps marked data out of live surfaces does not exist yet — today, archived items are still visible in production — so it is a required enhancement, not something that works today. This exercise therefore runs only in the internal test environments until that exclusion filter is built and verified, and must not go live in production before then. When built, the filter should work </w:t>
+      </w:r>
+      <w:r>
+        <w:rPr>
+          <w:rFonts w:ascii="Calibri" w:cs="Calibri" w:eastAsia="Calibri" w:hAnsi="Calibri"/>
+          <w:b/>
+          <w:bCs/>
+          <w:i w:val="false"/>
+          <w:iCs w:val="false"/>
+          <w:color w:val="1F2A33"/>
+          <w:sz w:val="19"/>
+          <w:szCs w:val="19"/>
+        </w:rPr>
+        <w:t xml:space="preserve">hide-by-default</w:t>
+      </w:r>
+      <w:r>
+        <w:rPr>
+          <w:rFonts w:ascii="Calibri" w:cs="Calibri" w:eastAsia="Calibri" w:hAnsi="Calibri"/>
+          <w:b w:val="false"/>
+          <w:bCs w:val="false"/>
+          <w:i w:val="false"/>
+          <w:iCs w:val="false"/>
+          <w:color w:val="1F2A33"/>
+          <w:sz w:val="19"/>
+          <w:szCs w:val="19"/>
+        </w:rPr>
+        <w:t xml:space="preserve"> at the shared data layer, so every current and future live surface excludes training data automatically rather than each one having to remember to. Permanent deletion of practice data is a separate database clean-up done later; only the guard’s completion status is kept.</w:t>
       </w:r>
     </w:p>
     <w:p>
@@ -2836,7 +2862,7 @@
           <w:sz w:val="19"/>
           <w:szCs w:val="19"/>
         </w:rPr>
-        <w:t xml:space="preserve">What is the exact “training / archive” marker, and where are reports created and updated, so the mark can be applied at creation?</w:t>
+        <w:t xml:space="preserve">The archive / training flag exists — confirm exactly which live feeds, reports, alerts, integrations, and views the new exclusion filter must cover, and where reports are created so the flag is set at creation.</w:t>
       </w:r>
     </w:p>
     <w:p>
@@ -2909,7 +2935,7 @@
           <w:sz w:val="19"/>
           <w:szCs w:val="19"/>
         </w:rPr>
-        <w:t xml:space="preserve">Roll out behind a switch so it can be turned on gradually and turned off instantly — without erasing anyone’s completed status. Test first with a dedicated test customer account (tenant) and test guards in the internal environments, and confirm the practice report is hidden from </w:t>
+        <w:t xml:space="preserve">Production go-live is </w:t>
       </w:r>
       <w:r>
         <w:rPr>
@@ -2922,7 +2948,7 @@
           <w:sz w:val="19"/>
           <w:szCs w:val="19"/>
         </w:rPr>
-        <w:t xml:space="preserve">every</w:t>
+        <w:t xml:space="preserve">blocked</w:t>
       </w:r>
       <w:r>
         <w:rPr>
@@ -2935,7 +2961,7 @@
           <w:sz w:val="19"/>
           <w:szCs w:val="19"/>
         </w:rPr>
-        <w:t xml:space="preserve"> live surface before go-live. This is universal for all guards — no customer-specific setup — and it does not change any existing templates. Nothing reaches production without Vincent Smeyers’ sign-off.</w:t>
+        <w:t xml:space="preserve"> until the exclusion filter that hides training data from every live surface is built and verified; until then this runs only in the internal test environments (DEV/UAT) with a dedicated test customer account (tenant) and test guards. Roll out behind a switch so it can be turned on gradually and turned off instantly, without erasing anyone’s completed status. This is universal for all guards — no customer-specific setup — and it does not change any existing templates. Nothing reaches production without Vincent Smeyers’ sign-off.</w:t>
       </w:r>
     </w:p>
     <w:p>
@@ -3000,7 +3026,7 @@
           <w:sz w:val="19"/>
           <w:szCs w:val="19"/>
         </w:rPr>
-        <w:t xml:space="preserve">The practice report is proven absent from every live surface at every stage, and a forced hide-failure withholds completion.</w:t>
+        <w:t xml:space="preserve">The exclusion filter is built and the practice report is proven absent from every live surface, and a forced hide-failure withholds completion.</w:t>
       </w:r>
     </w:p>
     <w:p>

</xml_diff>

<commit_message>
Redesign both specs with a calm, human editorial look
Replace the heavy styling (dark table headers, zebra striping, filled colour
pills, multiple competing colours) with a calm system: soft light table
headers with a single accent underline, no zebra, quiet coloured text status
labels, one restrained dusty-blue accent, serif section titles with a small
accent numeral, soft callouts, and airy hairline-separated rows. Unified the
status-label colours across both builders. Content, traceability, honesty, and
the brief's 4-page length are unchanged; passed the independent verifier on the
redesign (calm look, consistency, no regression).

Co-Authored-By: Claude Opus 4.8 <noreply@anthropic.com>
Claude-Session: https://claude.ai/code/session_018gbuxK96fv3iC6hdg5uCm7
</commit_message>
<xml_diff>
--- a/deliverables/US1117/SAM_OnSite_Guard_Onboarding_Spec.docx
+++ b/deliverables/US1117/SAM_OnSite_Guard_Onboarding_Spec.docx
@@ -13,7 +13,7 @@
           <w:bCs/>
           <w:i w:val="false"/>
           <w:iCs w:val="false"/>
-          <w:color w:val="2F6E63"/>
+          <w:color w:val="4A6B82"/>
           <w:spacing w:val="40"/>
           <w:sz w:val="16"/>
           <w:szCs w:val="16"/>
@@ -30,7 +30,7 @@
           <w:rFonts w:ascii="Georgia" w:cs="Georgia" w:eastAsia="Georgia" w:hAnsi="Georgia"/>
           <w:b/>
           <w:bCs/>
-          <w:color w:val="1F2A33"/>
+          <w:color w:val="3A3A38"/>
           <w:sz w:val="46"/>
           <w:szCs w:val="46"/>
         </w:rPr>
@@ -40,16 +40,16 @@
     <w:p>
       <w:pPr>
         <w:pBdr>
-          <w:bottom w:val="single" w:color="2F6E63" w:sz="14" w:space="6"/>
+          <w:bottom w:val="single" w:color="4A6B82" w:sz="4" w:space="10"/>
         </w:pBdr>
-        <w:spacing w:after="100"/>
+        <w:spacing w:after="140"/>
       </w:pPr>
       <w:r>
         <w:rPr>
           <w:rFonts w:ascii="Georgia" w:cs="Georgia" w:eastAsia="Georgia" w:hAnsi="Georgia"/>
           <w:i/>
           <w:iCs/>
-          <w:color w:val="5C6B73"/>
+          <w:color w:val="77746E"/>
           <w:sz w:val="21"/>
           <w:szCs w:val="21"/>
         </w:rPr>
@@ -76,17 +76,17 @@
           <w:tcPr>
             <w:tcW w:type="dxa" w:w="9648"/>
             <w:tcBorders>
-              <w:top w:val="single" w:color="D5DEDB" w:sz="3"/>
-              <w:left w:val="single" w:color="D5DEDB" w:sz="3"/>
-              <w:bottom w:val="single" w:color="D5DEDB" w:sz="3"/>
-              <w:right w:val="single" w:color="D5DEDB" w:sz="3"/>
-            </w:tcBorders>
-            <w:shd w:fill="F5F8F7" w:color="auto" w:val="clear"/>
-            <w:tcMar>
-              <w:top w:type="dxa" w:w="70"/>
-              <w:left w:type="dxa" w:w="150"/>
-              <w:bottom w:type="dxa" w:w="70"/>
-              <w:right w:type="dxa" w:w="150"/>
+              <w:top w:val="none"/>
+              <w:left w:val="none"/>
+              <w:bottom w:val="none"/>
+              <w:right w:val="none"/>
+            </w:tcBorders>
+            <w:shd w:fill="F7F6F2" w:color="auto" w:val="clear"/>
+            <w:tcMar>
+              <w:top w:type="dxa" w:w="100"/>
+              <w:left w:type="dxa" w:w="180"/>
+              <w:bottom w:type="dxa" w:w="100"/>
+              <w:right w:type="dxa" w:w="180"/>
             </w:tcMar>
           </w:tcPr>
           <w:p>
@@ -100,7 +100,7 @@
                 <w:bCs/>
                 <w:i w:val="false"/>
                 <w:iCs w:val="false"/>
-                <w:color w:val="2F6E63"/>
+                <w:color w:val="4A6B82"/>
                 <w:spacing w:val="4"/>
                 <w:sz w:val="16"/>
                 <w:szCs w:val="16"/>
@@ -114,7 +114,7 @@
                 <w:bCs w:val="false"/>
                 <w:i w:val="false"/>
                 <w:iCs w:val="false"/>
-                <w:color w:val="1F2A33"/>
+                <w:color w:val="3A3A38"/>
                 <w:sz w:val="18"/>
                 <w:szCs w:val="18"/>
               </w:rPr>
@@ -127,7 +127,7 @@
                 <w:bCs/>
                 <w:i w:val="false"/>
                 <w:iCs w:val="false"/>
-                <w:color w:val="2F6E63"/>
+                <w:color w:val="4A6B82"/>
                 <w:spacing w:val="4"/>
                 <w:sz w:val="16"/>
                 <w:szCs w:val="16"/>
@@ -141,7 +141,7 @@
                 <w:bCs w:val="false"/>
                 <w:i w:val="false"/>
                 <w:iCs w:val="false"/>
-                <w:color w:val="1F2A33"/>
+                <w:color w:val="3A3A38"/>
                 <w:sz w:val="18"/>
                 <w:szCs w:val="18"/>
               </w:rPr>
@@ -154,7 +154,7 @@
                 <w:bCs/>
                 <w:i w:val="false"/>
                 <w:iCs w:val="false"/>
-                <w:color w:val="2F6E63"/>
+                <w:color w:val="4A6B82"/>
                 <w:spacing w:val="4"/>
                 <w:sz w:val="16"/>
                 <w:szCs w:val="16"/>
@@ -168,7 +168,7 @@
                 <w:bCs w:val="false"/>
                 <w:i w:val="false"/>
                 <w:iCs w:val="false"/>
-                <w:color w:val="1F2A33"/>
+                <w:color w:val="3A3A38"/>
                 <w:sz w:val="18"/>
                 <w:szCs w:val="18"/>
               </w:rPr>
@@ -181,7 +181,7 @@
                 <w:bCs/>
                 <w:i w:val="false"/>
                 <w:iCs w:val="false"/>
-                <w:color w:val="2F6E63"/>
+                <w:color w:val="4A6B82"/>
                 <w:spacing w:val="4"/>
                 <w:sz w:val="16"/>
                 <w:szCs w:val="16"/>
@@ -195,7 +195,7 @@
                 <w:bCs w:val="false"/>
                 <w:i w:val="false"/>
                 <w:iCs w:val="false"/>
-                <w:color w:val="1F2A33"/>
+                <w:color w:val="3A3A38"/>
                 <w:sz w:val="18"/>
                 <w:szCs w:val="18"/>
               </w:rPr>
@@ -208,7 +208,7 @@
                 <w:bCs/>
                 <w:i w:val="false"/>
                 <w:iCs w:val="false"/>
-                <w:color w:val="2F6E63"/>
+                <w:color w:val="4A6B82"/>
                 <w:spacing w:val="4"/>
                 <w:sz w:val="16"/>
                 <w:szCs w:val="16"/>
@@ -222,7 +222,7 @@
                 <w:bCs w:val="false"/>
                 <w:i w:val="false"/>
                 <w:iCs w:val="false"/>
-                <w:color w:val="1F2A33"/>
+                <w:color w:val="3A3A38"/>
                 <w:sz w:val="18"/>
                 <w:szCs w:val="18"/>
               </w:rPr>
@@ -241,10 +241,10 @@
       <w:tblPr>
         <w:tblW w:type="dxa" w:w="9648"/>
         <w:tblBorders>
-          <w:top w:val="single" w:color="CDD8D5" w:sz="3"/>
-          <w:left w:val="single" w:color="2F6E63" w:sz="22"/>
-          <w:bottom w:val="single" w:color="CDD8D5" w:sz="3"/>
-          <w:right w:val="single" w:color="CDD8D5" w:sz="3"/>
+          <w:top w:val="none"/>
+          <w:left w:val="single" w:color="4A6B82" w:sz="12"/>
+          <w:bottom w:val="none"/>
+          <w:right w:val="none"/>
           <w:insideH w:val="none"/>
           <w:insideV w:val="none"/>
         </w:tblBorders>
@@ -259,17 +259,17 @@
         <w:tc>
           <w:tcPr>
             <w:tcW w:type="dxa" w:w="9648"/>
-            <w:shd w:fill="F5F8F7" w:color="auto" w:val="clear"/>
-            <w:tcMar>
-              <w:top w:type="dxa" w:w="80"/>
-              <w:left w:type="dxa" w:w="150"/>
-              <w:bottom w:type="dxa" w:w="80"/>
-              <w:right w:type="dxa" w:w="150"/>
-            </w:tcMar>
-          </w:tcPr>
-          <w:p>
-            <w:pPr>
-              <w:spacing w:after="0" w:line="248" w:lineRule="auto"/>
+            <w:shd w:fill="F7F6F2" w:color="auto" w:val="clear"/>
+            <w:tcMar>
+              <w:top w:type="dxa" w:w="96"/>
+              <w:left w:type="dxa" w:w="170"/>
+              <w:bottom w:type="dxa" w:w="96"/>
+              <w:right w:type="dxa" w:w="170"/>
+            </w:tcMar>
+          </w:tcPr>
+          <w:p>
+            <w:pPr>
+              <w:spacing w:after="0" w:line="258" w:lineRule="auto"/>
             </w:pPr>
             <w:r>
               <w:rPr>
@@ -278,7 +278,7 @@
                 <w:bCs/>
                 <w:i w:val="false"/>
                 <w:iCs w:val="false"/>
-                <w:color w:val="234f47"/>
+                <w:color w:val="2E3A44"/>
                 <w:sz w:val="19"/>
                 <w:szCs w:val="19"/>
               </w:rPr>
@@ -291,7 +291,7 @@
                 <w:bCs w:val="false"/>
                 <w:i w:val="false"/>
                 <w:iCs w:val="false"/>
-                <w:color w:val="1F2A33"/>
+                <w:color w:val="3A3A38"/>
                 <w:sz w:val="19"/>
                 <w:szCs w:val="19"/>
               </w:rPr>
@@ -311,36 +311,35 @@
         <w:pStyle w:val="Heading1"/>
         <w:keepNext/>
         <w:pBdr>
-          <w:bottom w:val="single" w:color="CDD8D5" w:sz="6" w:space="4"/>
+          <w:bottom w:val="single" w:color="E6E4DF" w:sz="4" w:space="6"/>
         </w:pBdr>
-        <w:spacing w:after="80" w:before="200"/>
-      </w:pPr>
-      <w:r>
-        <w:rPr>
-          <w:rFonts w:ascii="Georgia" w:cs="Georgia" w:eastAsia="Georgia" w:hAnsi="Georgia"/>
+        <w:spacing w:after="78" w:before="220"/>
+      </w:pPr>
+      <w:r>
+        <w:rPr>
+          <w:rFonts w:ascii="Calibri" w:cs="Calibri" w:eastAsia="Calibri" w:hAnsi="Calibri"/>
           <w:b/>
           <w:bCs/>
-          <w:color w:val="2F6E63"/>
-          <w:sz w:val="24"/>
-          <w:szCs w:val="24"/>
-        </w:rPr>
-        <w:t xml:space="preserve">01  </w:t>
+          <w:color w:val="4A6B82"/>
+          <w:spacing w:val="10"/>
+          <w:sz w:val="19"/>
+          <w:szCs w:val="19"/>
+        </w:rPr>
+        <w:t xml:space="preserve">01   </w:t>
       </w:r>
       <w:r>
         <w:rPr>
           <w:rFonts w:ascii="Georgia" w:cs="Georgia" w:eastAsia="Georgia" w:hAnsi="Georgia"/>
-          <w:b/>
-          <w:bCs/>
-          <w:color w:val="1F2A33"/>
-          <w:sz w:val="24"/>
-          <w:szCs w:val="24"/>
+          <w:color w:val="3A3A38"/>
+          <w:sz w:val="25"/>
+          <w:szCs w:val="25"/>
         </w:rPr>
         <w:t xml:space="preserve">How it works, step by step</w:t>
       </w:r>
     </w:p>
     <w:p>
       <w:pPr>
-        <w:spacing w:after="60" w:line="250" w:lineRule="auto"/>
+        <w:spacing w:after="60" w:line="252" w:lineRule="auto"/>
       </w:pPr>
       <w:r>
         <w:rPr>
@@ -349,7 +348,7 @@
           <w:bCs w:val="false"/>
           <w:i w:val="false"/>
           <w:iCs w:val="false"/>
-          <w:color w:val="1F2A33"/>
+          <w:color w:val="3A3A38"/>
           <w:sz w:val="19"/>
           <w:szCs w:val="19"/>
         </w:rPr>
@@ -363,7 +362,7 @@
           <w:ilvl w:val="0"/>
           <w:numId w:val="2"/>
         </w:numPr>
-        <w:spacing w:after="46" w:line="246" w:lineRule="auto"/>
+        <w:spacing w:after="42" w:line="248" w:lineRule="auto"/>
       </w:pPr>
       <w:r>
         <w:rPr>
@@ -372,7 +371,7 @@
           <w:bCs w:val="false"/>
           <w:i w:val="false"/>
           <w:iCs w:val="false"/>
-          <w:color w:val="1F2A33"/>
+          <w:color w:val="3A3A38"/>
           <w:sz w:val="19"/>
           <w:szCs w:val="19"/>
         </w:rPr>
@@ -386,7 +385,7 @@
           <w:ilvl w:val="0"/>
           <w:numId w:val="2"/>
         </w:numPr>
-        <w:spacing w:after="46" w:line="246" w:lineRule="auto"/>
+        <w:spacing w:after="42" w:line="248" w:lineRule="auto"/>
       </w:pPr>
       <w:r>
         <w:rPr>
@@ -395,7 +394,7 @@
           <w:bCs w:val="false"/>
           <w:i w:val="false"/>
           <w:iCs w:val="false"/>
-          <w:color w:val="1F2A33"/>
+          <w:color w:val="3A3A38"/>
           <w:sz w:val="19"/>
           <w:szCs w:val="19"/>
         </w:rPr>
@@ -409,7 +408,7 @@
           <w:ilvl w:val="0"/>
           <w:numId w:val="2"/>
         </w:numPr>
-        <w:spacing w:after="46" w:line="246" w:lineRule="auto"/>
+        <w:spacing w:after="42" w:line="248" w:lineRule="auto"/>
       </w:pPr>
       <w:r>
         <w:rPr>
@@ -418,7 +417,7 @@
           <w:bCs w:val="false"/>
           <w:i w:val="false"/>
           <w:iCs w:val="false"/>
-          <w:color w:val="1F2A33"/>
+          <w:color w:val="3A3A38"/>
           <w:sz w:val="19"/>
           <w:szCs w:val="19"/>
         </w:rPr>
@@ -432,7 +431,7 @@
           <w:ilvl w:val="0"/>
           <w:numId w:val="2"/>
         </w:numPr>
-        <w:spacing w:after="46" w:line="246" w:lineRule="auto"/>
+        <w:spacing w:after="42" w:line="248" w:lineRule="auto"/>
       </w:pPr>
       <w:r>
         <w:rPr>
@@ -441,7 +440,7 @@
           <w:bCs w:val="false"/>
           <w:i w:val="false"/>
           <w:iCs w:val="false"/>
-          <w:color w:val="1F2A33"/>
+          <w:color w:val="3A3A38"/>
           <w:sz w:val="19"/>
           <w:szCs w:val="19"/>
         </w:rPr>
@@ -455,7 +454,7 @@
           <w:ilvl w:val="0"/>
           <w:numId w:val="2"/>
         </w:numPr>
-        <w:spacing w:after="46" w:line="246" w:lineRule="auto"/>
+        <w:spacing w:after="42" w:line="248" w:lineRule="auto"/>
       </w:pPr>
       <w:r>
         <w:rPr>
@@ -464,7 +463,7 @@
           <w:bCs w:val="false"/>
           <w:i w:val="false"/>
           <w:iCs w:val="false"/>
-          <w:color w:val="1F2A33"/>
+          <w:color w:val="3A3A38"/>
           <w:sz w:val="19"/>
           <w:szCs w:val="19"/>
         </w:rPr>
@@ -478,7 +477,7 @@
           <w:ilvl w:val="0"/>
           <w:numId w:val="2"/>
         </w:numPr>
-        <w:spacing w:after="46" w:line="246" w:lineRule="auto"/>
+        <w:spacing w:after="42" w:line="248" w:lineRule="auto"/>
       </w:pPr>
       <w:r>
         <w:rPr>
@@ -487,7 +486,7 @@
           <w:bCs w:val="false"/>
           <w:i w:val="false"/>
           <w:iCs w:val="false"/>
-          <w:color w:val="1F2A33"/>
+          <w:color w:val="3A3A38"/>
           <w:sz w:val="19"/>
           <w:szCs w:val="19"/>
         </w:rPr>
@@ -501,7 +500,7 @@
           <w:ilvl w:val="0"/>
           <w:numId w:val="2"/>
         </w:numPr>
-        <w:spacing w:after="46" w:line="246" w:lineRule="auto"/>
+        <w:spacing w:after="42" w:line="248" w:lineRule="auto"/>
       </w:pPr>
       <w:r>
         <w:rPr>
@@ -510,7 +509,7 @@
           <w:bCs w:val="false"/>
           <w:i w:val="false"/>
           <w:iCs w:val="false"/>
-          <w:color w:val="1F2A33"/>
+          <w:color w:val="3A3A38"/>
           <w:sz w:val="19"/>
           <w:szCs w:val="19"/>
         </w:rPr>
@@ -524,7 +523,7 @@
           <w:ilvl w:val="0"/>
           <w:numId w:val="2"/>
         </w:numPr>
-        <w:spacing w:after="46" w:line="246" w:lineRule="auto"/>
+        <w:spacing w:after="42" w:line="248" w:lineRule="auto"/>
       </w:pPr>
       <w:r>
         <w:rPr>
@@ -533,7 +532,7 @@
           <w:bCs w:val="false"/>
           <w:i w:val="false"/>
           <w:iCs w:val="false"/>
-          <w:color w:val="1F2A33"/>
+          <w:color w:val="3A3A38"/>
           <w:sz w:val="19"/>
           <w:szCs w:val="19"/>
         </w:rPr>
@@ -551,7 +550,7 @@
           <w:bCs w:val="false"/>
           <w:i w:val="false"/>
           <w:iCs w:val="false"/>
-          <w:color w:val="5C6B73"/>
+          <w:color w:val="77746E"/>
           <w:sz w:val="18"/>
           <w:szCs w:val="18"/>
         </w:rPr>
@@ -564,7 +563,7 @@
           <w:bCs/>
           <w:i w:val="false"/>
           <w:iCs w:val="false"/>
-          <w:color w:val="5C6B73"/>
+          <w:color w:val="77746E"/>
           <w:sz w:val="18"/>
           <w:szCs w:val="18"/>
         </w:rPr>
@@ -577,7 +576,7 @@
           <w:bCs w:val="false"/>
           <w:i w:val="false"/>
           <w:iCs w:val="false"/>
-          <w:color w:val="5C6B73"/>
+          <w:color w:val="77746E"/>
           <w:sz w:val="18"/>
           <w:szCs w:val="18"/>
         </w:rPr>
@@ -589,36 +588,35 @@
         <w:pStyle w:val="Heading1"/>
         <w:keepNext/>
         <w:pBdr>
-          <w:bottom w:val="single" w:color="CDD8D5" w:sz="6" w:space="4"/>
+          <w:bottom w:val="single" w:color="E6E4DF" w:sz="4" w:space="6"/>
         </w:pBdr>
-        <w:spacing w:after="80" w:before="200"/>
-      </w:pPr>
-      <w:r>
-        <w:rPr>
-          <w:rFonts w:ascii="Georgia" w:cs="Georgia" w:eastAsia="Georgia" w:hAnsi="Georgia"/>
+        <w:spacing w:after="78" w:before="220"/>
+      </w:pPr>
+      <w:r>
+        <w:rPr>
+          <w:rFonts w:ascii="Calibri" w:cs="Calibri" w:eastAsia="Calibri" w:hAnsi="Calibri"/>
           <w:b/>
           <w:bCs/>
-          <w:color w:val="2F6E63"/>
-          <w:sz w:val="24"/>
-          <w:szCs w:val="24"/>
-        </w:rPr>
-        <w:t xml:space="preserve">02  </w:t>
+          <w:color w:val="4A6B82"/>
+          <w:spacing w:val="10"/>
+          <w:sz w:val="19"/>
+          <w:szCs w:val="19"/>
+        </w:rPr>
+        <w:t xml:space="preserve">02   </w:t>
       </w:r>
       <w:r>
         <w:rPr>
           <w:rFonts w:ascii="Georgia" w:cs="Georgia" w:eastAsia="Georgia" w:hAnsi="Georgia"/>
-          <w:b/>
-          <w:bCs/>
-          <w:color w:val="1F2A33"/>
-          <w:sz w:val="24"/>
-          <w:szCs w:val="24"/>
+          <w:color w:val="3A3A38"/>
+          <w:sz w:val="25"/>
+          <w:szCs w:val="25"/>
         </w:rPr>
         <w:t xml:space="preserve">What must be true — and how we confirm it</w:t>
       </w:r>
     </w:p>
     <w:p>
       <w:pPr>
-        <w:spacing w:after="70" w:line="250" w:lineRule="auto"/>
+        <w:spacing w:after="70" w:line="252" w:lineRule="auto"/>
       </w:pPr>
       <w:r>
         <w:rPr>
@@ -627,7 +625,7 @@
           <w:bCs w:val="false"/>
           <w:i w:val="false"/>
           <w:iCs w:val="false"/>
-          <w:color w:val="1F2A33"/>
+          <w:color w:val="3A3A38"/>
           <w:sz w:val="18"/>
           <w:szCs w:val="18"/>
         </w:rPr>
@@ -638,12 +636,12 @@
           <w:rFonts w:ascii="Calibri" w:cs="Calibri" w:eastAsia="Calibri" w:hAnsi="Calibri"/>
           <w:b/>
           <w:bCs/>
-          <w:color w:val="FFFFFF"/>
-          <w:sz w:val="15"/>
-          <w:szCs w:val="15"/>
-          <w:shd w:fill="2F6E4E" w:color="auto" w:val="clear"/>
-        </w:rPr>
-        <w:t xml:space="preserve"> Confirmed </w:t>
+          <w:color w:val="43724E"/>
+          <w:spacing w:val="6"/>
+          <w:sz w:val="14"/>
+          <w:szCs w:val="14"/>
+        </w:rPr>
+        <w:t xml:space="preserve">CONFIRMED</w:t>
       </w:r>
       <w:r>
         <w:rPr>
@@ -652,7 +650,7 @@
           <w:bCs w:val="false"/>
           <w:i w:val="false"/>
           <w:iCs w:val="false"/>
-          <w:color w:val="5C6B73"/>
+          <w:color w:val="77746E"/>
           <w:sz w:val="16"/>
           <w:szCs w:val="16"/>
         </w:rPr>
@@ -663,12 +661,12 @@
           <w:rFonts w:ascii="Calibri" w:cs="Calibri" w:eastAsia="Calibri" w:hAnsi="Calibri"/>
           <w:b/>
           <w:bCs/>
-          <w:color w:val="FFFFFF"/>
-          <w:sz w:val="15"/>
-          <w:szCs w:val="15"/>
-          <w:shd w:fill="8A6100" w:color="auto" w:val="clear"/>
-        </w:rPr>
-        <w:t xml:space="preserve"> Proposed </w:t>
+          <w:color w:val="8A6A1F"/>
+          <w:spacing w:val="6"/>
+          <w:sz w:val="14"/>
+          <w:szCs w:val="14"/>
+        </w:rPr>
+        <w:t xml:space="preserve">PROPOSED</w:t>
       </w:r>
       <w:r>
         <w:rPr>
@@ -677,7 +675,7 @@
           <w:bCs w:val="false"/>
           <w:i w:val="false"/>
           <w:iCs w:val="false"/>
-          <w:color w:val="5C6B73"/>
+          <w:color w:val="77746E"/>
           <w:sz w:val="16"/>
           <w:szCs w:val="16"/>
         </w:rPr>
@@ -688,12 +686,12 @@
           <w:rFonts w:ascii="Calibri" w:cs="Calibri" w:eastAsia="Calibri" w:hAnsi="Calibri"/>
           <w:b/>
           <w:bCs/>
-          <w:color w:val="FFFFFF"/>
-          <w:sz w:val="15"/>
-          <w:szCs w:val="15"/>
-          <w:shd w:fill="9A3B2E" w:color="auto" w:val="clear"/>
-        </w:rPr>
-        <w:t xml:space="preserve"> Check w/ eng. </w:t>
+          <w:color w:val="A05A38"/>
+          <w:spacing w:val="6"/>
+          <w:sz w:val="14"/>
+          <w:szCs w:val="14"/>
+        </w:rPr>
+        <w:t xml:space="preserve">CHECK W/ ENG.</w:t>
       </w:r>
       <w:r>
         <w:rPr>
@@ -702,7 +700,7 @@
           <w:bCs w:val="false"/>
           <w:i w:val="false"/>
           <w:iCs w:val="false"/>
-          <w:color w:val="5C6B73"/>
+          <w:color w:val="77746E"/>
           <w:sz w:val="16"/>
           <w:szCs w:val="16"/>
         </w:rPr>
@@ -713,12 +711,12 @@
       <w:tblPr>
         <w:tblW w:type="dxa" w:w="9648"/>
         <w:tblBorders>
-          <w:top w:val="single" w:color="D5DEDB" w:sz="3"/>
-          <w:left w:val="single" w:color="D5DEDB" w:sz="3"/>
-          <w:bottom w:val="single" w:color="D5DEDB" w:sz="3"/>
-          <w:right w:val="single" w:color="D5DEDB" w:sz="3"/>
-          <w:insideH w:val="single" w:color="D5DEDB" w:sz="3"/>
-          <w:insideV w:val="single" w:color="D5DEDB" w:sz="3"/>
+          <w:top w:val="none"/>
+          <w:left w:val="none"/>
+          <w:bottom w:val="none"/>
+          <w:right w:val="none"/>
+          <w:insideH w:val="single" w:color="E6E4DF" w:sz="2"/>
+          <w:insideV w:val="none"/>
         </w:tblBorders>
       </w:tblPr>
       <w:tblGrid>
@@ -734,19 +732,18 @@
           <w:tcPr>
             <w:tcW w:type="dxa" w:w="2340"/>
             <w:tcBorders>
-              <w:top w:val="single" w:color="D5DEDB" w:sz="3"/>
-              <w:left w:val="single" w:color="D5DEDB" w:sz="3"/>
-              <w:bottom w:val="single" w:color="D5DEDB" w:sz="3"/>
-              <w:right w:val="single" w:color="D5DEDB" w:sz="3"/>
-            </w:tcBorders>
-            <w:shd w:fill="1F2A33" w:color="auto" w:val="clear"/>
-            <w:tcMar>
-              <w:top w:type="dxa" w:w="60"/>
-              <w:left w:type="dxa" w:w="96"/>
-              <w:bottom w:type="dxa" w:w="60"/>
-              <w:right w:type="dxa" w:w="96"/>
-            </w:tcMar>
-            <w:vAlign w:val="center"/>
+              <w:top w:val="none"/>
+              <w:left w:val="none"/>
+              <w:bottom w:val="single" w:color="4A6B82" w:sz="8"/>
+              <w:right w:val="none"/>
+            </w:tcBorders>
+            <w:tcMar>
+              <w:top w:type="dxa" w:w="30"/>
+              <w:left w:type="dxa" w:w="40"/>
+              <w:bottom w:type="dxa" w:w="52"/>
+              <w:right w:type="dxa" w:w="150"/>
+            </w:tcMar>
+            <w:vAlign w:val="bottom"/>
           </w:tcPr>
           <w:p>
             <w:pPr>
@@ -757,12 +754,12 @@
                 <w:rFonts w:ascii="Calibri" w:cs="Calibri" w:eastAsia="Calibri" w:hAnsi="Calibri"/>
                 <w:b/>
                 <w:bCs/>
-                <w:color w:val="FFFFFF"/>
-                <w:spacing w:val="3"/>
-                <w:sz w:val="18"/>
-                <w:szCs w:val="18"/>
-              </w:rPr>
-              <w:t xml:space="preserve">Requirement</w:t>
+                <w:color w:val="4A6B82"/>
+                <w:spacing w:val="8"/>
+                <w:sz w:val="15"/>
+                <w:szCs w:val="15"/>
+              </w:rPr>
+              <w:t xml:space="preserve">REQUIREMENT</w:t>
             </w:r>
           </w:p>
         </w:tc>
@@ -770,19 +767,18 @@
           <w:tcPr>
             <w:tcW w:type="dxa" w:w="7308"/>
             <w:tcBorders>
-              <w:top w:val="single" w:color="D5DEDB" w:sz="3"/>
-              <w:left w:val="single" w:color="D5DEDB" w:sz="3"/>
-              <w:bottom w:val="single" w:color="D5DEDB" w:sz="3"/>
-              <w:right w:val="single" w:color="D5DEDB" w:sz="3"/>
-            </w:tcBorders>
-            <w:shd w:fill="1F2A33" w:color="auto" w:val="clear"/>
-            <w:tcMar>
-              <w:top w:type="dxa" w:w="60"/>
-              <w:left w:type="dxa" w:w="96"/>
-              <w:bottom w:type="dxa" w:w="60"/>
-              <w:right w:type="dxa" w:w="96"/>
-            </w:tcMar>
-            <w:vAlign w:val="center"/>
+              <w:top w:val="none"/>
+              <w:left w:val="none"/>
+              <w:bottom w:val="single" w:color="4A6B82" w:sz="8"/>
+              <w:right w:val="none"/>
+            </w:tcBorders>
+            <w:tcMar>
+              <w:top w:type="dxa" w:w="30"/>
+              <w:left w:type="dxa" w:w="40"/>
+              <w:bottom w:type="dxa" w:w="52"/>
+              <w:right w:type="dxa" w:w="150"/>
+            </w:tcMar>
+            <w:vAlign w:val="bottom"/>
           </w:tcPr>
           <w:p>
             <w:pPr>
@@ -793,12 +789,12 @@
                 <w:rFonts w:ascii="Calibri" w:cs="Calibri" w:eastAsia="Calibri" w:hAnsi="Calibri"/>
                 <w:b/>
                 <w:bCs/>
-                <w:color w:val="FFFFFF"/>
-                <w:spacing w:val="3"/>
-                <w:sz w:val="18"/>
-                <w:szCs w:val="18"/>
-              </w:rPr>
-              <w:t xml:space="preserve">What it means and how we confirm it</w:t>
+                <w:color w:val="4A6B82"/>
+                <w:spacing w:val="8"/>
+                <w:sz w:val="15"/>
+                <w:szCs w:val="15"/>
+              </w:rPr>
+              <w:t xml:space="preserve">WHAT IT MEANS AND HOW WE CONFIRM IT</w:t>
             </w:r>
           </w:p>
         </w:tc>
@@ -811,16 +807,16 @@
           <w:tcPr>
             <w:tcW w:type="dxa" w:w="2340"/>
             <w:tcBorders>
-              <w:top w:val="single" w:color="D5DEDB" w:sz="3"/>
-              <w:left w:val="single" w:color="D5DEDB" w:sz="3"/>
-              <w:bottom w:val="single" w:color="D5DEDB" w:sz="3"/>
-              <w:right w:val="single" w:color="D5DEDB" w:sz="3"/>
-            </w:tcBorders>
-            <w:tcMar>
-              <w:top w:type="dxa" w:w="54"/>
-              <w:left w:type="dxa" w:w="96"/>
-              <w:bottom w:type="dxa" w:w="54"/>
-              <w:right w:type="dxa" w:w="96"/>
+              <w:top w:val="none"/>
+              <w:left w:val="none"/>
+              <w:bottom w:val="none"/>
+              <w:right w:val="none"/>
+            </w:tcBorders>
+            <w:tcMar>
+              <w:top w:type="dxa" w:w="56"/>
+              <w:left w:type="dxa" w:w="40"/>
+              <w:bottom w:type="dxa" w:w="56"/>
+              <w:right w:type="dxa" w:w="150"/>
             </w:tcMar>
             <w:vAlign w:val="top"/>
           </w:tcPr>
@@ -835,7 +831,7 @@
                 <w:bCs/>
                 <w:i w:val="false"/>
                 <w:iCs w:val="false"/>
-                <w:color w:val="1F2A33"/>
+                <w:color w:val="3A3A38"/>
                 <w:sz w:val="18"/>
                 <w:szCs w:val="18"/>
               </w:rPr>
@@ -851,12 +847,12 @@
                 <w:rFonts w:ascii="Calibri" w:cs="Calibri" w:eastAsia="Calibri" w:hAnsi="Calibri"/>
                 <w:b/>
                 <w:bCs/>
-                <w:color w:val="FFFFFF"/>
-                <w:sz w:val="15"/>
-                <w:szCs w:val="15"/>
-                <w:shd w:fill="2F6E4E" w:color="auto" w:val="clear"/>
-              </w:rPr>
-              <w:t xml:space="preserve"> Confirmed </w:t>
+                <w:color w:val="43724E"/>
+                <w:spacing w:val="6"/>
+                <w:sz w:val="14"/>
+                <w:szCs w:val="14"/>
+              </w:rPr>
+              <w:t xml:space="preserve">CONFIRMED</w:t>
             </w:r>
           </w:p>
         </w:tc>
@@ -864,16 +860,16 @@
           <w:tcPr>
             <w:tcW w:type="dxa" w:w="7308"/>
             <w:tcBorders>
-              <w:top w:val="single" w:color="D5DEDB" w:sz="3"/>
-              <w:left w:val="single" w:color="D5DEDB" w:sz="3"/>
-              <w:bottom w:val="single" w:color="D5DEDB" w:sz="3"/>
-              <w:right w:val="single" w:color="D5DEDB" w:sz="3"/>
-            </w:tcBorders>
-            <w:tcMar>
-              <w:top w:type="dxa" w:w="54"/>
-              <w:left w:type="dxa" w:w="96"/>
-              <w:bottom w:type="dxa" w:w="54"/>
-              <w:right w:type="dxa" w:w="96"/>
+              <w:top w:val="none"/>
+              <w:left w:val="none"/>
+              <w:bottom w:val="none"/>
+              <w:right w:val="none"/>
+            </w:tcBorders>
+            <w:tcMar>
+              <w:top w:type="dxa" w:w="56"/>
+              <w:left w:type="dxa" w:w="40"/>
+              <w:bottom w:type="dxa" w:w="56"/>
+              <w:right w:type="dxa" w:w="150"/>
             </w:tcMar>
             <w:vAlign w:val="top"/>
           </w:tcPr>
@@ -888,7 +884,7 @@
                 <w:bCs w:val="false"/>
                 <w:i w:val="false"/>
                 <w:iCs w:val="false"/>
-                <w:color w:val="1F2A33"/>
+                <w:color w:val="3A3A38"/>
                 <w:sz w:val="18"/>
                 <w:szCs w:val="18"/>
               </w:rPr>
@@ -905,16 +901,16 @@
           <w:tcPr>
             <w:tcW w:type="dxa" w:w="2340"/>
             <w:tcBorders>
-              <w:top w:val="single" w:color="D5DEDB" w:sz="3"/>
-              <w:left w:val="single" w:color="D5DEDB" w:sz="3"/>
-              <w:bottom w:val="single" w:color="D5DEDB" w:sz="3"/>
-              <w:right w:val="single" w:color="D5DEDB" w:sz="3"/>
-            </w:tcBorders>
-            <w:tcMar>
-              <w:top w:type="dxa" w:w="54"/>
-              <w:left w:type="dxa" w:w="96"/>
-              <w:bottom w:type="dxa" w:w="54"/>
-              <w:right w:type="dxa" w:w="96"/>
+              <w:top w:val="none"/>
+              <w:left w:val="none"/>
+              <w:bottom w:val="none"/>
+              <w:right w:val="none"/>
+            </w:tcBorders>
+            <w:tcMar>
+              <w:top w:type="dxa" w:w="56"/>
+              <w:left w:type="dxa" w:w="40"/>
+              <w:bottom w:type="dxa" w:w="56"/>
+              <w:right w:type="dxa" w:w="150"/>
             </w:tcMar>
             <w:vAlign w:val="top"/>
           </w:tcPr>
@@ -929,7 +925,7 @@
                 <w:bCs/>
                 <w:i w:val="false"/>
                 <w:iCs w:val="false"/>
-                <w:color w:val="1F2A33"/>
+                <w:color w:val="3A3A38"/>
                 <w:sz w:val="18"/>
                 <w:szCs w:val="18"/>
               </w:rPr>
@@ -945,12 +941,12 @@
                 <w:rFonts w:ascii="Calibri" w:cs="Calibri" w:eastAsia="Calibri" w:hAnsi="Calibri"/>
                 <w:b/>
                 <w:bCs/>
-                <w:color w:val="FFFFFF"/>
-                <w:sz w:val="15"/>
-                <w:szCs w:val="15"/>
-                <w:shd w:fill="2F6E4E" w:color="auto" w:val="clear"/>
-              </w:rPr>
-              <w:t xml:space="preserve"> Confirmed </w:t>
+                <w:color w:val="43724E"/>
+                <w:spacing w:val="6"/>
+                <w:sz w:val="14"/>
+                <w:szCs w:val="14"/>
+              </w:rPr>
+              <w:t xml:space="preserve">CONFIRMED</w:t>
             </w:r>
           </w:p>
         </w:tc>
@@ -958,16 +954,16 @@
           <w:tcPr>
             <w:tcW w:type="dxa" w:w="7308"/>
             <w:tcBorders>
-              <w:top w:val="single" w:color="D5DEDB" w:sz="3"/>
-              <w:left w:val="single" w:color="D5DEDB" w:sz="3"/>
-              <w:bottom w:val="single" w:color="D5DEDB" w:sz="3"/>
-              <w:right w:val="single" w:color="D5DEDB" w:sz="3"/>
-            </w:tcBorders>
-            <w:tcMar>
-              <w:top w:type="dxa" w:w="54"/>
-              <w:left w:type="dxa" w:w="96"/>
-              <w:bottom w:type="dxa" w:w="54"/>
-              <w:right w:type="dxa" w:w="96"/>
+              <w:top w:val="none"/>
+              <w:left w:val="none"/>
+              <w:bottom w:val="none"/>
+              <w:right w:val="none"/>
+            </w:tcBorders>
+            <w:tcMar>
+              <w:top w:type="dxa" w:w="56"/>
+              <w:left w:type="dxa" w:w="40"/>
+              <w:bottom w:type="dxa" w:w="56"/>
+              <w:right w:type="dxa" w:w="150"/>
             </w:tcMar>
             <w:vAlign w:val="top"/>
           </w:tcPr>
@@ -982,7 +978,7 @@
                 <w:bCs w:val="false"/>
                 <w:i w:val="false"/>
                 <w:iCs w:val="false"/>
-                <w:color w:val="1F2A33"/>
+                <w:color w:val="3A3A38"/>
                 <w:sz w:val="18"/>
                 <w:szCs w:val="18"/>
               </w:rPr>
@@ -999,16 +995,16 @@
           <w:tcPr>
             <w:tcW w:type="dxa" w:w="2340"/>
             <w:tcBorders>
-              <w:top w:val="single" w:color="D5DEDB" w:sz="3"/>
-              <w:left w:val="single" w:color="D5DEDB" w:sz="3"/>
-              <w:bottom w:val="single" w:color="D5DEDB" w:sz="3"/>
-              <w:right w:val="single" w:color="D5DEDB" w:sz="3"/>
-            </w:tcBorders>
-            <w:tcMar>
-              <w:top w:type="dxa" w:w="54"/>
-              <w:left w:type="dxa" w:w="96"/>
-              <w:bottom w:type="dxa" w:w="54"/>
-              <w:right w:type="dxa" w:w="96"/>
+              <w:top w:val="none"/>
+              <w:left w:val="none"/>
+              <w:bottom w:val="none"/>
+              <w:right w:val="none"/>
+            </w:tcBorders>
+            <w:tcMar>
+              <w:top w:type="dxa" w:w="56"/>
+              <w:left w:type="dxa" w:w="40"/>
+              <w:bottom w:type="dxa" w:w="56"/>
+              <w:right w:type="dxa" w:w="150"/>
             </w:tcMar>
             <w:vAlign w:val="top"/>
           </w:tcPr>
@@ -1023,7 +1019,7 @@
                 <w:bCs/>
                 <w:i w:val="false"/>
                 <w:iCs w:val="false"/>
-                <w:color w:val="1F2A33"/>
+                <w:color w:val="3A3A38"/>
                 <w:sz w:val="18"/>
                 <w:szCs w:val="18"/>
               </w:rPr>
@@ -1039,12 +1035,12 @@
                 <w:rFonts w:ascii="Calibri" w:cs="Calibri" w:eastAsia="Calibri" w:hAnsi="Calibri"/>
                 <w:b/>
                 <w:bCs/>
-                <w:color w:val="FFFFFF"/>
-                <w:sz w:val="15"/>
-                <w:szCs w:val="15"/>
-                <w:shd w:fill="2F6E4E" w:color="auto" w:val="clear"/>
-              </w:rPr>
-              <w:t xml:space="preserve"> Confirmed </w:t>
+                <w:color w:val="43724E"/>
+                <w:spacing w:val="6"/>
+                <w:sz w:val="14"/>
+                <w:szCs w:val="14"/>
+              </w:rPr>
+              <w:t xml:space="preserve">CONFIRMED</w:t>
             </w:r>
           </w:p>
         </w:tc>
@@ -1052,16 +1048,16 @@
           <w:tcPr>
             <w:tcW w:type="dxa" w:w="7308"/>
             <w:tcBorders>
-              <w:top w:val="single" w:color="D5DEDB" w:sz="3"/>
-              <w:left w:val="single" w:color="D5DEDB" w:sz="3"/>
-              <w:bottom w:val="single" w:color="D5DEDB" w:sz="3"/>
-              <w:right w:val="single" w:color="D5DEDB" w:sz="3"/>
-            </w:tcBorders>
-            <w:tcMar>
-              <w:top w:type="dxa" w:w="54"/>
-              <w:left w:type="dxa" w:w="96"/>
-              <w:bottom w:type="dxa" w:w="54"/>
-              <w:right w:type="dxa" w:w="96"/>
+              <w:top w:val="none"/>
+              <w:left w:val="none"/>
+              <w:bottom w:val="none"/>
+              <w:right w:val="none"/>
+            </w:tcBorders>
+            <w:tcMar>
+              <w:top w:type="dxa" w:w="56"/>
+              <w:left w:type="dxa" w:w="40"/>
+              <w:bottom w:type="dxa" w:w="56"/>
+              <w:right w:type="dxa" w:w="150"/>
             </w:tcMar>
             <w:vAlign w:val="top"/>
           </w:tcPr>
@@ -1076,7 +1072,7 @@
                 <w:bCs w:val="false"/>
                 <w:i w:val="false"/>
                 <w:iCs w:val="false"/>
-                <w:color w:val="1F2A33"/>
+                <w:color w:val="3A3A38"/>
                 <w:sz w:val="18"/>
                 <w:szCs w:val="18"/>
               </w:rPr>
@@ -1093,16 +1089,16 @@
           <w:tcPr>
             <w:tcW w:type="dxa" w:w="2340"/>
             <w:tcBorders>
-              <w:top w:val="single" w:color="D5DEDB" w:sz="3"/>
-              <w:left w:val="single" w:color="D5DEDB" w:sz="3"/>
-              <w:bottom w:val="single" w:color="D5DEDB" w:sz="3"/>
-              <w:right w:val="single" w:color="D5DEDB" w:sz="3"/>
-            </w:tcBorders>
-            <w:tcMar>
-              <w:top w:type="dxa" w:w="54"/>
-              <w:left w:type="dxa" w:w="96"/>
-              <w:bottom w:type="dxa" w:w="54"/>
-              <w:right w:type="dxa" w:w="96"/>
+              <w:top w:val="none"/>
+              <w:left w:val="none"/>
+              <w:bottom w:val="none"/>
+              <w:right w:val="none"/>
+            </w:tcBorders>
+            <w:tcMar>
+              <w:top w:type="dxa" w:w="56"/>
+              <w:left w:type="dxa" w:w="40"/>
+              <w:bottom w:type="dxa" w:w="56"/>
+              <w:right w:type="dxa" w:w="150"/>
             </w:tcMar>
             <w:vAlign w:val="top"/>
           </w:tcPr>
@@ -1117,7 +1113,7 @@
                 <w:bCs/>
                 <w:i w:val="false"/>
                 <w:iCs w:val="false"/>
-                <w:color w:val="1F2A33"/>
+                <w:color w:val="3A3A38"/>
                 <w:sz w:val="18"/>
                 <w:szCs w:val="18"/>
               </w:rPr>
@@ -1133,12 +1129,12 @@
                 <w:rFonts w:ascii="Calibri" w:cs="Calibri" w:eastAsia="Calibri" w:hAnsi="Calibri"/>
                 <w:b/>
                 <w:bCs/>
-                <w:color w:val="FFFFFF"/>
-                <w:sz w:val="15"/>
-                <w:szCs w:val="15"/>
-                <w:shd w:fill="2F6E4E" w:color="auto" w:val="clear"/>
-              </w:rPr>
-              <w:t xml:space="preserve"> Confirmed </w:t>
+                <w:color w:val="43724E"/>
+                <w:spacing w:val="6"/>
+                <w:sz w:val="14"/>
+                <w:szCs w:val="14"/>
+              </w:rPr>
+              <w:t xml:space="preserve">CONFIRMED</w:t>
             </w:r>
           </w:p>
         </w:tc>
@@ -1146,16 +1142,16 @@
           <w:tcPr>
             <w:tcW w:type="dxa" w:w="7308"/>
             <w:tcBorders>
-              <w:top w:val="single" w:color="D5DEDB" w:sz="3"/>
-              <w:left w:val="single" w:color="D5DEDB" w:sz="3"/>
-              <w:bottom w:val="single" w:color="D5DEDB" w:sz="3"/>
-              <w:right w:val="single" w:color="D5DEDB" w:sz="3"/>
-            </w:tcBorders>
-            <w:tcMar>
-              <w:top w:type="dxa" w:w="54"/>
-              <w:left w:type="dxa" w:w="96"/>
-              <w:bottom w:type="dxa" w:w="54"/>
-              <w:right w:type="dxa" w:w="96"/>
+              <w:top w:val="none"/>
+              <w:left w:val="none"/>
+              <w:bottom w:val="none"/>
+              <w:right w:val="none"/>
+            </w:tcBorders>
+            <w:tcMar>
+              <w:top w:type="dxa" w:w="56"/>
+              <w:left w:type="dxa" w:w="40"/>
+              <w:bottom w:type="dxa" w:w="56"/>
+              <w:right w:type="dxa" w:w="150"/>
             </w:tcMar>
             <w:vAlign w:val="top"/>
           </w:tcPr>
@@ -1170,7 +1166,7 @@
                 <w:bCs w:val="false"/>
                 <w:i w:val="false"/>
                 <w:iCs w:val="false"/>
-                <w:color w:val="1F2A33"/>
+                <w:color w:val="3A3A38"/>
                 <w:sz w:val="18"/>
                 <w:szCs w:val="18"/>
               </w:rPr>
@@ -1187,16 +1183,16 @@
           <w:tcPr>
             <w:tcW w:type="dxa" w:w="2340"/>
             <w:tcBorders>
-              <w:top w:val="single" w:color="D5DEDB" w:sz="3"/>
-              <w:left w:val="single" w:color="D5DEDB" w:sz="3"/>
-              <w:bottom w:val="single" w:color="D5DEDB" w:sz="3"/>
-              <w:right w:val="single" w:color="D5DEDB" w:sz="3"/>
-            </w:tcBorders>
-            <w:tcMar>
-              <w:top w:type="dxa" w:w="54"/>
-              <w:left w:type="dxa" w:w="96"/>
-              <w:bottom w:type="dxa" w:w="54"/>
-              <w:right w:type="dxa" w:w="96"/>
+              <w:top w:val="none"/>
+              <w:left w:val="none"/>
+              <w:bottom w:val="none"/>
+              <w:right w:val="none"/>
+            </w:tcBorders>
+            <w:tcMar>
+              <w:top w:type="dxa" w:w="56"/>
+              <w:left w:type="dxa" w:w="40"/>
+              <w:bottom w:type="dxa" w:w="56"/>
+              <w:right w:type="dxa" w:w="150"/>
             </w:tcMar>
             <w:vAlign w:val="top"/>
           </w:tcPr>
@@ -1211,7 +1207,7 @@
                 <w:bCs/>
                 <w:i w:val="false"/>
                 <w:iCs w:val="false"/>
-                <w:color w:val="1F2A33"/>
+                <w:color w:val="3A3A38"/>
                 <w:sz w:val="18"/>
                 <w:szCs w:val="18"/>
               </w:rPr>
@@ -1227,12 +1223,12 @@
                 <w:rFonts w:ascii="Calibri" w:cs="Calibri" w:eastAsia="Calibri" w:hAnsi="Calibri"/>
                 <w:b/>
                 <w:bCs/>
-                <w:color w:val="FFFFFF"/>
-                <w:sz w:val="15"/>
-                <w:szCs w:val="15"/>
-                <w:shd w:fill="8A6100" w:color="auto" w:val="clear"/>
-              </w:rPr>
-              <w:t xml:space="preserve"> Proposed </w:t>
+                <w:color w:val="8A6A1F"/>
+                <w:spacing w:val="6"/>
+                <w:sz w:val="14"/>
+                <w:szCs w:val="14"/>
+              </w:rPr>
+              <w:t xml:space="preserve">PROPOSED</w:t>
             </w:r>
           </w:p>
         </w:tc>
@@ -1240,16 +1236,16 @@
           <w:tcPr>
             <w:tcW w:type="dxa" w:w="7308"/>
             <w:tcBorders>
-              <w:top w:val="single" w:color="D5DEDB" w:sz="3"/>
-              <w:left w:val="single" w:color="D5DEDB" w:sz="3"/>
-              <w:bottom w:val="single" w:color="D5DEDB" w:sz="3"/>
-              <w:right w:val="single" w:color="D5DEDB" w:sz="3"/>
-            </w:tcBorders>
-            <w:tcMar>
-              <w:top w:type="dxa" w:w="54"/>
-              <w:left w:type="dxa" w:w="96"/>
-              <w:bottom w:type="dxa" w:w="54"/>
-              <w:right w:type="dxa" w:w="96"/>
+              <w:top w:val="none"/>
+              <w:left w:val="none"/>
+              <w:bottom w:val="none"/>
+              <w:right w:val="none"/>
+            </w:tcBorders>
+            <w:tcMar>
+              <w:top w:type="dxa" w:w="56"/>
+              <w:left w:type="dxa" w:w="40"/>
+              <w:bottom w:type="dxa" w:w="56"/>
+              <w:right w:type="dxa" w:w="150"/>
             </w:tcMar>
             <w:vAlign w:val="top"/>
           </w:tcPr>
@@ -1264,7 +1260,7 @@
                 <w:bCs w:val="false"/>
                 <w:i w:val="false"/>
                 <w:iCs w:val="false"/>
-                <w:color w:val="1F2A33"/>
+                <w:color w:val="3A3A38"/>
                 <w:sz w:val="18"/>
                 <w:szCs w:val="18"/>
               </w:rPr>
@@ -1281,16 +1277,16 @@
           <w:tcPr>
             <w:tcW w:type="dxa" w:w="2340"/>
             <w:tcBorders>
-              <w:top w:val="single" w:color="D5DEDB" w:sz="3"/>
-              <w:left w:val="single" w:color="D5DEDB" w:sz="3"/>
-              <w:bottom w:val="single" w:color="D5DEDB" w:sz="3"/>
-              <w:right w:val="single" w:color="D5DEDB" w:sz="3"/>
-            </w:tcBorders>
-            <w:tcMar>
-              <w:top w:type="dxa" w:w="54"/>
-              <w:left w:type="dxa" w:w="96"/>
-              <w:bottom w:type="dxa" w:w="54"/>
-              <w:right w:type="dxa" w:w="96"/>
+              <w:top w:val="none"/>
+              <w:left w:val="none"/>
+              <w:bottom w:val="none"/>
+              <w:right w:val="none"/>
+            </w:tcBorders>
+            <w:tcMar>
+              <w:top w:type="dxa" w:w="56"/>
+              <w:left w:type="dxa" w:w="40"/>
+              <w:bottom w:type="dxa" w:w="56"/>
+              <w:right w:type="dxa" w:w="150"/>
             </w:tcMar>
             <w:vAlign w:val="top"/>
           </w:tcPr>
@@ -1305,7 +1301,7 @@
                 <w:bCs/>
                 <w:i w:val="false"/>
                 <w:iCs w:val="false"/>
-                <w:color w:val="1F2A33"/>
+                <w:color w:val="3A3A38"/>
                 <w:sz w:val="18"/>
                 <w:szCs w:val="18"/>
               </w:rPr>
@@ -1321,12 +1317,12 @@
                 <w:rFonts w:ascii="Calibri" w:cs="Calibri" w:eastAsia="Calibri" w:hAnsi="Calibri"/>
                 <w:b/>
                 <w:bCs/>
-                <w:color w:val="FFFFFF"/>
-                <w:sz w:val="15"/>
-                <w:szCs w:val="15"/>
-                <w:shd w:fill="8A6100" w:color="auto" w:val="clear"/>
-              </w:rPr>
-              <w:t xml:space="preserve"> Proposed </w:t>
+                <w:color w:val="8A6A1F"/>
+                <w:spacing w:val="6"/>
+                <w:sz w:val="14"/>
+                <w:szCs w:val="14"/>
+              </w:rPr>
+              <w:t xml:space="preserve">PROPOSED</w:t>
             </w:r>
           </w:p>
         </w:tc>
@@ -1334,16 +1330,16 @@
           <w:tcPr>
             <w:tcW w:type="dxa" w:w="7308"/>
             <w:tcBorders>
-              <w:top w:val="single" w:color="D5DEDB" w:sz="3"/>
-              <w:left w:val="single" w:color="D5DEDB" w:sz="3"/>
-              <w:bottom w:val="single" w:color="D5DEDB" w:sz="3"/>
-              <w:right w:val="single" w:color="D5DEDB" w:sz="3"/>
-            </w:tcBorders>
-            <w:tcMar>
-              <w:top w:type="dxa" w:w="54"/>
-              <w:left w:type="dxa" w:w="96"/>
-              <w:bottom w:type="dxa" w:w="54"/>
-              <w:right w:type="dxa" w:w="96"/>
+              <w:top w:val="none"/>
+              <w:left w:val="none"/>
+              <w:bottom w:val="none"/>
+              <w:right w:val="none"/>
+            </w:tcBorders>
+            <w:tcMar>
+              <w:top w:type="dxa" w:w="56"/>
+              <w:left w:type="dxa" w:w="40"/>
+              <w:bottom w:type="dxa" w:w="56"/>
+              <w:right w:type="dxa" w:w="150"/>
             </w:tcMar>
             <w:vAlign w:val="top"/>
           </w:tcPr>
@@ -1358,7 +1354,7 @@
                 <w:bCs w:val="false"/>
                 <w:i w:val="false"/>
                 <w:iCs w:val="false"/>
-                <w:color w:val="1F2A33"/>
+                <w:color w:val="3A3A38"/>
                 <w:sz w:val="18"/>
                 <w:szCs w:val="18"/>
               </w:rPr>
@@ -1375,16 +1371,16 @@
           <w:tcPr>
             <w:tcW w:type="dxa" w:w="2340"/>
             <w:tcBorders>
-              <w:top w:val="single" w:color="D5DEDB" w:sz="3"/>
-              <w:left w:val="single" w:color="D5DEDB" w:sz="3"/>
-              <w:bottom w:val="single" w:color="D5DEDB" w:sz="3"/>
-              <w:right w:val="single" w:color="D5DEDB" w:sz="3"/>
-            </w:tcBorders>
-            <w:tcMar>
-              <w:top w:type="dxa" w:w="54"/>
-              <w:left w:type="dxa" w:w="96"/>
-              <w:bottom w:type="dxa" w:w="54"/>
-              <w:right w:type="dxa" w:w="96"/>
+              <w:top w:val="none"/>
+              <w:left w:val="none"/>
+              <w:bottom w:val="none"/>
+              <w:right w:val="none"/>
+            </w:tcBorders>
+            <w:tcMar>
+              <w:top w:type="dxa" w:w="56"/>
+              <w:left w:type="dxa" w:w="40"/>
+              <w:bottom w:type="dxa" w:w="56"/>
+              <w:right w:type="dxa" w:w="150"/>
             </w:tcMar>
             <w:vAlign w:val="top"/>
           </w:tcPr>
@@ -1399,7 +1395,7 @@
                 <w:bCs/>
                 <w:i w:val="false"/>
                 <w:iCs w:val="false"/>
-                <w:color w:val="1F2A33"/>
+                <w:color w:val="3A3A38"/>
                 <w:sz w:val="18"/>
                 <w:szCs w:val="18"/>
               </w:rPr>
@@ -1415,12 +1411,12 @@
                 <w:rFonts w:ascii="Calibri" w:cs="Calibri" w:eastAsia="Calibri" w:hAnsi="Calibri"/>
                 <w:b/>
                 <w:bCs/>
-                <w:color w:val="FFFFFF"/>
-                <w:sz w:val="15"/>
-                <w:szCs w:val="15"/>
-                <w:shd w:fill="2F6E4E" w:color="auto" w:val="clear"/>
-              </w:rPr>
-              <w:t xml:space="preserve"> Confirmed </w:t>
+                <w:color w:val="43724E"/>
+                <w:spacing w:val="6"/>
+                <w:sz w:val="14"/>
+                <w:szCs w:val="14"/>
+              </w:rPr>
+              <w:t xml:space="preserve">CONFIRMED</w:t>
             </w:r>
           </w:p>
         </w:tc>
@@ -1428,16 +1424,16 @@
           <w:tcPr>
             <w:tcW w:type="dxa" w:w="7308"/>
             <w:tcBorders>
-              <w:top w:val="single" w:color="D5DEDB" w:sz="3"/>
-              <w:left w:val="single" w:color="D5DEDB" w:sz="3"/>
-              <w:bottom w:val="single" w:color="D5DEDB" w:sz="3"/>
-              <w:right w:val="single" w:color="D5DEDB" w:sz="3"/>
-            </w:tcBorders>
-            <w:tcMar>
-              <w:top w:type="dxa" w:w="54"/>
-              <w:left w:type="dxa" w:w="96"/>
-              <w:bottom w:type="dxa" w:w="54"/>
-              <w:right w:type="dxa" w:w="96"/>
+              <w:top w:val="none"/>
+              <w:left w:val="none"/>
+              <w:bottom w:val="none"/>
+              <w:right w:val="none"/>
+            </w:tcBorders>
+            <w:tcMar>
+              <w:top w:type="dxa" w:w="56"/>
+              <w:left w:type="dxa" w:w="40"/>
+              <w:bottom w:type="dxa" w:w="56"/>
+              <w:right w:type="dxa" w:w="150"/>
             </w:tcMar>
             <w:vAlign w:val="top"/>
           </w:tcPr>
@@ -1452,7 +1448,7 @@
                 <w:bCs w:val="false"/>
                 <w:i w:val="false"/>
                 <w:iCs w:val="false"/>
-                <w:color w:val="1F2A33"/>
+                <w:color w:val="3A3A38"/>
                 <w:sz w:val="18"/>
                 <w:szCs w:val="18"/>
               </w:rPr>
@@ -1469,16 +1465,16 @@
           <w:tcPr>
             <w:tcW w:type="dxa" w:w="2340"/>
             <w:tcBorders>
-              <w:top w:val="single" w:color="D5DEDB" w:sz="3"/>
-              <w:left w:val="single" w:color="D5DEDB" w:sz="3"/>
-              <w:bottom w:val="single" w:color="D5DEDB" w:sz="3"/>
-              <w:right w:val="single" w:color="D5DEDB" w:sz="3"/>
-            </w:tcBorders>
-            <w:tcMar>
-              <w:top w:type="dxa" w:w="54"/>
-              <w:left w:type="dxa" w:w="96"/>
-              <w:bottom w:type="dxa" w:w="54"/>
-              <w:right w:type="dxa" w:w="96"/>
+              <w:top w:val="none"/>
+              <w:left w:val="none"/>
+              <w:bottom w:val="none"/>
+              <w:right w:val="none"/>
+            </w:tcBorders>
+            <w:tcMar>
+              <w:top w:type="dxa" w:w="56"/>
+              <w:left w:type="dxa" w:w="40"/>
+              <w:bottom w:type="dxa" w:w="56"/>
+              <w:right w:type="dxa" w:w="150"/>
             </w:tcMar>
             <w:vAlign w:val="top"/>
           </w:tcPr>
@@ -1493,7 +1489,7 @@
                 <w:bCs/>
                 <w:i w:val="false"/>
                 <w:iCs w:val="false"/>
-                <w:color w:val="1F2A33"/>
+                <w:color w:val="3A3A38"/>
                 <w:sz w:val="18"/>
                 <w:szCs w:val="18"/>
               </w:rPr>
@@ -1509,12 +1505,12 @@
                 <w:rFonts w:ascii="Calibri" w:cs="Calibri" w:eastAsia="Calibri" w:hAnsi="Calibri"/>
                 <w:b/>
                 <w:bCs/>
-                <w:color w:val="FFFFFF"/>
-                <w:sz w:val="15"/>
-                <w:szCs w:val="15"/>
-                <w:shd w:fill="2F6E4E" w:color="auto" w:val="clear"/>
-              </w:rPr>
-              <w:t xml:space="preserve"> Confirmed </w:t>
+                <w:color w:val="43724E"/>
+                <w:spacing w:val="6"/>
+                <w:sz w:val="14"/>
+                <w:szCs w:val="14"/>
+              </w:rPr>
+              <w:t xml:space="preserve">CONFIRMED</w:t>
             </w:r>
           </w:p>
         </w:tc>
@@ -1522,16 +1518,16 @@
           <w:tcPr>
             <w:tcW w:type="dxa" w:w="7308"/>
             <w:tcBorders>
-              <w:top w:val="single" w:color="D5DEDB" w:sz="3"/>
-              <w:left w:val="single" w:color="D5DEDB" w:sz="3"/>
-              <w:bottom w:val="single" w:color="D5DEDB" w:sz="3"/>
-              <w:right w:val="single" w:color="D5DEDB" w:sz="3"/>
-            </w:tcBorders>
-            <w:tcMar>
-              <w:top w:type="dxa" w:w="54"/>
-              <w:left w:type="dxa" w:w="96"/>
-              <w:bottom w:type="dxa" w:w="54"/>
-              <w:right w:type="dxa" w:w="96"/>
+              <w:top w:val="none"/>
+              <w:left w:val="none"/>
+              <w:bottom w:val="none"/>
+              <w:right w:val="none"/>
+            </w:tcBorders>
+            <w:tcMar>
+              <w:top w:type="dxa" w:w="56"/>
+              <w:left w:type="dxa" w:w="40"/>
+              <w:bottom w:type="dxa" w:w="56"/>
+              <w:right w:type="dxa" w:w="150"/>
             </w:tcMar>
             <w:vAlign w:val="top"/>
           </w:tcPr>
@@ -1546,7 +1542,7 @@
                 <w:bCs w:val="false"/>
                 <w:i w:val="false"/>
                 <w:iCs w:val="false"/>
-                <w:color w:val="1F2A33"/>
+                <w:color w:val="3A3A38"/>
                 <w:sz w:val="18"/>
                 <w:szCs w:val="18"/>
               </w:rPr>
@@ -1563,16 +1559,16 @@
           <w:tcPr>
             <w:tcW w:type="dxa" w:w="2340"/>
             <w:tcBorders>
-              <w:top w:val="single" w:color="D5DEDB" w:sz="3"/>
-              <w:left w:val="single" w:color="D5DEDB" w:sz="3"/>
-              <w:bottom w:val="single" w:color="D5DEDB" w:sz="3"/>
-              <w:right w:val="single" w:color="D5DEDB" w:sz="3"/>
-            </w:tcBorders>
-            <w:tcMar>
-              <w:top w:type="dxa" w:w="54"/>
-              <w:left w:type="dxa" w:w="96"/>
-              <w:bottom w:type="dxa" w:w="54"/>
-              <w:right w:type="dxa" w:w="96"/>
+              <w:top w:val="none"/>
+              <w:left w:val="none"/>
+              <w:bottom w:val="none"/>
+              <w:right w:val="none"/>
+            </w:tcBorders>
+            <w:tcMar>
+              <w:top w:type="dxa" w:w="56"/>
+              <w:left w:type="dxa" w:w="40"/>
+              <w:bottom w:type="dxa" w:w="56"/>
+              <w:right w:type="dxa" w:w="150"/>
             </w:tcMar>
             <w:vAlign w:val="top"/>
           </w:tcPr>
@@ -1587,7 +1583,7 @@
                 <w:bCs/>
                 <w:i w:val="false"/>
                 <w:iCs w:val="false"/>
-                <w:color w:val="1F2A33"/>
+                <w:color w:val="3A3A38"/>
                 <w:sz w:val="18"/>
                 <w:szCs w:val="18"/>
               </w:rPr>
@@ -1603,12 +1599,12 @@
                 <w:rFonts w:ascii="Calibri" w:cs="Calibri" w:eastAsia="Calibri" w:hAnsi="Calibri"/>
                 <w:b/>
                 <w:bCs/>
-                <w:color w:val="FFFFFF"/>
-                <w:sz w:val="15"/>
-                <w:szCs w:val="15"/>
-                <w:shd w:fill="2F6E4E" w:color="auto" w:val="clear"/>
-              </w:rPr>
-              <w:t xml:space="preserve"> Confirmed </w:t>
+                <w:color w:val="43724E"/>
+                <w:spacing w:val="6"/>
+                <w:sz w:val="14"/>
+                <w:szCs w:val="14"/>
+              </w:rPr>
+              <w:t xml:space="preserve">CONFIRMED</w:t>
             </w:r>
           </w:p>
         </w:tc>
@@ -1616,16 +1612,16 @@
           <w:tcPr>
             <w:tcW w:type="dxa" w:w="7308"/>
             <w:tcBorders>
-              <w:top w:val="single" w:color="D5DEDB" w:sz="3"/>
-              <w:left w:val="single" w:color="D5DEDB" w:sz="3"/>
-              <w:bottom w:val="single" w:color="D5DEDB" w:sz="3"/>
-              <w:right w:val="single" w:color="D5DEDB" w:sz="3"/>
-            </w:tcBorders>
-            <w:tcMar>
-              <w:top w:type="dxa" w:w="54"/>
-              <w:left w:type="dxa" w:w="96"/>
-              <w:bottom w:type="dxa" w:w="54"/>
-              <w:right w:type="dxa" w:w="96"/>
+              <w:top w:val="none"/>
+              <w:left w:val="none"/>
+              <w:bottom w:val="none"/>
+              <w:right w:val="none"/>
+            </w:tcBorders>
+            <w:tcMar>
+              <w:top w:type="dxa" w:w="56"/>
+              <w:left w:type="dxa" w:w="40"/>
+              <w:bottom w:type="dxa" w:w="56"/>
+              <w:right w:type="dxa" w:w="150"/>
             </w:tcMar>
             <w:vAlign w:val="top"/>
           </w:tcPr>
@@ -1640,7 +1636,7 @@
                 <w:bCs w:val="false"/>
                 <w:i w:val="false"/>
                 <w:iCs w:val="false"/>
-                <w:color w:val="1F2A33"/>
+                <w:color w:val="3A3A38"/>
                 <w:sz w:val="18"/>
                 <w:szCs w:val="18"/>
               </w:rPr>
@@ -1657,16 +1653,16 @@
           <w:tcPr>
             <w:tcW w:type="dxa" w:w="2340"/>
             <w:tcBorders>
-              <w:top w:val="single" w:color="D5DEDB" w:sz="3"/>
-              <w:left w:val="single" w:color="D5DEDB" w:sz="3"/>
-              <w:bottom w:val="single" w:color="D5DEDB" w:sz="3"/>
-              <w:right w:val="single" w:color="D5DEDB" w:sz="3"/>
-            </w:tcBorders>
-            <w:tcMar>
-              <w:top w:type="dxa" w:w="54"/>
-              <w:left w:type="dxa" w:w="96"/>
-              <w:bottom w:type="dxa" w:w="54"/>
-              <w:right w:type="dxa" w:w="96"/>
+              <w:top w:val="none"/>
+              <w:left w:val="none"/>
+              <w:bottom w:val="none"/>
+              <w:right w:val="none"/>
+            </w:tcBorders>
+            <w:tcMar>
+              <w:top w:type="dxa" w:w="56"/>
+              <w:left w:type="dxa" w:w="40"/>
+              <w:bottom w:type="dxa" w:w="56"/>
+              <w:right w:type="dxa" w:w="150"/>
             </w:tcMar>
             <w:vAlign w:val="top"/>
           </w:tcPr>
@@ -1681,7 +1677,7 @@
                 <w:bCs/>
                 <w:i w:val="false"/>
                 <w:iCs w:val="false"/>
-                <w:color w:val="1F2A33"/>
+                <w:color w:val="3A3A38"/>
                 <w:sz w:val="18"/>
                 <w:szCs w:val="18"/>
               </w:rPr>
@@ -1697,12 +1693,12 @@
                 <w:rFonts w:ascii="Calibri" w:cs="Calibri" w:eastAsia="Calibri" w:hAnsi="Calibri"/>
                 <w:b/>
                 <w:bCs/>
-                <w:color w:val="FFFFFF"/>
-                <w:sz w:val="15"/>
-                <w:szCs w:val="15"/>
-                <w:shd w:fill="2F6E4E" w:color="auto" w:val="clear"/>
-              </w:rPr>
-              <w:t xml:space="preserve"> Confirmed </w:t>
+                <w:color w:val="43724E"/>
+                <w:spacing w:val="6"/>
+                <w:sz w:val="14"/>
+                <w:szCs w:val="14"/>
+              </w:rPr>
+              <w:t xml:space="preserve">CONFIRMED</w:t>
             </w:r>
           </w:p>
         </w:tc>
@@ -1710,16 +1706,16 @@
           <w:tcPr>
             <w:tcW w:type="dxa" w:w="7308"/>
             <w:tcBorders>
-              <w:top w:val="single" w:color="D5DEDB" w:sz="3"/>
-              <w:left w:val="single" w:color="D5DEDB" w:sz="3"/>
-              <w:bottom w:val="single" w:color="D5DEDB" w:sz="3"/>
-              <w:right w:val="single" w:color="D5DEDB" w:sz="3"/>
-            </w:tcBorders>
-            <w:tcMar>
-              <w:top w:type="dxa" w:w="54"/>
-              <w:left w:type="dxa" w:w="96"/>
-              <w:bottom w:type="dxa" w:w="54"/>
-              <w:right w:type="dxa" w:w="96"/>
+              <w:top w:val="none"/>
+              <w:left w:val="none"/>
+              <w:bottom w:val="none"/>
+              <w:right w:val="none"/>
+            </w:tcBorders>
+            <w:tcMar>
+              <w:top w:type="dxa" w:w="56"/>
+              <w:left w:type="dxa" w:w="40"/>
+              <w:bottom w:type="dxa" w:w="56"/>
+              <w:right w:type="dxa" w:w="150"/>
             </w:tcMar>
             <w:vAlign w:val="top"/>
           </w:tcPr>
@@ -1734,7 +1730,7 @@
                 <w:bCs w:val="false"/>
                 <w:i w:val="false"/>
                 <w:iCs w:val="false"/>
-                <w:color w:val="1F2A33"/>
+                <w:color w:val="3A3A38"/>
                 <w:sz w:val="18"/>
                 <w:szCs w:val="18"/>
               </w:rPr>
@@ -1751,16 +1747,16 @@
           <w:tcPr>
             <w:tcW w:type="dxa" w:w="2340"/>
             <w:tcBorders>
-              <w:top w:val="single" w:color="D5DEDB" w:sz="3"/>
-              <w:left w:val="single" w:color="D5DEDB" w:sz="3"/>
-              <w:bottom w:val="single" w:color="D5DEDB" w:sz="3"/>
-              <w:right w:val="single" w:color="D5DEDB" w:sz="3"/>
-            </w:tcBorders>
-            <w:tcMar>
-              <w:top w:type="dxa" w:w="54"/>
-              <w:left w:type="dxa" w:w="96"/>
-              <w:bottom w:type="dxa" w:w="54"/>
-              <w:right w:type="dxa" w:w="96"/>
+              <w:top w:val="none"/>
+              <w:left w:val="none"/>
+              <w:bottom w:val="none"/>
+              <w:right w:val="none"/>
+            </w:tcBorders>
+            <w:tcMar>
+              <w:top w:type="dxa" w:w="56"/>
+              <w:left w:type="dxa" w:w="40"/>
+              <w:bottom w:type="dxa" w:w="56"/>
+              <w:right w:type="dxa" w:w="150"/>
             </w:tcMar>
             <w:vAlign w:val="top"/>
           </w:tcPr>
@@ -1775,7 +1771,7 @@
                 <w:bCs/>
                 <w:i w:val="false"/>
                 <w:iCs w:val="false"/>
-                <w:color w:val="1F2A33"/>
+                <w:color w:val="3A3A38"/>
                 <w:sz w:val="18"/>
                 <w:szCs w:val="18"/>
               </w:rPr>
@@ -1791,12 +1787,12 @@
                 <w:rFonts w:ascii="Calibri" w:cs="Calibri" w:eastAsia="Calibri" w:hAnsi="Calibri"/>
                 <w:b/>
                 <w:bCs/>
-                <w:color w:val="FFFFFF"/>
-                <w:sz w:val="15"/>
-                <w:szCs w:val="15"/>
-                <w:shd w:fill="8A6100" w:color="auto" w:val="clear"/>
-              </w:rPr>
-              <w:t xml:space="preserve"> Proposed </w:t>
+                <w:color w:val="8A6A1F"/>
+                <w:spacing w:val="6"/>
+                <w:sz w:val="14"/>
+                <w:szCs w:val="14"/>
+              </w:rPr>
+              <w:t xml:space="preserve">PROPOSED</w:t>
             </w:r>
           </w:p>
         </w:tc>
@@ -1804,16 +1800,16 @@
           <w:tcPr>
             <w:tcW w:type="dxa" w:w="7308"/>
             <w:tcBorders>
-              <w:top w:val="single" w:color="D5DEDB" w:sz="3"/>
-              <w:left w:val="single" w:color="D5DEDB" w:sz="3"/>
-              <w:bottom w:val="single" w:color="D5DEDB" w:sz="3"/>
-              <w:right w:val="single" w:color="D5DEDB" w:sz="3"/>
-            </w:tcBorders>
-            <w:tcMar>
-              <w:top w:type="dxa" w:w="54"/>
-              <w:left w:type="dxa" w:w="96"/>
-              <w:bottom w:type="dxa" w:w="54"/>
-              <w:right w:type="dxa" w:w="96"/>
+              <w:top w:val="none"/>
+              <w:left w:val="none"/>
+              <w:bottom w:val="none"/>
+              <w:right w:val="none"/>
+            </w:tcBorders>
+            <w:tcMar>
+              <w:top w:type="dxa" w:w="56"/>
+              <w:left w:type="dxa" w:w="40"/>
+              <w:bottom w:type="dxa" w:w="56"/>
+              <w:right w:type="dxa" w:w="150"/>
             </w:tcMar>
             <w:vAlign w:val="top"/>
           </w:tcPr>
@@ -1828,7 +1824,7 @@
                 <w:bCs w:val="false"/>
                 <w:i w:val="false"/>
                 <w:iCs w:val="false"/>
-                <w:color w:val="1F2A33"/>
+                <w:color w:val="3A3A38"/>
                 <w:sz w:val="18"/>
                 <w:szCs w:val="18"/>
               </w:rPr>
@@ -1845,16 +1841,16 @@
           <w:tcPr>
             <w:tcW w:type="dxa" w:w="2340"/>
             <w:tcBorders>
-              <w:top w:val="single" w:color="D5DEDB" w:sz="3"/>
-              <w:left w:val="single" w:color="D5DEDB" w:sz="3"/>
-              <w:bottom w:val="single" w:color="D5DEDB" w:sz="3"/>
-              <w:right w:val="single" w:color="D5DEDB" w:sz="3"/>
-            </w:tcBorders>
-            <w:tcMar>
-              <w:top w:type="dxa" w:w="54"/>
-              <w:left w:type="dxa" w:w="96"/>
-              <w:bottom w:type="dxa" w:w="54"/>
-              <w:right w:type="dxa" w:w="96"/>
+              <w:top w:val="none"/>
+              <w:left w:val="none"/>
+              <w:bottom w:val="none"/>
+              <w:right w:val="none"/>
+            </w:tcBorders>
+            <w:tcMar>
+              <w:top w:type="dxa" w:w="56"/>
+              <w:left w:type="dxa" w:w="40"/>
+              <w:bottom w:type="dxa" w:w="56"/>
+              <w:right w:type="dxa" w:w="150"/>
             </w:tcMar>
             <w:vAlign w:val="top"/>
           </w:tcPr>
@@ -1869,7 +1865,7 @@
                 <w:bCs/>
                 <w:i w:val="false"/>
                 <w:iCs w:val="false"/>
-                <w:color w:val="1F2A33"/>
+                <w:color w:val="3A3A38"/>
                 <w:sz w:val="18"/>
                 <w:szCs w:val="18"/>
               </w:rPr>
@@ -1885,12 +1881,12 @@
                 <w:rFonts w:ascii="Calibri" w:cs="Calibri" w:eastAsia="Calibri" w:hAnsi="Calibri"/>
                 <w:b/>
                 <w:bCs/>
-                <w:color w:val="FFFFFF"/>
-                <w:sz w:val="15"/>
-                <w:szCs w:val="15"/>
-                <w:shd w:fill="8A6100" w:color="auto" w:val="clear"/>
-              </w:rPr>
-              <w:t xml:space="preserve"> Proposed </w:t>
+                <w:color w:val="8A6A1F"/>
+                <w:spacing w:val="6"/>
+                <w:sz w:val="14"/>
+                <w:szCs w:val="14"/>
+              </w:rPr>
+              <w:t xml:space="preserve">PROPOSED</w:t>
             </w:r>
           </w:p>
         </w:tc>
@@ -1898,16 +1894,16 @@
           <w:tcPr>
             <w:tcW w:type="dxa" w:w="7308"/>
             <w:tcBorders>
-              <w:top w:val="single" w:color="D5DEDB" w:sz="3"/>
-              <w:left w:val="single" w:color="D5DEDB" w:sz="3"/>
-              <w:bottom w:val="single" w:color="D5DEDB" w:sz="3"/>
-              <w:right w:val="single" w:color="D5DEDB" w:sz="3"/>
-            </w:tcBorders>
-            <w:tcMar>
-              <w:top w:type="dxa" w:w="54"/>
-              <w:left w:type="dxa" w:w="96"/>
-              <w:bottom w:type="dxa" w:w="54"/>
-              <w:right w:type="dxa" w:w="96"/>
+              <w:top w:val="none"/>
+              <w:left w:val="none"/>
+              <w:bottom w:val="none"/>
+              <w:right w:val="none"/>
+            </w:tcBorders>
+            <w:tcMar>
+              <w:top w:type="dxa" w:w="56"/>
+              <w:left w:type="dxa" w:w="40"/>
+              <w:bottom w:type="dxa" w:w="56"/>
+              <w:right w:type="dxa" w:w="150"/>
             </w:tcMar>
             <w:vAlign w:val="top"/>
           </w:tcPr>
@@ -1922,7 +1918,7 @@
                 <w:bCs w:val="false"/>
                 <w:i w:val="false"/>
                 <w:iCs w:val="false"/>
-                <w:color w:val="1F2A33"/>
+                <w:color w:val="3A3A38"/>
                 <w:sz w:val="18"/>
                 <w:szCs w:val="18"/>
               </w:rPr>
@@ -1939,16 +1935,16 @@
           <w:tcPr>
             <w:tcW w:type="dxa" w:w="2340"/>
             <w:tcBorders>
-              <w:top w:val="single" w:color="D5DEDB" w:sz="3"/>
-              <w:left w:val="single" w:color="D5DEDB" w:sz="3"/>
-              <w:bottom w:val="single" w:color="D5DEDB" w:sz="3"/>
-              <w:right w:val="single" w:color="D5DEDB" w:sz="3"/>
-            </w:tcBorders>
-            <w:tcMar>
-              <w:top w:type="dxa" w:w="54"/>
-              <w:left w:type="dxa" w:w="96"/>
-              <w:bottom w:type="dxa" w:w="54"/>
-              <w:right w:type="dxa" w:w="96"/>
+              <w:top w:val="none"/>
+              <w:left w:val="none"/>
+              <w:bottom w:val="none"/>
+              <w:right w:val="none"/>
+            </w:tcBorders>
+            <w:tcMar>
+              <w:top w:type="dxa" w:w="56"/>
+              <w:left w:type="dxa" w:w="40"/>
+              <w:bottom w:type="dxa" w:w="56"/>
+              <w:right w:type="dxa" w:w="150"/>
             </w:tcMar>
             <w:vAlign w:val="top"/>
           </w:tcPr>
@@ -1963,7 +1959,7 @@
                 <w:bCs/>
                 <w:i w:val="false"/>
                 <w:iCs w:val="false"/>
-                <w:color w:val="1F2A33"/>
+                <w:color w:val="3A3A38"/>
                 <w:sz w:val="18"/>
                 <w:szCs w:val="18"/>
               </w:rPr>
@@ -1979,12 +1975,12 @@
                 <w:rFonts w:ascii="Calibri" w:cs="Calibri" w:eastAsia="Calibri" w:hAnsi="Calibri"/>
                 <w:b/>
                 <w:bCs/>
-                <w:color w:val="FFFFFF"/>
-                <w:sz w:val="15"/>
-                <w:szCs w:val="15"/>
-                <w:shd w:fill="2F6E4E" w:color="auto" w:val="clear"/>
-              </w:rPr>
-              <w:t xml:space="preserve"> Confirmed </w:t>
+                <w:color w:val="43724E"/>
+                <w:spacing w:val="6"/>
+                <w:sz w:val="14"/>
+                <w:szCs w:val="14"/>
+              </w:rPr>
+              <w:t xml:space="preserve">CONFIRMED</w:t>
             </w:r>
           </w:p>
         </w:tc>
@@ -1992,16 +1988,16 @@
           <w:tcPr>
             <w:tcW w:type="dxa" w:w="7308"/>
             <w:tcBorders>
-              <w:top w:val="single" w:color="D5DEDB" w:sz="3"/>
-              <w:left w:val="single" w:color="D5DEDB" w:sz="3"/>
-              <w:bottom w:val="single" w:color="D5DEDB" w:sz="3"/>
-              <w:right w:val="single" w:color="D5DEDB" w:sz="3"/>
-            </w:tcBorders>
-            <w:tcMar>
-              <w:top w:type="dxa" w:w="54"/>
-              <w:left w:type="dxa" w:w="96"/>
-              <w:bottom w:type="dxa" w:w="54"/>
-              <w:right w:type="dxa" w:w="96"/>
+              <w:top w:val="none"/>
+              <w:left w:val="none"/>
+              <w:bottom w:val="none"/>
+              <w:right w:val="none"/>
+            </w:tcBorders>
+            <w:tcMar>
+              <w:top w:type="dxa" w:w="56"/>
+              <w:left w:type="dxa" w:w="40"/>
+              <w:bottom w:type="dxa" w:w="56"/>
+              <w:right w:type="dxa" w:w="150"/>
             </w:tcMar>
             <w:vAlign w:val="top"/>
           </w:tcPr>
@@ -2016,7 +2012,7 @@
                 <w:bCs w:val="false"/>
                 <w:i w:val="false"/>
                 <w:iCs w:val="false"/>
-                <w:color w:val="1F2A33"/>
+                <w:color w:val="3A3A38"/>
                 <w:sz w:val="18"/>
                 <w:szCs w:val="18"/>
               </w:rPr>
@@ -2031,55 +2027,53 @@
         <w:pStyle w:val="Heading1"/>
         <w:keepNext/>
         <w:pBdr>
-          <w:bottom w:val="single" w:color="CDD8D5" w:sz="6" w:space="4"/>
+          <w:bottom w:val="single" w:color="E6E4DF" w:sz="4" w:space="6"/>
         </w:pBdr>
-        <w:spacing w:after="80" w:before="200"/>
+        <w:spacing w:after="78" w:before="220"/>
+      </w:pPr>
+      <w:r>
+        <w:rPr>
+          <w:rFonts w:ascii="Calibri" w:cs="Calibri" w:eastAsia="Calibri" w:hAnsi="Calibri"/>
+          <w:b/>
+          <w:bCs/>
+          <w:color w:val="4A6B82"/>
+          <w:spacing w:val="10"/>
+          <w:sz w:val="19"/>
+          <w:szCs w:val="19"/>
+        </w:rPr>
+        <w:t xml:space="preserve">03   </w:t>
+      </w:r>
+      <w:r>
+        <w:rPr>
+          <w:rFonts w:ascii="Georgia" w:cs="Georgia" w:eastAsia="Georgia" w:hAnsi="Georgia"/>
+          <w:color w:val="3A3A38"/>
+          <w:sz w:val="25"/>
+          <w:szCs w:val="25"/>
+        </w:rPr>
+        <w:t xml:space="preserve">The two things that must not go wrong</w:t>
+      </w:r>
+    </w:p>
+    <w:p>
+      <w:pPr>
+        <w:pStyle w:val="Heading2"/>
+        <w:keepNext/>
+        <w:spacing w:after="60" w:before="160"/>
       </w:pPr>
       <w:r>
         <w:rPr>
           <w:rFonts w:ascii="Georgia" w:cs="Georgia" w:eastAsia="Georgia" w:hAnsi="Georgia"/>
           <w:b/>
           <w:bCs/>
-          <w:color w:val="2F6E63"/>
-          <w:sz w:val="24"/>
-          <w:szCs w:val="24"/>
-        </w:rPr>
-        <w:t xml:space="preserve">03  </w:t>
-      </w:r>
-      <w:r>
-        <w:rPr>
-          <w:rFonts w:ascii="Georgia" w:cs="Georgia" w:eastAsia="Georgia" w:hAnsi="Georgia"/>
-          <w:b/>
-          <w:bCs/>
-          <w:color w:val="1F2A33"/>
-          <w:sz w:val="24"/>
-          <w:szCs w:val="24"/>
-        </w:rPr>
-        <w:t xml:space="preserve">The two things that must not go wrong</w:t>
-      </w:r>
-    </w:p>
-    <w:p>
-      <w:pPr>
-        <w:pStyle w:val="Heading2"/>
-        <w:keepNext/>
-        <w:spacing w:after="50" w:before="120"/>
-      </w:pPr>
-      <w:r>
-        <w:rPr>
-          <w:rFonts w:ascii="Calibri" w:cs="Calibri" w:eastAsia="Calibri" w:hAnsi="Calibri"/>
-          <w:b/>
-          <w:bCs/>
-          <w:color w:val="234f47"/>
-          <w:spacing w:val="4"/>
-          <w:sz w:val="19"/>
-          <w:szCs w:val="19"/>
+          <w:color w:val="2E3A44"/>
+          <w:sz w:val="20"/>
+          <w:szCs w:val="20"/>
         </w:rPr>
         <w:t xml:space="preserve">PRACTICE DATA MUST NEVER REACH LIVE OPERATIONS</w:t>
       </w:r>
     </w:p>
     <w:p>
       <w:pPr>
-        <w:spacing w:after="90" w:line="250" w:lineRule="auto"/>
+        <w:spacing w:after="92" w:line="252" w:lineRule="auto"/>
       </w:pPr>
       <w:r>
         <w:rPr>
@@ -2088,7 +2082,7 @@
           <w:bCs w:val="false"/>
           <w:i w:val="false"/>
           <w:iCs w:val="false"/>
-          <w:color w:val="1F2A33"/>
+          <w:color w:val="3A3A38"/>
           <w:sz w:val="19"/>
           <w:szCs w:val="19"/>
         </w:rPr>
@@ -2101,7 +2095,7 @@
           <w:bCs/>
           <w:i w:val="false"/>
           <w:iCs w:val="false"/>
-          <w:color w:val="1F2A33"/>
+          <w:color w:val="3A3A38"/>
           <w:sz w:val="19"/>
           <w:szCs w:val="19"/>
         </w:rPr>
@@ -2114,7 +2108,7 @@
           <w:bCs w:val="false"/>
           <w:i w:val="false"/>
           <w:iCs w:val="false"/>
-          <w:color w:val="1F2A33"/>
+          <w:color w:val="3A3A38"/>
           <w:sz w:val="19"/>
           <w:szCs w:val="19"/>
         </w:rPr>
@@ -2127,7 +2121,7 @@
           <w:bCs/>
           <w:i w:val="false"/>
           <w:iCs w:val="false"/>
-          <w:color w:val="1F2A33"/>
+          <w:color w:val="3A3A38"/>
           <w:sz w:val="19"/>
           <w:szCs w:val="19"/>
         </w:rPr>
@@ -2140,7 +2134,7 @@
           <w:bCs w:val="false"/>
           <w:i w:val="false"/>
           <w:iCs w:val="false"/>
-          <w:color w:val="1F2A33"/>
+          <w:color w:val="3A3A38"/>
           <w:sz w:val="19"/>
           <w:szCs w:val="19"/>
         </w:rPr>
@@ -2151,24 +2145,23 @@
       <w:pPr>
         <w:pStyle w:val="Heading2"/>
         <w:keepNext/>
-        <w:spacing w:after="50" w:before="120"/>
-      </w:pPr>
-      <w:r>
-        <w:rPr>
-          <w:rFonts w:ascii="Calibri" w:cs="Calibri" w:eastAsia="Calibri" w:hAnsi="Calibri"/>
+        <w:spacing w:after="60" w:before="160"/>
+      </w:pPr>
+      <w:r>
+        <w:rPr>
+          <w:rFonts w:ascii="Georgia" w:cs="Georgia" w:eastAsia="Georgia" w:hAnsi="Georgia"/>
           <w:b/>
           <w:bCs/>
-          <w:color w:val="234f47"/>
-          <w:spacing w:val="4"/>
-          <w:sz w:val="19"/>
-          <w:szCs w:val="19"/>
+          <w:color w:val="2E3A44"/>
+          <w:sz w:val="20"/>
+          <w:szCs w:val="20"/>
         </w:rPr>
         <w:t xml:space="preserve">COMPLETION IS SERVER-SIDE, EARNED, AND SAFE UNDER PRESSURE</w:t>
       </w:r>
     </w:p>
     <w:p>
       <w:pPr>
-        <w:spacing w:after="40" w:line="250" w:lineRule="auto"/>
+        <w:spacing w:after="40" w:line="252" w:lineRule="auto"/>
       </w:pPr>
       <w:r>
         <w:rPr>
@@ -2177,7 +2170,7 @@
           <w:bCs w:val="false"/>
           <w:i w:val="false"/>
           <w:iCs w:val="false"/>
-          <w:color w:val="1F2A33"/>
+          <w:color w:val="3A3A38"/>
           <w:sz w:val="19"/>
           <w:szCs w:val="19"/>
         </w:rPr>
@@ -2189,29 +2182,28 @@
         <w:pStyle w:val="Heading1"/>
         <w:keepNext/>
         <w:pBdr>
-          <w:bottom w:val="single" w:color="CDD8D5" w:sz="6" w:space="4"/>
+          <w:bottom w:val="single" w:color="E6E4DF" w:sz="4" w:space="6"/>
         </w:pBdr>
-        <w:spacing w:after="80" w:before="200"/>
-      </w:pPr>
-      <w:r>
-        <w:rPr>
-          <w:rFonts w:ascii="Georgia" w:cs="Georgia" w:eastAsia="Georgia" w:hAnsi="Georgia"/>
+        <w:spacing w:after="78" w:before="220"/>
+      </w:pPr>
+      <w:r>
+        <w:rPr>
+          <w:rFonts w:ascii="Calibri" w:cs="Calibri" w:eastAsia="Calibri" w:hAnsi="Calibri"/>
           <w:b/>
           <w:bCs/>
-          <w:color w:val="2F6E63"/>
-          <w:sz w:val="24"/>
-          <w:szCs w:val="24"/>
-        </w:rPr>
-        <w:t xml:space="preserve">04  </w:t>
+          <w:color w:val="4A6B82"/>
+          <w:spacing w:val="10"/>
+          <w:sz w:val="19"/>
+          <w:szCs w:val="19"/>
+        </w:rPr>
+        <w:t xml:space="preserve">04   </w:t>
       </w:r>
       <w:r>
         <w:rPr>
           <w:rFonts w:ascii="Georgia" w:cs="Georgia" w:eastAsia="Georgia" w:hAnsi="Georgia"/>
-          <w:b/>
-          <w:bCs/>
-          <w:color w:val="1F2A33"/>
-          <w:sz w:val="24"/>
-          <w:szCs w:val="24"/>
+          <w:color w:val="3A3A38"/>
+          <w:sz w:val="25"/>
+          <w:szCs w:val="25"/>
         </w:rPr>
         <w:t xml:space="preserve">Handling the unhappy paths</w:t>
       </w:r>
@@ -2220,12 +2212,12 @@
       <w:tblPr>
         <w:tblW w:type="dxa" w:w="9648"/>
         <w:tblBorders>
-          <w:top w:val="single" w:color="D5DEDB" w:sz="3"/>
-          <w:left w:val="single" w:color="D5DEDB" w:sz="3"/>
-          <w:bottom w:val="single" w:color="D5DEDB" w:sz="3"/>
-          <w:right w:val="single" w:color="D5DEDB" w:sz="3"/>
-          <w:insideH w:val="single" w:color="D5DEDB" w:sz="3"/>
-          <w:insideV w:val="single" w:color="D5DEDB" w:sz="3"/>
+          <w:top w:val="none"/>
+          <w:left w:val="none"/>
+          <w:bottom w:val="none"/>
+          <w:right w:val="none"/>
+          <w:insideH w:val="single" w:color="E6E4DF" w:sz="2"/>
+          <w:insideV w:val="none"/>
         </w:tblBorders>
       </w:tblPr>
       <w:tblGrid>
@@ -2241,19 +2233,18 @@
           <w:tcPr>
             <w:tcW w:type="dxa" w:w="2500"/>
             <w:tcBorders>
-              <w:top w:val="single" w:color="D5DEDB" w:sz="3"/>
-              <w:left w:val="single" w:color="D5DEDB" w:sz="3"/>
-              <w:bottom w:val="single" w:color="D5DEDB" w:sz="3"/>
-              <w:right w:val="single" w:color="D5DEDB" w:sz="3"/>
-            </w:tcBorders>
-            <w:shd w:fill="1F2A33" w:color="auto" w:val="clear"/>
-            <w:tcMar>
-              <w:top w:type="dxa" w:w="60"/>
-              <w:left w:type="dxa" w:w="96"/>
-              <w:bottom w:type="dxa" w:w="60"/>
-              <w:right w:type="dxa" w:w="96"/>
-            </w:tcMar>
-            <w:vAlign w:val="center"/>
+              <w:top w:val="none"/>
+              <w:left w:val="none"/>
+              <w:bottom w:val="single" w:color="4A6B82" w:sz="8"/>
+              <w:right w:val="none"/>
+            </w:tcBorders>
+            <w:tcMar>
+              <w:top w:type="dxa" w:w="30"/>
+              <w:left w:type="dxa" w:w="40"/>
+              <w:bottom w:type="dxa" w:w="52"/>
+              <w:right w:type="dxa" w:w="150"/>
+            </w:tcMar>
+            <w:vAlign w:val="bottom"/>
           </w:tcPr>
           <w:p>
             <w:pPr>
@@ -2264,12 +2255,12 @@
                 <w:rFonts w:ascii="Calibri" w:cs="Calibri" w:eastAsia="Calibri" w:hAnsi="Calibri"/>
                 <w:b/>
                 <w:bCs/>
-                <w:color w:val="FFFFFF"/>
-                <w:spacing w:val="3"/>
-                <w:sz w:val="18"/>
-                <w:szCs w:val="18"/>
-              </w:rPr>
-              <w:t xml:space="preserve">If this happens</w:t>
+                <w:color w:val="4A6B82"/>
+                <w:spacing w:val="8"/>
+                <w:sz w:val="15"/>
+                <w:szCs w:val="15"/>
+              </w:rPr>
+              <w:t xml:space="preserve">IF THIS HAPPENS</w:t>
             </w:r>
           </w:p>
         </w:tc>
@@ -2277,19 +2268,18 @@
           <w:tcPr>
             <w:tcW w:type="dxa" w:w="7148"/>
             <w:tcBorders>
-              <w:top w:val="single" w:color="D5DEDB" w:sz="3"/>
-              <w:left w:val="single" w:color="D5DEDB" w:sz="3"/>
-              <w:bottom w:val="single" w:color="D5DEDB" w:sz="3"/>
-              <w:right w:val="single" w:color="D5DEDB" w:sz="3"/>
-            </w:tcBorders>
-            <w:shd w:fill="1F2A33" w:color="auto" w:val="clear"/>
-            <w:tcMar>
-              <w:top w:type="dxa" w:w="60"/>
-              <w:left w:type="dxa" w:w="96"/>
-              <w:bottom w:type="dxa" w:w="60"/>
-              <w:right w:type="dxa" w:w="96"/>
-            </w:tcMar>
-            <w:vAlign w:val="center"/>
+              <w:top w:val="none"/>
+              <w:left w:val="none"/>
+              <w:bottom w:val="single" w:color="4A6B82" w:sz="8"/>
+              <w:right w:val="none"/>
+            </w:tcBorders>
+            <w:tcMar>
+              <w:top w:type="dxa" w:w="30"/>
+              <w:left w:type="dxa" w:w="40"/>
+              <w:bottom w:type="dxa" w:w="52"/>
+              <w:right w:type="dxa" w:w="150"/>
+            </w:tcMar>
+            <w:vAlign w:val="bottom"/>
           </w:tcPr>
           <w:p>
             <w:pPr>
@@ -2300,12 +2290,12 @@
                 <w:rFonts w:ascii="Calibri" w:cs="Calibri" w:eastAsia="Calibri" w:hAnsi="Calibri"/>
                 <w:b/>
                 <w:bCs/>
-                <w:color w:val="FFFFFF"/>
-                <w:spacing w:val="3"/>
-                <w:sz w:val="18"/>
-                <w:szCs w:val="18"/>
-              </w:rPr>
-              <w:t xml:space="preserve">What the guard experiences</w:t>
+                <w:color w:val="4A6B82"/>
+                <w:spacing w:val="8"/>
+                <w:sz w:val="15"/>
+                <w:szCs w:val="15"/>
+              </w:rPr>
+              <w:t xml:space="preserve">WHAT THE GUARD EXPERIENCES</w:t>
             </w:r>
           </w:p>
         </w:tc>
@@ -2318,22 +2308,22 @@
           <w:tcPr>
             <w:tcW w:type="dxa" w:w="2500"/>
             <w:tcBorders>
-              <w:top w:val="single" w:color="D5DEDB" w:sz="3"/>
-              <w:left w:val="single" w:color="D5DEDB" w:sz="3"/>
-              <w:bottom w:val="single" w:color="D5DEDB" w:sz="3"/>
-              <w:right w:val="single" w:color="D5DEDB" w:sz="3"/>
-            </w:tcBorders>
-            <w:tcMar>
-              <w:top w:type="dxa" w:w="54"/>
-              <w:left w:type="dxa" w:w="96"/>
-              <w:bottom w:type="dxa" w:w="54"/>
-              <w:right w:type="dxa" w:w="96"/>
+              <w:top w:val="none"/>
+              <w:left w:val="none"/>
+              <w:bottom w:val="none"/>
+              <w:right w:val="none"/>
+            </w:tcBorders>
+            <w:tcMar>
+              <w:top w:type="dxa" w:w="56"/>
+              <w:left w:type="dxa" w:w="40"/>
+              <w:bottom w:type="dxa" w:w="56"/>
+              <w:right w:type="dxa" w:w="150"/>
             </w:tcMar>
             <w:vAlign w:val="top"/>
           </w:tcPr>
           <w:p>
             <w:pPr>
-              <w:spacing w:after="0" w:line="244" w:lineRule="auto"/>
+              <w:spacing w:after="0" w:line="248" w:lineRule="auto"/>
             </w:pPr>
             <w:r>
               <w:rPr>
@@ -2342,7 +2332,7 @@
                 <w:bCs w:val="false"/>
                 <w:i w:val="false"/>
                 <w:iCs w:val="false"/>
-                <w:color w:val="1F2A33"/>
+                <w:color w:val="3A3A38"/>
                 <w:sz w:val="18"/>
                 <w:szCs w:val="18"/>
               </w:rPr>
@@ -2354,22 +2344,22 @@
           <w:tcPr>
             <w:tcW w:type="dxa" w:w="7148"/>
             <w:tcBorders>
-              <w:top w:val="single" w:color="D5DEDB" w:sz="3"/>
-              <w:left w:val="single" w:color="D5DEDB" w:sz="3"/>
-              <w:bottom w:val="single" w:color="D5DEDB" w:sz="3"/>
-              <w:right w:val="single" w:color="D5DEDB" w:sz="3"/>
-            </w:tcBorders>
-            <w:tcMar>
-              <w:top w:type="dxa" w:w="54"/>
-              <w:left w:type="dxa" w:w="96"/>
-              <w:bottom w:type="dxa" w:w="54"/>
-              <w:right w:type="dxa" w:w="96"/>
+              <w:top w:val="none"/>
+              <w:left w:val="none"/>
+              <w:bottom w:val="none"/>
+              <w:right w:val="none"/>
+            </w:tcBorders>
+            <w:tcMar>
+              <w:top w:type="dxa" w:w="56"/>
+              <w:left w:type="dxa" w:w="40"/>
+              <w:bottom w:type="dxa" w:w="56"/>
+              <w:right w:type="dxa" w:w="150"/>
             </w:tcMar>
             <w:vAlign w:val="top"/>
           </w:tcPr>
           <w:p>
             <w:pPr>
-              <w:spacing w:after="0" w:line="244" w:lineRule="auto"/>
+              <w:spacing w:after="0" w:line="248" w:lineRule="auto"/>
             </w:pPr>
             <w:r>
               <w:rPr>
@@ -2378,7 +2368,7 @@
                 <w:bCs w:val="false"/>
                 <w:i w:val="false"/>
                 <w:iCs w:val="false"/>
-                <w:color w:val="1F2A33"/>
+                <w:color w:val="3A3A38"/>
                 <w:sz w:val="18"/>
                 <w:szCs w:val="18"/>
               </w:rPr>
@@ -2395,23 +2385,22 @@
           <w:tcPr>
             <w:tcW w:type="dxa" w:w="2500"/>
             <w:tcBorders>
-              <w:top w:val="single" w:color="D5DEDB" w:sz="3"/>
-              <w:left w:val="single" w:color="D5DEDB" w:sz="3"/>
-              <w:bottom w:val="single" w:color="D5DEDB" w:sz="3"/>
-              <w:right w:val="single" w:color="D5DEDB" w:sz="3"/>
-            </w:tcBorders>
-            <w:shd w:fill="F3F6F5" w:color="auto" w:val="clear"/>
-            <w:tcMar>
-              <w:top w:type="dxa" w:w="54"/>
-              <w:left w:type="dxa" w:w="96"/>
-              <w:bottom w:type="dxa" w:w="54"/>
-              <w:right w:type="dxa" w:w="96"/>
+              <w:top w:val="none"/>
+              <w:left w:val="none"/>
+              <w:bottom w:val="none"/>
+              <w:right w:val="none"/>
+            </w:tcBorders>
+            <w:tcMar>
+              <w:top w:type="dxa" w:w="56"/>
+              <w:left w:type="dxa" w:w="40"/>
+              <w:bottom w:type="dxa" w:w="56"/>
+              <w:right w:type="dxa" w:w="150"/>
             </w:tcMar>
             <w:vAlign w:val="top"/>
           </w:tcPr>
           <w:p>
             <w:pPr>
-              <w:spacing w:after="0" w:line="244" w:lineRule="auto"/>
+              <w:spacing w:after="0" w:line="248" w:lineRule="auto"/>
             </w:pPr>
             <w:r>
               <w:rPr>
@@ -2420,7 +2409,7 @@
                 <w:bCs w:val="false"/>
                 <w:i w:val="false"/>
                 <w:iCs w:val="false"/>
-                <w:color w:val="1F2A33"/>
+                <w:color w:val="3A3A38"/>
                 <w:sz w:val="18"/>
                 <w:szCs w:val="18"/>
               </w:rPr>
@@ -2432,23 +2421,22 @@
           <w:tcPr>
             <w:tcW w:type="dxa" w:w="7148"/>
             <w:tcBorders>
-              <w:top w:val="single" w:color="D5DEDB" w:sz="3"/>
-              <w:left w:val="single" w:color="D5DEDB" w:sz="3"/>
-              <w:bottom w:val="single" w:color="D5DEDB" w:sz="3"/>
-              <w:right w:val="single" w:color="D5DEDB" w:sz="3"/>
-            </w:tcBorders>
-            <w:shd w:fill="F3F6F5" w:color="auto" w:val="clear"/>
-            <w:tcMar>
-              <w:top w:type="dxa" w:w="54"/>
-              <w:left w:type="dxa" w:w="96"/>
-              <w:bottom w:type="dxa" w:w="54"/>
-              <w:right w:type="dxa" w:w="96"/>
+              <w:top w:val="none"/>
+              <w:left w:val="none"/>
+              <w:bottom w:val="none"/>
+              <w:right w:val="none"/>
+            </w:tcBorders>
+            <w:tcMar>
+              <w:top w:type="dxa" w:w="56"/>
+              <w:left w:type="dxa" w:w="40"/>
+              <w:bottom w:type="dxa" w:w="56"/>
+              <w:right w:type="dxa" w:w="150"/>
             </w:tcMar>
             <w:vAlign w:val="top"/>
           </w:tcPr>
           <w:p>
             <w:pPr>
-              <w:spacing w:after="0" w:line="244" w:lineRule="auto"/>
+              <w:spacing w:after="0" w:line="248" w:lineRule="auto"/>
             </w:pPr>
             <w:r>
               <w:rPr>
@@ -2457,7 +2445,7 @@
                 <w:bCs w:val="false"/>
                 <w:i w:val="false"/>
                 <w:iCs w:val="false"/>
-                <w:color w:val="1F2A33"/>
+                <w:color w:val="3A3A38"/>
                 <w:sz w:val="18"/>
                 <w:szCs w:val="18"/>
               </w:rPr>
@@ -2474,22 +2462,22 @@
           <w:tcPr>
             <w:tcW w:type="dxa" w:w="2500"/>
             <w:tcBorders>
-              <w:top w:val="single" w:color="D5DEDB" w:sz="3"/>
-              <w:left w:val="single" w:color="D5DEDB" w:sz="3"/>
-              <w:bottom w:val="single" w:color="D5DEDB" w:sz="3"/>
-              <w:right w:val="single" w:color="D5DEDB" w:sz="3"/>
-            </w:tcBorders>
-            <w:tcMar>
-              <w:top w:type="dxa" w:w="54"/>
-              <w:left w:type="dxa" w:w="96"/>
-              <w:bottom w:type="dxa" w:w="54"/>
-              <w:right w:type="dxa" w:w="96"/>
+              <w:top w:val="none"/>
+              <w:left w:val="none"/>
+              <w:bottom w:val="none"/>
+              <w:right w:val="none"/>
+            </w:tcBorders>
+            <w:tcMar>
+              <w:top w:type="dxa" w:w="56"/>
+              <w:left w:type="dxa" w:w="40"/>
+              <w:bottom w:type="dxa" w:w="56"/>
+              <w:right w:type="dxa" w:w="150"/>
             </w:tcMar>
             <w:vAlign w:val="top"/>
           </w:tcPr>
           <w:p>
             <w:pPr>
-              <w:spacing w:after="0" w:line="244" w:lineRule="auto"/>
+              <w:spacing w:after="0" w:line="248" w:lineRule="auto"/>
             </w:pPr>
             <w:r>
               <w:rPr>
@@ -2498,7 +2486,7 @@
                 <w:bCs w:val="false"/>
                 <w:i w:val="false"/>
                 <w:iCs w:val="false"/>
-                <w:color w:val="1F2A33"/>
+                <w:color w:val="3A3A38"/>
                 <w:sz w:val="18"/>
                 <w:szCs w:val="18"/>
               </w:rPr>
@@ -2510,22 +2498,22 @@
           <w:tcPr>
             <w:tcW w:type="dxa" w:w="7148"/>
             <w:tcBorders>
-              <w:top w:val="single" w:color="D5DEDB" w:sz="3"/>
-              <w:left w:val="single" w:color="D5DEDB" w:sz="3"/>
-              <w:bottom w:val="single" w:color="D5DEDB" w:sz="3"/>
-              <w:right w:val="single" w:color="D5DEDB" w:sz="3"/>
-            </w:tcBorders>
-            <w:tcMar>
-              <w:top w:type="dxa" w:w="54"/>
-              <w:left w:type="dxa" w:w="96"/>
-              <w:bottom w:type="dxa" w:w="54"/>
-              <w:right w:type="dxa" w:w="96"/>
+              <w:top w:val="none"/>
+              <w:left w:val="none"/>
+              <w:bottom w:val="none"/>
+              <w:right w:val="none"/>
+            </w:tcBorders>
+            <w:tcMar>
+              <w:top w:type="dxa" w:w="56"/>
+              <w:left w:type="dxa" w:w="40"/>
+              <w:bottom w:type="dxa" w:w="56"/>
+              <w:right w:type="dxa" w:w="150"/>
             </w:tcMar>
             <w:vAlign w:val="top"/>
           </w:tcPr>
           <w:p>
             <w:pPr>
-              <w:spacing w:after="0" w:line="244" w:lineRule="auto"/>
+              <w:spacing w:after="0" w:line="248" w:lineRule="auto"/>
             </w:pPr>
             <w:r>
               <w:rPr>
@@ -2534,7 +2522,7 @@
                 <w:bCs w:val="false"/>
                 <w:i w:val="false"/>
                 <w:iCs w:val="false"/>
-                <w:color w:val="1F2A33"/>
+                <w:color w:val="3A3A38"/>
                 <w:sz w:val="18"/>
                 <w:szCs w:val="18"/>
               </w:rPr>
@@ -2551,23 +2539,22 @@
           <w:tcPr>
             <w:tcW w:type="dxa" w:w="2500"/>
             <w:tcBorders>
-              <w:top w:val="single" w:color="D5DEDB" w:sz="3"/>
-              <w:left w:val="single" w:color="D5DEDB" w:sz="3"/>
-              <w:bottom w:val="single" w:color="D5DEDB" w:sz="3"/>
-              <w:right w:val="single" w:color="D5DEDB" w:sz="3"/>
-            </w:tcBorders>
-            <w:shd w:fill="F3F6F5" w:color="auto" w:val="clear"/>
-            <w:tcMar>
-              <w:top w:type="dxa" w:w="54"/>
-              <w:left w:type="dxa" w:w="96"/>
-              <w:bottom w:type="dxa" w:w="54"/>
-              <w:right w:type="dxa" w:w="96"/>
+              <w:top w:val="none"/>
+              <w:left w:val="none"/>
+              <w:bottom w:val="none"/>
+              <w:right w:val="none"/>
+            </w:tcBorders>
+            <w:tcMar>
+              <w:top w:type="dxa" w:w="56"/>
+              <w:left w:type="dxa" w:w="40"/>
+              <w:bottom w:type="dxa" w:w="56"/>
+              <w:right w:type="dxa" w:w="150"/>
             </w:tcMar>
             <w:vAlign w:val="top"/>
           </w:tcPr>
           <w:p>
             <w:pPr>
-              <w:spacing w:after="0" w:line="244" w:lineRule="auto"/>
+              <w:spacing w:after="0" w:line="248" w:lineRule="auto"/>
             </w:pPr>
             <w:r>
               <w:rPr>
@@ -2576,7 +2563,7 @@
                 <w:bCs w:val="false"/>
                 <w:i w:val="false"/>
                 <w:iCs w:val="false"/>
-                <w:color w:val="1F2A33"/>
+                <w:color w:val="3A3A38"/>
                 <w:sz w:val="18"/>
                 <w:szCs w:val="18"/>
               </w:rPr>
@@ -2588,23 +2575,22 @@
           <w:tcPr>
             <w:tcW w:type="dxa" w:w="7148"/>
             <w:tcBorders>
-              <w:top w:val="single" w:color="D5DEDB" w:sz="3"/>
-              <w:left w:val="single" w:color="D5DEDB" w:sz="3"/>
-              <w:bottom w:val="single" w:color="D5DEDB" w:sz="3"/>
-              <w:right w:val="single" w:color="D5DEDB" w:sz="3"/>
-            </w:tcBorders>
-            <w:shd w:fill="F3F6F5" w:color="auto" w:val="clear"/>
-            <w:tcMar>
-              <w:top w:type="dxa" w:w="54"/>
-              <w:left w:type="dxa" w:w="96"/>
-              <w:bottom w:type="dxa" w:w="54"/>
-              <w:right w:type="dxa" w:w="96"/>
+              <w:top w:val="none"/>
+              <w:left w:val="none"/>
+              <w:bottom w:val="none"/>
+              <w:right w:val="none"/>
+            </w:tcBorders>
+            <w:tcMar>
+              <w:top w:type="dxa" w:w="56"/>
+              <w:left w:type="dxa" w:w="40"/>
+              <w:bottom w:type="dxa" w:w="56"/>
+              <w:right w:type="dxa" w:w="150"/>
             </w:tcMar>
             <w:vAlign w:val="top"/>
           </w:tcPr>
           <w:p>
             <w:pPr>
-              <w:spacing w:after="0" w:line="244" w:lineRule="auto"/>
+              <w:spacing w:after="0" w:line="248" w:lineRule="auto"/>
             </w:pPr>
             <w:r>
               <w:rPr>
@@ -2613,7 +2599,7 @@
                 <w:bCs w:val="false"/>
                 <w:i w:val="false"/>
                 <w:iCs w:val="false"/>
-                <w:color w:val="1F2A33"/>
+                <w:color w:val="3A3A38"/>
                 <w:sz w:val="18"/>
                 <w:szCs w:val="18"/>
               </w:rPr>
@@ -2630,22 +2616,22 @@
           <w:tcPr>
             <w:tcW w:type="dxa" w:w="2500"/>
             <w:tcBorders>
-              <w:top w:val="single" w:color="D5DEDB" w:sz="3"/>
-              <w:left w:val="single" w:color="D5DEDB" w:sz="3"/>
-              <w:bottom w:val="single" w:color="D5DEDB" w:sz="3"/>
-              <w:right w:val="single" w:color="D5DEDB" w:sz="3"/>
-            </w:tcBorders>
-            <w:tcMar>
-              <w:top w:type="dxa" w:w="54"/>
-              <w:left w:type="dxa" w:w="96"/>
-              <w:bottom w:type="dxa" w:w="54"/>
-              <w:right w:type="dxa" w:w="96"/>
+              <w:top w:val="none"/>
+              <w:left w:val="none"/>
+              <w:bottom w:val="none"/>
+              <w:right w:val="none"/>
+            </w:tcBorders>
+            <w:tcMar>
+              <w:top w:type="dxa" w:w="56"/>
+              <w:left w:type="dxa" w:w="40"/>
+              <w:bottom w:type="dxa" w:w="56"/>
+              <w:right w:type="dxa" w:w="150"/>
             </w:tcMar>
             <w:vAlign w:val="top"/>
           </w:tcPr>
           <w:p>
             <w:pPr>
-              <w:spacing w:after="0" w:line="244" w:lineRule="auto"/>
+              <w:spacing w:after="0" w:line="248" w:lineRule="auto"/>
             </w:pPr>
             <w:r>
               <w:rPr>
@@ -2654,7 +2640,7 @@
                 <w:bCs w:val="false"/>
                 <w:i w:val="false"/>
                 <w:iCs w:val="false"/>
-                <w:color w:val="1F2A33"/>
+                <w:color w:val="3A3A38"/>
                 <w:sz w:val="18"/>
                 <w:szCs w:val="18"/>
               </w:rPr>
@@ -2666,22 +2652,22 @@
           <w:tcPr>
             <w:tcW w:type="dxa" w:w="7148"/>
             <w:tcBorders>
-              <w:top w:val="single" w:color="D5DEDB" w:sz="3"/>
-              <w:left w:val="single" w:color="D5DEDB" w:sz="3"/>
-              <w:bottom w:val="single" w:color="D5DEDB" w:sz="3"/>
-              <w:right w:val="single" w:color="D5DEDB" w:sz="3"/>
-            </w:tcBorders>
-            <w:tcMar>
-              <w:top w:type="dxa" w:w="54"/>
-              <w:left w:type="dxa" w:w="96"/>
-              <w:bottom w:type="dxa" w:w="54"/>
-              <w:right w:type="dxa" w:w="96"/>
+              <w:top w:val="none"/>
+              <w:left w:val="none"/>
+              <w:bottom w:val="none"/>
+              <w:right w:val="none"/>
+            </w:tcBorders>
+            <w:tcMar>
+              <w:top w:type="dxa" w:w="56"/>
+              <w:left w:type="dxa" w:w="40"/>
+              <w:bottom w:type="dxa" w:w="56"/>
+              <w:right w:type="dxa" w:w="150"/>
             </w:tcMar>
             <w:vAlign w:val="top"/>
           </w:tcPr>
           <w:p>
             <w:pPr>
-              <w:spacing w:after="0" w:line="244" w:lineRule="auto"/>
+              <w:spacing w:after="0" w:line="248" w:lineRule="auto"/>
             </w:pPr>
             <w:r>
               <w:rPr>
@@ -2690,7 +2676,7 @@
                 <w:bCs w:val="false"/>
                 <w:i w:val="false"/>
                 <w:iCs w:val="false"/>
-                <w:color w:val="1F2A33"/>
+                <w:color w:val="3A3A38"/>
                 <w:sz w:val="18"/>
                 <w:szCs w:val="18"/>
               </w:rPr>
@@ -2705,36 +2691,35 @@
         <w:pStyle w:val="Heading1"/>
         <w:keepNext/>
         <w:pBdr>
-          <w:bottom w:val="single" w:color="CDD8D5" w:sz="6" w:space="4"/>
+          <w:bottom w:val="single" w:color="E6E4DF" w:sz="4" w:space="6"/>
         </w:pBdr>
-        <w:spacing w:after="80" w:before="200"/>
-      </w:pPr>
-      <w:r>
-        <w:rPr>
-          <w:rFonts w:ascii="Georgia" w:cs="Georgia" w:eastAsia="Georgia" w:hAnsi="Georgia"/>
+        <w:spacing w:after="78" w:before="220"/>
+      </w:pPr>
+      <w:r>
+        <w:rPr>
+          <w:rFonts w:ascii="Calibri" w:cs="Calibri" w:eastAsia="Calibri" w:hAnsi="Calibri"/>
           <w:b/>
           <w:bCs/>
-          <w:color w:val="2F6E63"/>
-          <w:sz w:val="24"/>
-          <w:szCs w:val="24"/>
-        </w:rPr>
-        <w:t xml:space="preserve">05  </w:t>
+          <w:color w:val="4A6B82"/>
+          <w:spacing w:val="10"/>
+          <w:sz w:val="19"/>
+          <w:szCs w:val="19"/>
+        </w:rPr>
+        <w:t xml:space="preserve">05   </w:t>
       </w:r>
       <w:r>
         <w:rPr>
           <w:rFonts w:ascii="Georgia" w:cs="Georgia" w:eastAsia="Georgia" w:hAnsi="Georgia"/>
-          <w:b/>
-          <w:bCs/>
-          <w:color w:val="1F2A33"/>
-          <w:sz w:val="24"/>
-          <w:szCs w:val="24"/>
+          <w:color w:val="3A3A38"/>
+          <w:sz w:val="25"/>
+          <w:szCs w:val="25"/>
         </w:rPr>
         <w:t xml:space="preserve">Confirm with engineering before building</w:t>
       </w:r>
     </w:p>
     <w:p>
       <w:pPr>
-        <w:spacing w:after="60" w:line="250" w:lineRule="auto"/>
+        <w:spacing w:after="60" w:line="252" w:lineRule="auto"/>
       </w:pPr>
       <w:r>
         <w:rPr>
@@ -2743,7 +2728,7 @@
           <w:bCs w:val="false"/>
           <w:i w:val="false"/>
           <w:iCs w:val="false"/>
-          <w:color w:val="1F2A33"/>
+          <w:color w:val="3A3A38"/>
           <w:sz w:val="19"/>
           <w:szCs w:val="19"/>
         </w:rPr>
@@ -2757,7 +2742,7 @@
           <w:ilvl w:val="0"/>
           <w:numId w:val="3"/>
         </w:numPr>
-        <w:spacing w:after="54" w:line="248" w:lineRule="auto"/>
+        <w:spacing w:after="48" w:line="250" w:lineRule="auto"/>
       </w:pPr>
       <w:r>
         <w:rPr>
@@ -2766,7 +2751,7 @@
           <w:bCs w:val="false"/>
           <w:i w:val="false"/>
           <w:iCs w:val="false"/>
-          <w:color w:val="1F2A33"/>
+          <w:color w:val="3A3A38"/>
           <w:sz w:val="19"/>
           <w:szCs w:val="19"/>
         </w:rPr>
@@ -2780,7 +2765,7 @@
           <w:ilvl w:val="0"/>
           <w:numId w:val="3"/>
         </w:numPr>
-        <w:spacing w:after="54" w:line="248" w:lineRule="auto"/>
+        <w:spacing w:after="48" w:line="250" w:lineRule="auto"/>
       </w:pPr>
       <w:r>
         <w:rPr>
@@ -2789,7 +2774,7 @@
           <w:bCs w:val="false"/>
           <w:i w:val="false"/>
           <w:iCs w:val="false"/>
-          <w:color w:val="1F2A33"/>
+          <w:color w:val="3A3A38"/>
           <w:sz w:val="19"/>
           <w:szCs w:val="19"/>
         </w:rPr>
@@ -2803,7 +2788,7 @@
           <w:ilvl w:val="0"/>
           <w:numId w:val="3"/>
         </w:numPr>
-        <w:spacing w:after="54" w:line="248" w:lineRule="auto"/>
+        <w:spacing w:after="48" w:line="250" w:lineRule="auto"/>
       </w:pPr>
       <w:r>
         <w:rPr>
@@ -2812,7 +2797,7 @@
           <w:bCs w:val="false"/>
           <w:i w:val="false"/>
           <w:iCs w:val="false"/>
-          <w:color w:val="1F2A33"/>
+          <w:color w:val="3A3A38"/>
           <w:sz w:val="19"/>
           <w:szCs w:val="19"/>
         </w:rPr>
@@ -2826,7 +2811,7 @@
           <w:ilvl w:val="0"/>
           <w:numId w:val="3"/>
         </w:numPr>
-        <w:spacing w:after="54" w:line="248" w:lineRule="auto"/>
+        <w:spacing w:after="48" w:line="250" w:lineRule="auto"/>
       </w:pPr>
       <w:r>
         <w:rPr>
@@ -2835,7 +2820,7 @@
           <w:bCs w:val="false"/>
           <w:i w:val="false"/>
           <w:iCs w:val="false"/>
-          <w:color w:val="1F2A33"/>
+          <w:color w:val="3A3A38"/>
           <w:sz w:val="19"/>
           <w:szCs w:val="19"/>
         </w:rPr>
@@ -2849,7 +2834,7 @@
           <w:ilvl w:val="0"/>
           <w:numId w:val="3"/>
         </w:numPr>
-        <w:spacing w:after="54" w:line="248" w:lineRule="auto"/>
+        <w:spacing w:after="48" w:line="250" w:lineRule="auto"/>
       </w:pPr>
       <w:r>
         <w:rPr>
@@ -2858,7 +2843,7 @@
           <w:bCs w:val="false"/>
           <w:i w:val="false"/>
           <w:iCs w:val="false"/>
-          <w:color w:val="1F2A33"/>
+          <w:color w:val="3A3A38"/>
           <w:sz w:val="19"/>
           <w:szCs w:val="19"/>
         </w:rPr>
@@ -2872,7 +2857,7 @@
           <w:ilvl w:val="0"/>
           <w:numId w:val="3"/>
         </w:numPr>
-        <w:spacing w:after="54" w:line="248" w:lineRule="auto"/>
+        <w:spacing w:after="48" w:line="250" w:lineRule="auto"/>
       </w:pPr>
       <w:r>
         <w:rPr>
@@ -2881,7 +2866,7 @@
           <w:bCs w:val="false"/>
           <w:i w:val="false"/>
           <w:iCs w:val="false"/>
-          <w:color w:val="1F2A33"/>
+          <w:color w:val="3A3A38"/>
           <w:sz w:val="19"/>
           <w:szCs w:val="19"/>
         </w:rPr>
@@ -2893,36 +2878,35 @@
         <w:pStyle w:val="Heading1"/>
         <w:keepNext/>
         <w:pBdr>
-          <w:bottom w:val="single" w:color="CDD8D5" w:sz="6" w:space="4"/>
+          <w:bottom w:val="single" w:color="E6E4DF" w:sz="4" w:space="6"/>
         </w:pBdr>
-        <w:spacing w:after="80" w:before="200"/>
-      </w:pPr>
-      <w:r>
-        <w:rPr>
-          <w:rFonts w:ascii="Georgia" w:cs="Georgia" w:eastAsia="Georgia" w:hAnsi="Georgia"/>
+        <w:spacing w:after="78" w:before="220"/>
+      </w:pPr>
+      <w:r>
+        <w:rPr>
+          <w:rFonts w:ascii="Calibri" w:cs="Calibri" w:eastAsia="Calibri" w:hAnsi="Calibri"/>
           <w:b/>
           <w:bCs/>
-          <w:color w:val="2F6E63"/>
-          <w:sz w:val="24"/>
-          <w:szCs w:val="24"/>
-        </w:rPr>
-        <w:t xml:space="preserve">06  </w:t>
+          <w:color w:val="4A6B82"/>
+          <w:spacing w:val="10"/>
+          <w:sz w:val="19"/>
+          <w:szCs w:val="19"/>
+        </w:rPr>
+        <w:t xml:space="preserve">06   </w:t>
       </w:r>
       <w:r>
         <w:rPr>
           <w:rFonts w:ascii="Georgia" w:cs="Georgia" w:eastAsia="Georgia" w:hAnsi="Georgia"/>
-          <w:b/>
-          <w:bCs/>
-          <w:color w:val="1F2A33"/>
-          <w:sz w:val="24"/>
-          <w:szCs w:val="24"/>
+          <w:color w:val="3A3A38"/>
+          <w:sz w:val="25"/>
+          <w:szCs w:val="25"/>
         </w:rPr>
         <w:t xml:space="preserve">Rollout, guardrails, and done</w:t>
       </w:r>
     </w:p>
     <w:p>
       <w:pPr>
-        <w:spacing w:after="60" w:line="250" w:lineRule="auto"/>
+        <w:spacing w:after="60" w:line="252" w:lineRule="auto"/>
       </w:pPr>
       <w:r>
         <w:rPr>
@@ -2931,7 +2915,7 @@
           <w:bCs w:val="false"/>
           <w:i w:val="false"/>
           <w:iCs w:val="false"/>
-          <w:color w:val="1F2A33"/>
+          <w:color w:val="3A3A38"/>
           <w:sz w:val="19"/>
           <w:szCs w:val="19"/>
         </w:rPr>
@@ -2944,7 +2928,7 @@
           <w:bCs/>
           <w:i w:val="false"/>
           <w:iCs w:val="false"/>
-          <w:color w:val="1F2A33"/>
+          <w:color w:val="3A3A38"/>
           <w:sz w:val="19"/>
           <w:szCs w:val="19"/>
         </w:rPr>
@@ -2957,7 +2941,7 @@
           <w:bCs w:val="false"/>
           <w:i w:val="false"/>
           <w:iCs w:val="false"/>
-          <w:color w:val="1F2A33"/>
+          <w:color w:val="3A3A38"/>
           <w:sz w:val="19"/>
           <w:szCs w:val="19"/>
         </w:rPr>
@@ -2968,17 +2952,16 @@
       <w:pPr>
         <w:pStyle w:val="Heading2"/>
         <w:keepNext/>
-        <w:spacing w:after="50" w:before="120"/>
-      </w:pPr>
-      <w:r>
-        <w:rPr>
-          <w:rFonts w:ascii="Calibri" w:cs="Calibri" w:eastAsia="Calibri" w:hAnsi="Calibri"/>
+        <w:spacing w:after="60" w:before="160"/>
+      </w:pPr>
+      <w:r>
+        <w:rPr>
+          <w:rFonts w:ascii="Georgia" w:cs="Georgia" w:eastAsia="Georgia" w:hAnsi="Georgia"/>
           <w:b/>
           <w:bCs/>
-          <w:color w:val="234f47"/>
-          <w:spacing w:val="4"/>
-          <w:sz w:val="19"/>
-          <w:szCs w:val="19"/>
+          <w:color w:val="2E3A44"/>
+          <w:sz w:val="20"/>
+          <w:szCs w:val="20"/>
         </w:rPr>
         <w:t xml:space="preserve">DONE MEANS</w:t>
       </w:r>
@@ -2990,7 +2973,7 @@
           <w:ilvl w:val="0"/>
           <w:numId w:val="4"/>
         </w:numPr>
-        <w:spacing w:after="54" w:line="248" w:lineRule="auto"/>
+        <w:spacing w:after="48" w:line="250" w:lineRule="auto"/>
       </w:pPr>
       <w:r>
         <w:rPr>
@@ -2999,7 +2982,7 @@
           <w:bCs w:val="false"/>
           <w:i w:val="false"/>
           <w:iCs w:val="false"/>
-          <w:color w:val="1F2A33"/>
+          <w:color w:val="3A3A38"/>
           <w:sz w:val="19"/>
           <w:szCs w:val="19"/>
         </w:rPr>
@@ -3013,7 +2996,7 @@
           <w:ilvl w:val="0"/>
           <w:numId w:val="4"/>
         </w:numPr>
-        <w:spacing w:after="54" w:line="248" w:lineRule="auto"/>
+        <w:spacing w:after="48" w:line="250" w:lineRule="auto"/>
       </w:pPr>
       <w:r>
         <w:rPr>
@@ -3022,7 +3005,7 @@
           <w:bCs w:val="false"/>
           <w:i w:val="false"/>
           <w:iCs w:val="false"/>
-          <w:color w:val="1F2A33"/>
+          <w:color w:val="3A3A38"/>
           <w:sz w:val="19"/>
           <w:szCs w:val="19"/>
         </w:rPr>
@@ -3036,7 +3019,7 @@
           <w:ilvl w:val="0"/>
           <w:numId w:val="4"/>
         </w:numPr>
-        <w:spacing w:after="54" w:line="248" w:lineRule="auto"/>
+        <w:spacing w:after="48" w:line="250" w:lineRule="auto"/>
       </w:pPr>
       <w:r>
         <w:rPr>
@@ -3045,7 +3028,7 @@
           <w:bCs w:val="false"/>
           <w:i w:val="false"/>
           <w:iCs w:val="false"/>
-          <w:color w:val="1F2A33"/>
+          <w:color w:val="3A3A38"/>
           <w:sz w:val="19"/>
           <w:szCs w:val="19"/>
         </w:rPr>
@@ -3055,7 +3038,7 @@
     <w:p>
       <w:pPr>
         <w:pBdr>
-          <w:top w:val="single" w:color="CDD8D5" w:sz="5" w:space="5"/>
+          <w:top w:val="single" w:color="E6E4DF" w:sz="5" w:space="5"/>
         </w:pBdr>
         <w:spacing w:before="90"/>
       </w:pPr>
@@ -3066,7 +3049,7 @@
           <w:bCs w:val="false"/>
           <w:i/>
           <w:iCs/>
-          <w:color w:val="5C6B73"/>
+          <w:color w:val="77746E"/>
           <w:sz w:val="16"/>
           <w:szCs w:val="16"/>
         </w:rPr>
@@ -3131,7 +3114,7 @@
   <w:p>
     <w:pPr>
       <w:pBdr>
-        <w:top w:val="single" w:color="CDD8D5" w:sz="3" w:space="3"/>
+        <w:top w:val="single" w:color="E6E4DF" w:sz="3" w:space="3"/>
       </w:pBdr>
       <w:tabs>
         <w:tab w:val="right" w:pos="9648"/>
@@ -3145,7 +3128,7 @@
         <w:bCs w:val="false"/>
         <w:i w:val="false"/>
         <w:iCs w:val="false"/>
-        <w:color w:val="5C6B73"/>
+        <w:color w:val="77746E"/>
         <w:sz w:val="15"/>
         <w:szCs w:val="15"/>
       </w:rPr>
@@ -3154,7 +3137,7 @@
     <w:r>
       <w:rPr>
         <w:rFonts w:ascii="Calibri" w:cs="Calibri" w:eastAsia="Calibri" w:hAnsi="Calibri"/>
-        <w:color w:val="5C6B73"/>
+        <w:color w:val="77746E"/>
         <w:sz w:val="15"/>
         <w:szCs w:val="15"/>
       </w:rPr>
@@ -3216,7 +3199,7 @@
   <w:p>
     <w:pPr>
       <w:pBdr>
-        <w:bottom w:val="single" w:color="CDD8D5" w:sz="3" w:space="3"/>
+        <w:bottom w:val="single" w:color="E6E4DF" w:sz="3" w:space="3"/>
       </w:pBdr>
       <w:tabs>
         <w:tab w:val="right" w:pos="9648"/>
@@ -3230,7 +3213,7 @@
         <w:bCs w:val="false"/>
         <w:i w:val="false"/>
         <w:iCs w:val="false"/>
-        <w:color w:val="5C6B73"/>
+        <w:color w:val="77746E"/>
         <w:sz w:val="15"/>
         <w:szCs w:val="15"/>
       </w:rPr>
@@ -3251,7 +3234,7 @@
         <w:bCs w:val="false"/>
         <w:i w:val="false"/>
         <w:iCs w:val="false"/>
-        <w:color w:val="5C6B73"/>
+        <w:color w:val="77746E"/>
         <w:sz w:val="15"/>
         <w:szCs w:val="15"/>
       </w:rPr>
@@ -3359,7 +3342,7 @@
       </w:pPr>
       <w:rPr>
         <w:rFonts w:ascii="Calibri" w:cs="Calibri" w:eastAsia="Calibri" w:hAnsi="Calibri"/>
-        <w:color w:val="2F6E63"/>
+        <w:color w:val="4A6B82"/>
         <w:sz w:val="19"/>
         <w:szCs w:val="19"/>
       </w:rPr>
@@ -3377,7 +3360,7 @@
       </w:pPr>
       <w:rPr>
         <w:rFonts w:ascii="Calibri" w:cs="Calibri" w:eastAsia="Calibri" w:hAnsi="Calibri"/>
-        <w:color w:val="2F6E63"/>
+        <w:color w:val="4A6B82"/>
         <w:sz w:val="19"/>
         <w:szCs w:val="19"/>
       </w:rPr>
@@ -3397,7 +3380,7 @@
         <w:rFonts w:ascii="Calibri" w:cs="Calibri" w:eastAsia="Calibri" w:hAnsi="Calibri"/>
         <w:b/>
         <w:bCs/>
-        <w:color w:val="2F6E63"/>
+        <w:color w:val="4A6B82"/>
         <w:sz w:val="19"/>
         <w:szCs w:val="19"/>
       </w:rPr>
@@ -3436,7 +3419,7 @@
     <w:rPrDefault>
       <w:rPr>
         <w:rFonts w:ascii="Calibri" w:cs="Calibri" w:eastAsia="Calibri" w:hAnsi="Calibri"/>
-        <w:color w:val="1F2A33"/>
+        <w:color w:val="3A3A38"/>
         <w:sz w:val="19"/>
         <w:szCs w:val="19"/>
       </w:rPr>
@@ -3623,7 +3606,7 @@
       <w:rFonts w:ascii="Georgia" w:cs="Georgia" w:eastAsia="Georgia" w:hAnsi="Georgia"/>
       <w:b/>
       <w:bCs/>
-      <w:color w:val="1F2A33"/>
+      <w:color w:val="3A3A38"/>
       <w:sz w:val="24"/>
       <w:szCs w:val="24"/>
     </w:rPr>
@@ -3637,7 +3620,7 @@
       <w:rFonts w:ascii="Calibri" w:cs="Calibri" w:eastAsia="Calibri" w:hAnsi="Calibri"/>
       <w:b/>
       <w:bCs/>
-      <w:color w:val="234f47"/>
+      <w:color w:val="2E3A44"/>
       <w:sz w:val="19"/>
       <w:szCs w:val="19"/>
     </w:rPr>

</xml_diff>

<commit_message>
Use the product owner's own words for where the exclusion belongs
The Teams thread says it plainly: 'We need to update the reporting
layer to exclude this data.' Both documents were paraphrasing this as
hide-by-default at the shared data layer, which is a recommendation I
made rather than what he said. Replaced with his wording.

Also records his sequencing: the flag exists and can be used now, the
filter is a later enhancement, and permanent deletion is a separate
database clean-up later still.

Co-Authored-By: Claude Opus 5 <noreply@anthropic.com>
Claude-Session: https://claude.ai/code/session_018gbuxK96fv3iC6hdg5uCm7
</commit_message>
<xml_diff>
--- a/deliverables/US1117/SAM_OnSite_Guard_Onboarding_Spec.docx
+++ b/deliverables/US1117/SAM_OnSite_Guard_Onboarding_Spec.docx
@@ -2655,7 +2655,7 @@
           <w:sz w:val="19"/>
           <w:szCs w:val="19"/>
         </w:rPr>
-        <w:t xml:space="preserve"> nothing acts on that flag yet, and archived items still show in production. The filter must be written first, </w:t>
+        <w:t xml:space="preserve"> nothing acts on that flag yet, and archived items still show in production. The exclusion has to be written first, into </w:t>
       </w:r>
       <w:r>
         <w:rPr>
@@ -2668,7 +2668,7 @@
           <w:sz w:val="19"/>
           <w:szCs w:val="19"/>
         </w:rPr>
-        <w:t xml:space="preserve">hide-by-default</w:t>
+        <w:t xml:space="preserve">the reporting layer</w:t>
       </w:r>
       <w:r>
         <w:rPr>
@@ -2681,7 +2681,7 @@
           <w:sz w:val="19"/>
           <w:szCs w:val="19"/>
         </w:rPr>
-        <w:t xml:space="preserve"> and low down where the data is read, so every screen inherits it. Until then this stays in DEV/UAT, and switching it on in production later must be gated on the filter by something firmer than memory: a dispatched alert cannot be recalled.</w:t>
+        <w:t xml:space="preserve">, which is where the product owner has said the exclusion belongs. Until it is built this stays in DEV/UAT, and switching it on in production later must be gated on the filter by something firmer than memory: a dispatched alert cannot be recalled.</w:t>
       </w:r>
     </w:p>
     <w:p>

</xml_diff>

<commit_message>
Trim the brief back to four pages
</commit_message>
<xml_diff>
--- a/deliverables/US1117/SAM_OnSite_Guard_Onboarding_Spec.docx
+++ b/deliverables/US1117/SAM_OnSite_Guard_Onboarding_Spec.docx
@@ -313,7 +313,7 @@
                 <w:sz w:val="19"/>
                 <w:szCs w:val="19"/>
               </w:rPr>
-              <w:t xml:space="preserve">At first sign-in SAM introduces itself, gets the phone set up (permissions, NFC, background tracking) and teaches three actions — ask, report, correct — on a made-up incident. Mandatory, saves progress, complete only when each step is genuinely done. It replaces the deck’s app-setup slides and absorbs its tips; installation and log-in stay with the trainer. Practice data must stay out of every live surface, and the filter that enforces that is not built, so this runs in DEV/UAT until it is.</w:t>
+              <w:t xml:space="preserve">At first sign-in SAM introduces itself, gets the phone set up (location, NFC, background tracking) and teaches three actions — ask, report, correct — on a made-up incident. Mandatory, saves progress, complete only when each step is genuinely done. It replaces the deck’s app-setup slides and absorbs its tips. Practice data must stay out of every live surface, and the filter that enforces that is not built, so this runs in DEV/UAT until it is.</w:t>
             </w:r>
           </w:p>
         </w:tc>
@@ -439,7 +439,7 @@
           <w:sz w:val="19"/>
           <w:szCs w:val="19"/>
         </w:rPr>
-        <w:t xml:space="preserve">Next, three setup gates: location, NFC (which reads the checkpoint tags), then background tracking, which lives in SAM OnSite’s own settings. Each has the same shape: SAM says what it needs and why, links to that setting from inside onboarding, and the guard switches it on and returns to confirm. Microphone and camera are not gated — Android prompts for them when first used. Granting can close the app; the guard reopens it and resumes at the same gate.</w:t>
+        <w:t xml:space="preserve">Next, three setup gates: location, NFC (which reads the checkpoint tags), then background tracking, which lives in SAM OnSite’s own settings. Each has the same shape: SAM says what it needs and why, links to that setting, and the guard switches it on and returns to confirm. Microphone and camera are not gated — Android prompts for them when first used. Granting can close the app; the guard reopens it and resumes at the same gate.</w:t>
       </w:r>
     </w:p>
     <w:p>
@@ -1995,7 +1995,7 @@
                 <w:sz w:val="18"/>
                 <w:szCs w:val="18"/>
               </w:rPr>
-              <w:t xml:space="preserve">The practice report must appear in no live surface. Four are confirmed: supervisor alerts, KPI and dashboard figures, the Pronect Action Tracker, and the guard’s own activity list. Reports, exports, integrations and the stores behind them are the likely rest and are listed for engineering. The filter that excludes training-flagged data does not exist yet, which is why archived data is still visible in production. It must be built and verified before go-live; until then this stays in DEV/UAT.</w:t>
+              <w:t xml:space="preserve">The practice report must appear in no live surface. Four are confirmed: supervisor alerts, KPI and dashboard figures, the Pronect Action Tracker, and the guard’s own activity list. Reports, exports, integrations and the stores behind them are the likely rest, listed for engineering. The filter that excludes training-flagged data does not exist yet, which is why archived data is still visible in production. It must be built and verified before go-live; until then this stays in DEV/UAT.</w:t>
             </w:r>
           </w:p>
         </w:tc>
@@ -2681,7 +2681,7 @@
           <w:sz w:val="19"/>
           <w:szCs w:val="19"/>
         </w:rPr>
-        <w:t xml:space="preserve">, which is where the product owner has said the exclusion belongs. Until it is built this stays in DEV/UAT, and switching it on in production later must be gated on the filter by something firmer than memory: a dispatched alert cannot be recalled.</w:t>
+        <w:t xml:space="preserve">, where the product owner has said it belongs. Until it is built this stays in DEV/UAT. Switching it on in production later must be gated on the filter by something firmer than memory: a dispatched alert cannot be recalled.</w:t>
       </w:r>
     </w:p>
     <w:p>

</xml_diff>

<commit_message>
Cut the brief to three pages
Requirements table from eighteen rows to nine. Removed everything an
approver does not act on: automatic start, everyone-once, ask a
question, report one incident, fix by voice, fix by hand, the no-NFC
edge case. Each is either visible in the flow or lives in the
companion. Cannot-be-skipped folded into one row with the four exits
and the stuck-guard release.

Open questions from eight to six; the two dropped are plumbing and
sit in the companion.

Also gone: the message-is-the-report model explained twice, three
pointers to the companion, and a header field that told the reader
nothing.

Every remaining row is a decision, a risk, or something the reviewer
asked for. 2,089 words to 1,281. Structural audit passes.

Co-Authored-By: Claude Opus 5 <noreply@anthropic.com>
Claude-Session: https://claude.ai/code/session_018gbuxK96fv3iC6hdg5uCm7
</commit_message>
<xml_diff>
--- a/deliverables/US1117/SAM_OnSite_Guard_Onboarding_Spec.docx
+++ b/deliverables/US1117/SAM_OnSite_Guard_Onboarding_Spec.docx
@@ -42,7 +42,7 @@
         <w:pBdr>
           <w:bottom w:val="single" w:color="4A6B82" w:sz="4" w:space="10"/>
         </w:pBdr>
-        <w:spacing w:after="140"/>
+        <w:spacing w:after="120"/>
       </w:pPr>
       <w:r>
         <w:rPr>
@@ -83,9 +83,9 @@
             </w:tcBorders>
             <w:shd w:fill="F7F6F2" w:color="auto" w:val="clear"/>
             <w:tcMar>
-              <w:top w:type="dxa" w:w="100"/>
+              <w:top w:type="dxa" w:w="90"/>
               <w:left w:type="dxa" w:w="180"/>
-              <w:bottom w:type="dxa" w:w="100"/>
+              <w:bottom w:type="dxa" w:w="90"/>
               <w:right w:type="dxa" w:w="180"/>
             </w:tcMar>
           </w:tcPr>
@@ -105,7 +105,7 @@
                 <w:sz w:val="16"/>
                 <w:szCs w:val="16"/>
               </w:rPr>
-              <w:t xml:space="preserve">Product  </w:t>
+              <w:t xml:space="preserve">Applies to  </w:t>
             </w:r>
             <w:r>
               <w:rPr>
@@ -118,7 +118,7 @@
                 <w:sz w:val="18"/>
                 <w:szCs w:val="18"/>
               </w:rPr>
-              <w:t xml:space="preserve">SAM OnSite       </w:t>
+              <w:t xml:space="preserve">Every guard, once       </w:t>
             </w:r>
             <w:r>
               <w:rPr>
@@ -132,7 +132,7 @@
                 <w:sz w:val="16"/>
                 <w:szCs w:val="16"/>
               </w:rPr>
-              <w:t xml:space="preserve">Applies to  </w:t>
+              <w:t xml:space="preserve">Language  </w:t>
             </w:r>
             <w:r>
               <w:rPr>
@@ -145,7 +145,7 @@
                 <w:sz w:val="18"/>
                 <w:szCs w:val="18"/>
               </w:rPr>
-              <w:t xml:space="preserve">Every guard, once       </w:t>
+              <w:t xml:space="preserve">English       </w:t>
             </w:r>
             <w:r>
               <w:rPr>
@@ -159,7 +159,7 @@
                 <w:sz w:val="16"/>
                 <w:szCs w:val="16"/>
               </w:rPr>
-              <w:t xml:space="preserve">Language  </w:t>
+              <w:t xml:space="preserve">Status  </w:t>
             </w:r>
             <w:r>
               <w:rPr>
@@ -172,7 +172,7 @@
                 <w:sz w:val="18"/>
                 <w:szCs w:val="18"/>
               </w:rPr>
-              <w:t xml:space="preserve">English       </w:t>
+              <w:t xml:space="preserve">Draft for build       </w:t>
             </w:r>
             <w:r>
               <w:rPr>
@@ -186,7 +186,7 @@
                 <w:sz w:val="16"/>
                 <w:szCs w:val="16"/>
               </w:rPr>
-              <w:t xml:space="preserve">Status  </w:t>
+              <w:t xml:space="preserve">Sign-off  </w:t>
             </w:r>
             <w:r>
               <w:rPr>
@@ -199,39 +199,12 @@
                 <w:sz w:val="18"/>
                 <w:szCs w:val="18"/>
               </w:rPr>
-              <w:t xml:space="preserve">Draft for build       </w:t>
-            </w:r>
-            <w:r>
-              <w:rPr>
-                <w:rFonts w:ascii="Calibri" w:cs="Calibri" w:eastAsia="Calibri" w:hAnsi="Calibri"/>
-                <w:b/>
-                <w:bCs/>
-                <w:i w:val="false"/>
-                <w:iCs w:val="false"/>
-                <w:color w:val="4A6B82"/>
-                <w:spacing w:val="4"/>
-                <w:sz w:val="16"/>
-                <w:szCs w:val="16"/>
-              </w:rPr>
-              <w:t xml:space="preserve">Sign-off  </w:t>
-            </w:r>
-            <w:r>
-              <w:rPr>
-                <w:rFonts w:ascii="Calibri" w:cs="Calibri" w:eastAsia="Calibri" w:hAnsi="Calibri"/>
-                <w:b w:val="false"/>
-                <w:bCs w:val="false"/>
-                <w:i w:val="false"/>
-                <w:iCs w:val="false"/>
-                <w:color w:val="3A3A38"/>
-                <w:sz w:val="18"/>
-                <w:szCs w:val="18"/>
-              </w:rPr>
               <w:t xml:space="preserve">Vincent Smeyers</w:t>
             </w:r>
           </w:p>
           <w:p>
             <w:pPr>
-              <w:spacing w:after="0" w:before="60"/>
+              <w:spacing w:after="0" w:before="50"/>
             </w:pPr>
             <w:r>
               <w:rPr>
@@ -244,7 +217,7 @@
                 <w:sz w:val="16"/>
                 <w:szCs w:val="16"/>
               </w:rPr>
-              <w:t xml:space="preserve">Full requirements, acceptance criteria and tests are in the companion document.</w:t>
+              <w:t xml:space="preserve">Requirements, acceptance criteria and tests are in the companion.</w:t>
             </w:r>
           </w:p>
         </w:tc>
@@ -252,7 +225,7 @@
     </w:tbl>
     <w:p>
       <w:pPr>
-        <w:spacing w:after="70"/>
+        <w:spacing w:after="60"/>
       </w:pPr>
     </w:p>
     <w:tbl>
@@ -313,7 +286,7 @@
                 <w:sz w:val="19"/>
                 <w:szCs w:val="19"/>
               </w:rPr>
-              <w:t xml:space="preserve">At first sign-in SAM introduces itself, gets the phone set up (location, NFC, background tracking) and teaches three actions — ask, report, correct — on a made-up incident. Mandatory, saves progress, complete only when each step is genuinely done. It replaces the deck’s app-setup slides and absorbs its tips. Practice data must stay out of every live surface, and the filter that enforces that is not built, so this runs in DEV/UAT until it is.</w:t>
+              <w:t xml:space="preserve">At first sign-in SAM introduces itself, sets the phone up (location, NFC, background tracking) and teaches three actions — ask, report, correct — on a made-up incident. Mandatory, saves progress, done only when each step is genuinely done. It replaces the deck’s app-setup slides and absorbs its tips. Practice data must stay out of every live surface; the filter that enforces that is not built, so this runs in DEV/UAT until it is.</w:t>
             </w:r>
           </w:p>
         </w:tc>
@@ -321,7 +294,7 @@
     </w:tbl>
     <w:p>
       <w:pPr>
-        <w:spacing w:after="40"/>
+        <w:spacing w:after="30"/>
       </w:pPr>
     </w:p>
     <w:p>
@@ -352,25 +325,7 @@
           <w:sz w:val="25"/>
           <w:szCs w:val="25"/>
         </w:rPr>
-        <w:t xml:space="preserve">How it works, step by step</w:t>
-      </w:r>
-    </w:p>
-    <w:p>
-      <w:pPr>
-        <w:spacing w:after="60" w:line="252" w:lineRule="auto"/>
-      </w:pPr>
-      <w:r>
-        <w:rPr>
-          <w:rFonts w:ascii="Calibri" w:cs="Calibri" w:eastAsia="Calibri" w:hAnsi="Calibri"/>
-          <w:b w:val="false"/>
-          <w:bCs w:val="false"/>
-          <w:i w:val="false"/>
-          <w:iCs w:val="false"/>
-          <w:color w:val="3A3A38"/>
-          <w:sz w:val="19"/>
-          <w:szCs w:val="19"/>
-        </w:rPr>
-        <w:t xml:space="preserve">In SAM, a guard’s message is what creates and updates their report, so a report is fixed either by voice or by editing the message. Both are practised below.</w:t>
+        <w:t xml:space="preserve">How it works</w:t>
       </w:r>
     </w:p>
     <w:p>
@@ -393,7 +348,7 @@
           <w:sz w:val="19"/>
           <w:szCs w:val="19"/>
         </w:rPr>
-        <w:t xml:space="preserve">The guard signs in for the first time. SAM opens by itself, before the home screen, for new and existing guards alike.</w:t>
+        <w:t xml:space="preserve">The guard signs in. SAM opens by itself, before the home screen, for new and existing guards alike.</w:t>
       </w:r>
     </w:p>
     <w:p>
@@ -416,7 +371,7 @@
           <w:sz w:val="19"/>
           <w:szCs w:val="19"/>
         </w:rPr>
-        <w:t xml:space="preserve">SAM opens with “Hello. I am SAM, your new assistant. From today you talk, and I write the report for you.” It says it can be taught the words the guard uses, and sets the ground rules: this is required, nothing in it counts, progress is saved.</w:t>
+        <w:t xml:space="preserve">SAM introduces itself as the guard’s new assistant, says it can be taught the words they use, and sets the ground rules: required, nothing counts, progress saved.</w:t>
       </w:r>
     </w:p>
     <w:p>
@@ -439,7 +394,7 @@
           <w:sz w:val="19"/>
           <w:szCs w:val="19"/>
         </w:rPr>
-        <w:t xml:space="preserve">Next, three setup gates: location, NFC (which reads the checkpoint tags), then background tracking, which lives in SAM OnSite’s own settings. Each has the same shape: SAM says what it needs and why, links to that setting, and the guard switches it on and returns to confirm. Microphone and camera are not gated — Android prompts for them when first used. Granting can close the app; the guard reopens it and resumes at the same gate.</w:t>
+        <w:t xml:space="preserve">Three setup gates: location, NFC, then background tracking, which sits in SAM OnSite’s own settings. SAM says what it needs and why, links straight to the setting, and the guard switches it on and returns. Microphone and camera are not gated; Android prompts for those when first used. Granting can close the app, and the flow resumes at the same gate.</w:t>
       </w:r>
     </w:p>
     <w:p>
@@ -462,7 +417,7 @@
           <w:sz w:val="19"/>
           <w:szCs w:val="19"/>
         </w:rPr>
-        <w:t xml:space="preserve">Only now does the guard speak. SAM asks them to press Talk, wait for the microphone to turn green, and ask how to report an incident. That first press doubles as the microphone check. Nothing live is created here.</w:t>
+        <w:t xml:space="preserve">Only now does the guard speak. They press Talk, wait for the green microphone, and ask how to report an incident. That first press doubles as the microphone check. Nothing live is created.</w:t>
       </w:r>
     </w:p>
     <w:p>
@@ -485,7 +440,7 @@
           <w:sz w:val="19"/>
           <w:szCs w:val="19"/>
         </w:rPr>
-        <w:t xml:space="preserve">Then the practice report. SAM asks for it the way the guard would tell a colleague and offers one to use: a Dell laptop is missing. SAM writes one report and puts it on screen as a card labelled “Training”.</w:t>
+        <w:t xml:space="preserve">The practice report. SAM asks for it the way the guard would tell a colleague and offers one: a Dell laptop is missing. One report is written and shown as a card labelled “Training”.</w:t>
       </w:r>
     </w:p>
     <w:p>
@@ -508,7 +463,7 @@
           <w:sz w:val="19"/>
           <w:szCs w:val="19"/>
         </w:rPr>
-        <w:t xml:space="preserve">With the report in front of them, the guard corrects it by hand first: they press and hold their own report message, which SAM marks on screen, add that it happened at reception, and save.</w:t>
+        <w:t xml:space="preserve">The guard fixes it by hand: press and hold their own report message, which SAM marks on screen, add that it happened at reception, save.</w:t>
       </w:r>
     </w:p>
     <w:p>
@@ -531,7 +486,7 @@
           <w:sz w:val="19"/>
           <w:szCs w:val="19"/>
         </w:rPr>
-        <w:t xml:space="preserve">Then by voice: the guard says what the item actually was, and the same report updates with no duplicate. Voice runs last so no later edit can overwrite it.</w:t>
+        <w:t xml:space="preserve">Then by voice: they say what the item actually was, and the same report updates. Voice runs last, because the report takes the state of the most recent message.</w:t>
       </w:r>
     </w:p>
     <w:p>
@@ -554,12 +509,12 @@
           <w:sz w:val="19"/>
           <w:szCs w:val="19"/>
         </w:rPr>
-        <w:t xml:space="preserve">SAM signs off, names the settings now switched on so a guard who missed one can catch it, and a Go-to-home button lands on the normal home screen. Completion is recorded only after each step has been seen done for real.</w:t>
-      </w:r>
-    </w:p>
-    <w:p>
-      <w:pPr>
-        <w:spacing w:after="40" w:before="20"/>
+        <w:t xml:space="preserve">SAM signs off, names the settings now on so a miss can be caught, and a button lands the guard on the home screen. Completion is recorded only after each step is seen done.</w:t>
+      </w:r>
+    </w:p>
+    <w:p>
+      <w:pPr>
+        <w:spacing w:after="30" w:before="20"/>
       </w:pPr>
       <w:r>
         <w:rPr>
@@ -572,7 +527,7 @@
           <w:sz w:val="18"/>
           <w:szCs w:val="18"/>
         </w:rPr>
-        <w:t xml:space="preserve">Throughout, the practice report carries the training flag from the instant it is created. That flag is what must keep it out of every live surface.</w:t>
+        <w:t xml:space="preserve">A guard’s message is what creates and updates their report, which is why it can be fixed either way. Throughout, the practice report carries the training flag from the instant it is created.</w:t>
       </w:r>
     </w:p>
     <w:p>
@@ -603,12 +558,12 @@
           <w:sz w:val="25"/>
           <w:szCs w:val="25"/>
         </w:rPr>
-        <w:t xml:space="preserve">What must be true, and how we confirm it</w:t>
-      </w:r>
-    </w:p>
-    <w:p>
-      <w:pPr>
-        <w:spacing w:after="70" w:line="252" w:lineRule="auto"/>
+        <w:t xml:space="preserve">What must be true</w:t>
+      </w:r>
+    </w:p>
+    <w:p>
+      <w:pPr>
+        <w:spacing w:after="60" w:line="252" w:lineRule="auto"/>
       </w:pPr>
       <w:r>
         <w:rPr>
@@ -633,7 +588,7 @@
           <w:sz w:val="16"/>
           <w:szCs w:val="16"/>
         </w:rPr>
-        <w:t xml:space="preserve">  an agreed behaviour.   </w:t>
+        <w:t xml:space="preserve">  agreed.   </w:t>
       </w:r>
       <w:r>
         <w:rPr>
@@ -658,7 +613,7 @@
           <w:sz w:val="16"/>
           <w:szCs w:val="16"/>
         </w:rPr>
-        <w:t xml:space="preserve">  our recommended default.   </w:t>
+        <w:t xml:space="preserve">  our recommendation.   </w:t>
       </w:r>
       <w:r>
         <w:rPr>
@@ -683,7 +638,7 @@
           <w:sz w:val="16"/>
           <w:szCs w:val="16"/>
         </w:rPr>
-        <w:t xml:space="preserve">  needs an engineering confirmation (listed in section 04).</w:t>
+        <w:t xml:space="preserve">  needs an answer (section 04).</w:t>
       </w:r>
     </w:p>
     <w:tbl>
@@ -773,7 +728,7 @@
                 <w:sz w:val="15"/>
                 <w:szCs w:val="15"/>
               </w:rPr>
-              <w:t xml:space="preserve">WHAT IT MEANS AND HOW WE CONFIRM IT</w:t>
+              <w:t xml:space="preserve">WHAT IT MEANS</w:t>
             </w:r>
           </w:p>
         </w:tc>
@@ -867,7 +822,7 @@
                 <w:sz w:val="18"/>
                 <w:szCs w:val="18"/>
               </w:rPr>
-              <w:t xml:space="preserve">SAM introduces itself as the guard’s new assistant and frames each step as a benefit. None of it reads as instructions. Signed off by product on a read-through, and tested with guards before release.</w:t>
+              <w:t xml:space="preserve">SAM introduces itself as the guard’s new assistant and frames each step as a benefit. Nothing reads as instructions. Signed off by product, and tested with guards before release.</w:t>
             </w:r>
           </w:p>
         </w:tc>
@@ -908,7 +863,7 @@
                 <w:sz w:val="18"/>
                 <w:szCs w:val="18"/>
               </w:rPr>
-              <w:t xml:space="preserve">Automatic start &amp; refresher</w:t>
+              <w:t xml:space="preserve">Set up the phone</w:t>
             </w:r>
           </w:p>
           <w:p>
@@ -961,7 +916,7 @@
                 <w:sz w:val="18"/>
                 <w:szCs w:val="18"/>
               </w:rPr>
-              <w:t xml:space="preserve">Opens by itself at first sign-in, before the home screen is reachable. A finished guard can reopen it any time without losing their completed status.</w:t>
+              <w:t xml:space="preserve">Location, NFC, background tracking, in that order. Microphone and camera are not gated: Android prompts for those when first used, so SAM only warns the guard to expect it. Location is gated because the app asks for it but not at “allow all the time”, and cannot read that level back, so SAM walks the guard to the second Android screen and names the setting.</w:t>
             </w:r>
           </w:p>
         </w:tc>
@@ -1002,7 +957,7 @@
                 <w:sz w:val="18"/>
                 <w:szCs w:val="18"/>
               </w:rPr>
-              <w:t xml:space="preserve">Everyone, exactly once</w:t>
+              <w:t xml:space="preserve">Checked again each session</w:t>
             </w:r>
           </w:p>
           <w:p>
@@ -1055,7 +1010,7 @@
                 <w:sz w:val="18"/>
                 <w:szCs w:val="18"/>
               </w:rPr>
-              <w:t xml:space="preserve">Every active guard receives it one time, including guards who already had accounts. After finishing, their next sign-in goes straight to the home screen.</w:t>
+              <w:t xml:space="preserve">Guards share handsets, so a set-up phone cannot be recorded against a guard. The three settings are checked again whenever a guard starts a session, and anything off is walked through. A check that passes costs seconds and needs no per-phone record.</w:t>
             </w:r>
           </w:p>
         </w:tc>
@@ -1096,7 +1051,7 @@
                 <w:sz w:val="18"/>
                 <w:szCs w:val="18"/>
               </w:rPr>
-              <w:t xml:space="preserve">Cannot be skipped</w:t>
+              <w:t xml:space="preserve">Marked as training at creation</w:t>
             </w:r>
           </w:p>
           <w:p>
@@ -1149,7 +1104,7 @@
                 <w:sz w:val="18"/>
                 <w:szCs w:val="18"/>
               </w:rPr>
-              <w:t xml:space="preserve">No path to the home screen except completing it, other than four defined exits: a real incident, a guard who cannot get past a step, a guard signing in with no connectivity, and leaving a refresher when already complete. None marks the guard complete.</w:t>
+              <w:t xml:space="preserve">Every practice report carries the training flag from the moment it is created, using the platform’s archive flag. If it cannot be created already marked, it is not created at all.</w:t>
             </w:r>
           </w:p>
         </w:tc>
@@ -1190,7 +1145,7 @@
                 <w:sz w:val="18"/>
                 <w:szCs w:val="18"/>
               </w:rPr>
-              <w:t xml:space="preserve">Set up the phone: location, NFC, background tracking</w:t>
+              <w:t xml:space="preserve">Kept out of every live surface</w:t>
             </w:r>
           </w:p>
           <w:p>
@@ -1243,7 +1198,7 @@
                 <w:sz w:val="18"/>
                 <w:szCs w:val="18"/>
               </w:rPr>
-              <w:t xml:space="preserve">Three gates. The microphone and camera are not among them: Android prompts for those when first used, so SAM just warns the guard to expect it. Location is gated because the app asks for it but not at “allow all the time”, and cannot read that level back, so SAM walks the guard to the second Android screen and names the setting. Granting can close the app; the flow resumes at the same gate.</w:t>
+              <w:t xml:space="preserve">Confirmed consumers: supervisor alerts, KPIs and dashboards, the Pronect Action Tracker, and the guard’s own activity list. The filter that excludes flagged data does not exist, which is why archived data is still visible in production. It must be built and verified before go-live.</w:t>
             </w:r>
           </w:p>
         </w:tc>
@@ -1284,7 +1239,7 @@
                 <w:sz w:val="18"/>
                 <w:szCs w:val="18"/>
               </w:rPr>
-              <w:t xml:space="preserve">A phone with no NFC chip</w:t>
+              <w:t xml:space="preserve">Nothing may trap a guard</w:t>
             </w:r>
           </w:p>
           <w:p>
@@ -1296,12 +1251,12 @@
                 <w:rFonts w:ascii="Calibri" w:cs="Calibri" w:eastAsia="Calibri" w:hAnsi="Calibri"/>
                 <w:b/>
                 <w:bCs/>
-                <w:color w:val="A05A38"/>
+                <w:color w:val="8A6A1F"/>
                 <w:spacing w:val="6"/>
                 <w:sz w:val="14"/>
                 <w:szCs w:val="14"/>
               </w:rPr>
-              <w:t xml:space="preserve">CHECK W/ ENG.</w:t>
+              <w:t xml:space="preserve">PROPOSED</w:t>
             </w:r>
           </w:p>
         </w:tc>
@@ -1337,7 +1292,7 @@
                 <w:sz w:val="18"/>
                 <w:szCs w:val="18"/>
               </w:rPr>
-              <w:t xml:space="preserve">The NFC gate is skipped instead of routing the guard to support over hardware they do not have. Whether the app can detect the chip, or read whether NFC is on, is still open.</w:t>
+              <w:t xml:space="preserve">There is no way to the home screen except finishing, apart from four exits: a real incident, a guard stuck on a step, no connectivity at sign-in, and leaving a refresher when already complete. None marks the guard complete. The real-incident exit must offer typed reporting before the microphone exists, or it is unusable where it matters most.</w:t>
             </w:r>
           </w:p>
         </w:tc>
@@ -1378,7 +1333,7 @@
                 <w:sz w:val="18"/>
                 <w:szCs w:val="18"/>
               </w:rPr>
-              <w:t xml:space="preserve">Granting permissions may close the app</w:t>
+              <w:t xml:space="preserve">Finishing is earned</w:t>
             </w:r>
           </w:p>
           <w:p>
@@ -1390,12 +1345,12 @@
                 <w:rFonts w:ascii="Calibri" w:cs="Calibri" w:eastAsia="Calibri" w:hAnsi="Calibri"/>
                 <w:b/>
                 <w:bCs/>
-                <w:color w:val="43724E"/>
+                <w:color w:val="8A6A1F"/>
                 <w:spacing w:val="6"/>
                 <w:sz w:val="14"/>
                 <w:szCs w:val="14"/>
               </w:rPr>
-              <w:t xml:space="preserve">CONFIRMED</w:t>
+              <w:t xml:space="preserve">PROPOSED</w:t>
             </w:r>
           </w:p>
         </w:tc>
@@ -1431,7 +1386,7 @@
                 <w:sz w:val="18"/>
                 <w:szCs w:val="18"/>
               </w:rPr>
-              <w:t xml:space="preserve">Granting permissions often restarts the app. Confirmed that the flow resumes where it left off, but the guard has to be told that before they leave for the settings, or they will not know to come back.</w:t>
+              <w:t xml:space="preserve">Recorded only after each step is seen done. A quiz or an “I’m done” button does not count. Held on the server, issued once per guard, surviving a closed app or a change of handset.</w:t>
             </w:r>
           </w:p>
         </w:tc>
@@ -1472,7 +1427,7 @@
                 <w:sz w:val="18"/>
                 <w:szCs w:val="18"/>
               </w:rPr>
-              <w:t xml:space="preserve">Ask a question (practice only)</w:t>
+              <w:t xml:space="preserve">Tips taught in context</w:t>
             </w:r>
           </w:p>
           <w:p>
@@ -1484,12 +1439,12 @@
                 <w:rFonts w:ascii="Calibri" w:cs="Calibri" w:eastAsia="Calibri" w:hAnsi="Calibri"/>
                 <w:b/>
                 <w:bCs/>
-                <w:color w:val="8A6A1F"/>
+                <w:color w:val="43724E"/>
                 <w:spacing w:val="6"/>
                 <w:sz w:val="14"/>
                 <w:szCs w:val="14"/>
               </w:rPr>
-              <w:t xml:space="preserve">PROPOSED</w:t>
+              <w:t xml:space="preserve">CONFIRMED</w:t>
             </w:r>
           </w:p>
         </w:tc>
@@ -1525,7 +1480,7 @@
                 <w:sz w:val="18"/>
                 <w:szCs w:val="18"/>
               </w:rPr>
-              <w:t xml:space="preserve">The guard asks a spoken question and SAM answers. Nothing live may result, so the practice context must suppress the activity record the app writes today. The answer to the suggested question is written in advance.</w:t>
+              <w:t xml:space="preserve">All eight tips from the deck’s General recommendations slide sit inside SAM’s spoken lines, at the step where each becomes useful. Two are practised rather than told: press-and-hold to fix a mistake is the manual-fix step, and full sentences is what the report prompt asks for.</w:t>
             </w:r>
           </w:p>
         </w:tc>
@@ -1566,7 +1521,7 @@
                 <w:sz w:val="18"/>
                 <w:szCs w:val="18"/>
               </w:rPr>
-              <w:t xml:space="preserve">Report one practice incident</w:t>
+              <w:t xml:space="preserve">Say what is tracked</w:t>
             </w:r>
           </w:p>
           <w:p>
@@ -1578,12 +1533,12 @@
                 <w:rFonts w:ascii="Calibri" w:cs="Calibri" w:eastAsia="Calibri" w:hAnsi="Calibri"/>
                 <w:b/>
                 <w:bCs/>
-                <w:color w:val="8A6A1F"/>
+                <w:color w:val="A05A38"/>
                 <w:spacing w:val="6"/>
                 <w:sz w:val="14"/>
                 <w:szCs w:val="14"/>
               </w:rPr>
-              <w:t xml:space="preserve">PROPOSED</w:t>
+              <w:t xml:space="preserve">CHECK W/ ENG.</w:t>
             </w:r>
           </w:p>
         </w:tc>
@@ -1619,947 +1574,7 @@
                 <w:sz w:val="18"/>
                 <w:szCs w:val="18"/>
               </w:rPr>
-              <w:t xml:space="preserve">The guard reports the made-up incident and SAM creates exactly one practice report. Repeats or retries must never create extra reports. Follow-up questions are capped and “I don’t know” always advances.</w:t>
-            </w:r>
-          </w:p>
-        </w:tc>
-      </w:tr>
-      <w:tr>
-        <w:trPr>
-          <w:cantSplit/>
-        </w:trPr>
-        <w:tc>
-          <w:tcPr>
-            <w:tcW w:type="dxa" w:w="2340"/>
-            <w:tcBorders>
-              <w:top w:val="none"/>
-              <w:left w:val="none"/>
-              <w:bottom w:val="none"/>
-              <w:right w:val="none"/>
-            </w:tcBorders>
-            <w:tcMar>
-              <w:top w:type="dxa" w:w="46"/>
-              <w:left w:type="dxa" w:w="40"/>
-              <w:bottom w:type="dxa" w:w="46"/>
-              <w:right w:type="dxa" w:w="150"/>
-            </w:tcMar>
-            <w:vAlign w:val="top"/>
-          </w:tcPr>
-          <w:p>
-            <w:pPr>
-              <w:spacing w:after="30"/>
-            </w:pPr>
-            <w:r>
-              <w:rPr>
-                <w:rFonts w:ascii="Calibri" w:cs="Calibri" w:eastAsia="Calibri" w:hAnsi="Calibri"/>
-                <w:b/>
-                <w:bCs/>
-                <w:i w:val="false"/>
-                <w:iCs w:val="false"/>
-                <w:color w:val="3A3A38"/>
-                <w:sz w:val="18"/>
-                <w:szCs w:val="18"/>
-              </w:rPr>
-              <w:t xml:space="preserve">Fix a report by voice</w:t>
-            </w:r>
-          </w:p>
-          <w:p>
-            <w:pPr>
-              <w:spacing w:after="0"/>
-            </w:pPr>
-            <w:r>
-              <w:rPr>
-                <w:rFonts w:ascii="Calibri" w:cs="Calibri" w:eastAsia="Calibri" w:hAnsi="Calibri"/>
-                <w:b/>
-                <w:bCs/>
-                <w:color w:val="43724E"/>
-                <w:spacing w:val="6"/>
-                <w:sz w:val="14"/>
-                <w:szCs w:val="14"/>
-              </w:rPr>
-              <w:t xml:space="preserve">CONFIRMED</w:t>
-            </w:r>
-          </w:p>
-        </w:tc>
-        <w:tc>
-          <w:tcPr>
-            <w:tcW w:type="dxa" w:w="7308"/>
-            <w:tcBorders>
-              <w:top w:val="none"/>
-              <w:left w:val="none"/>
-              <w:bottom w:val="none"/>
-              <w:right w:val="none"/>
-            </w:tcBorders>
-            <w:tcMar>
-              <w:top w:type="dxa" w:w="46"/>
-              <w:left w:type="dxa" w:w="40"/>
-              <w:bottom w:type="dxa" w:w="46"/>
-              <w:right w:type="dxa" w:w="150"/>
-            </w:tcMar>
-            <w:vAlign w:val="top"/>
-          </w:tcPr>
-          <w:p>
-            <w:pPr>
-              <w:spacing w:after="0" w:line="244" w:lineRule="auto"/>
-            </w:pPr>
-            <w:r>
-              <w:rPr>
-                <w:rFonts w:ascii="Calibri" w:cs="Calibri" w:eastAsia="Calibri" w:hAnsi="Calibri"/>
-                <w:b w:val="false"/>
-                <w:bCs w:val="false"/>
-                <w:i w:val="false"/>
-                <w:iCs w:val="false"/>
-                <w:color w:val="3A3A38"/>
-                <w:sz w:val="18"/>
-                <w:szCs w:val="18"/>
-              </w:rPr>
-              <w:t xml:space="preserve">The guard tells SAM it was a MacBook and the same report updates. Confirmed on the real app: no second report is created, and the report always takes the state of the most recent message, which is why the voice fix runs last.</w:t>
-            </w:r>
-          </w:p>
-        </w:tc>
-      </w:tr>
-      <w:tr>
-        <w:trPr>
-          <w:cantSplit/>
-        </w:trPr>
-        <w:tc>
-          <w:tcPr>
-            <w:tcW w:type="dxa" w:w="2340"/>
-            <w:tcBorders>
-              <w:top w:val="none"/>
-              <w:left w:val="none"/>
-              <w:bottom w:val="none"/>
-              <w:right w:val="none"/>
-            </w:tcBorders>
-            <w:tcMar>
-              <w:top w:type="dxa" w:w="46"/>
-              <w:left w:type="dxa" w:w="40"/>
-              <w:bottom w:type="dxa" w:w="46"/>
-              <w:right w:type="dxa" w:w="150"/>
-            </w:tcMar>
-            <w:vAlign w:val="top"/>
-          </w:tcPr>
-          <w:p>
-            <w:pPr>
-              <w:spacing w:after="30"/>
-            </w:pPr>
-            <w:r>
-              <w:rPr>
-                <w:rFonts w:ascii="Calibri" w:cs="Calibri" w:eastAsia="Calibri" w:hAnsi="Calibri"/>
-                <w:b/>
-                <w:bCs/>
-                <w:i w:val="false"/>
-                <w:iCs w:val="false"/>
-                <w:color w:val="3A3A38"/>
-                <w:sz w:val="18"/>
-                <w:szCs w:val="18"/>
-              </w:rPr>
-              <w:t xml:space="preserve">Fix a report by hand</w:t>
-            </w:r>
-          </w:p>
-          <w:p>
-            <w:pPr>
-              <w:spacing w:after="0"/>
-            </w:pPr>
-            <w:r>
-              <w:rPr>
-                <w:rFonts w:ascii="Calibri" w:cs="Calibri" w:eastAsia="Calibri" w:hAnsi="Calibri"/>
-                <w:b/>
-                <w:bCs/>
-                <w:color w:val="43724E"/>
-                <w:spacing w:val="6"/>
-                <w:sz w:val="14"/>
-                <w:szCs w:val="14"/>
-              </w:rPr>
-              <w:t xml:space="preserve">CONFIRMED</w:t>
-            </w:r>
-          </w:p>
-        </w:tc>
-        <w:tc>
-          <w:tcPr>
-            <w:tcW w:type="dxa" w:w="7308"/>
-            <w:tcBorders>
-              <w:top w:val="none"/>
-              <w:left w:val="none"/>
-              <w:bottom w:val="none"/>
-              <w:right w:val="none"/>
-            </w:tcBorders>
-            <w:tcMar>
-              <w:top w:type="dxa" w:w="46"/>
-              <w:left w:type="dxa" w:w="40"/>
-              <w:bottom w:type="dxa" w:w="46"/>
-              <w:right w:type="dxa" w:w="150"/>
-            </w:tcMar>
-            <w:vAlign w:val="top"/>
-          </w:tcPr>
-          <w:p>
-            <w:pPr>
-              <w:spacing w:after="0" w:line="244" w:lineRule="auto"/>
-            </w:pPr>
-            <w:r>
-              <w:rPr>
-                <w:rFonts w:ascii="Calibri" w:cs="Calibri" w:eastAsia="Calibri" w:hAnsi="Calibri"/>
-                <w:b w:val="false"/>
-                <w:bCs w:val="false"/>
-                <w:i w:val="false"/>
-                <w:iCs w:val="false"/>
-                <w:color w:val="3A3A38"/>
-                <w:sz w:val="18"/>
-                <w:szCs w:val="18"/>
-              </w:rPr>
-              <w:t xml:space="preserve">SAM names the change and points at the right message; the guard presses and holds their report, adds the location, and saves. The finished report ends up with both “MacBook” and “reception” in it. Confirmed on the real app.</w:t>
-            </w:r>
-          </w:p>
-        </w:tc>
-      </w:tr>
-      <w:tr>
-        <w:trPr>
-          <w:cantSplit/>
-        </w:trPr>
-        <w:tc>
-          <w:tcPr>
-            <w:tcW w:type="dxa" w:w="2340"/>
-            <w:tcBorders>
-              <w:top w:val="none"/>
-              <w:left w:val="none"/>
-              <w:bottom w:val="none"/>
-              <w:right w:val="none"/>
-            </w:tcBorders>
-            <w:tcMar>
-              <w:top w:type="dxa" w:w="46"/>
-              <w:left w:type="dxa" w:w="40"/>
-              <w:bottom w:type="dxa" w:w="46"/>
-              <w:right w:type="dxa" w:w="150"/>
-            </w:tcMar>
-            <w:vAlign w:val="top"/>
-          </w:tcPr>
-          <w:p>
-            <w:pPr>
-              <w:spacing w:after="30"/>
-            </w:pPr>
-            <w:r>
-              <w:rPr>
-                <w:rFonts w:ascii="Calibri" w:cs="Calibri" w:eastAsia="Calibri" w:hAnsi="Calibri"/>
-                <w:b/>
-                <w:bCs/>
-                <w:i w:val="false"/>
-                <w:iCs w:val="false"/>
-                <w:color w:val="3A3A38"/>
-                <w:sz w:val="18"/>
-                <w:szCs w:val="18"/>
-              </w:rPr>
-              <w:t xml:space="preserve">Marked as training at creation</w:t>
-            </w:r>
-          </w:p>
-          <w:p>
-            <w:pPr>
-              <w:spacing w:after="0"/>
-            </w:pPr>
-            <w:r>
-              <w:rPr>
-                <w:rFonts w:ascii="Calibri" w:cs="Calibri" w:eastAsia="Calibri" w:hAnsi="Calibri"/>
-                <w:b/>
-                <w:bCs/>
-                <w:color w:val="43724E"/>
-                <w:spacing w:val="6"/>
-                <w:sz w:val="14"/>
-                <w:szCs w:val="14"/>
-              </w:rPr>
-              <w:t xml:space="preserve">CONFIRMED</w:t>
-            </w:r>
-          </w:p>
-        </w:tc>
-        <w:tc>
-          <w:tcPr>
-            <w:tcW w:type="dxa" w:w="7308"/>
-            <w:tcBorders>
-              <w:top w:val="none"/>
-              <w:left w:val="none"/>
-              <w:bottom w:val="none"/>
-              <w:right w:val="none"/>
-            </w:tcBorders>
-            <w:tcMar>
-              <w:top w:type="dxa" w:w="46"/>
-              <w:left w:type="dxa" w:w="40"/>
-              <w:bottom w:type="dxa" w:w="46"/>
-              <w:right w:type="dxa" w:w="150"/>
-            </w:tcMar>
-            <w:vAlign w:val="top"/>
-          </w:tcPr>
-          <w:p>
-            <w:pPr>
-              <w:spacing w:after="0" w:line="244" w:lineRule="auto"/>
-            </w:pPr>
-            <w:r>
-              <w:rPr>
-                <w:rFonts w:ascii="Calibri" w:cs="Calibri" w:eastAsia="Calibri" w:hAnsi="Calibri"/>
-                <w:b w:val="false"/>
-                <w:bCs w:val="false"/>
-                <w:i w:val="false"/>
-                <w:iCs w:val="false"/>
-                <w:color w:val="3A3A38"/>
-                <w:sz w:val="18"/>
-                <w:szCs w:val="18"/>
-              </w:rPr>
-              <w:t xml:space="preserve">Every practice report carries the training flag from the moment it is created, using the platform’s archive / soft-delete flag. If it cannot be created already marked, it is not created at all. Whether the flag can be set atomically at creation is for engineering.</w:t>
-            </w:r>
-          </w:p>
-        </w:tc>
-      </w:tr>
-      <w:tr>
-        <w:trPr>
-          <w:cantSplit/>
-        </w:trPr>
-        <w:tc>
-          <w:tcPr>
-            <w:tcW w:type="dxa" w:w="2340"/>
-            <w:tcBorders>
-              <w:top w:val="none"/>
-              <w:left w:val="none"/>
-              <w:bottom w:val="none"/>
-              <w:right w:val="none"/>
-            </w:tcBorders>
-            <w:tcMar>
-              <w:top w:type="dxa" w:w="46"/>
-              <w:left w:type="dxa" w:w="40"/>
-              <w:bottom w:type="dxa" w:w="46"/>
-              <w:right w:type="dxa" w:w="150"/>
-            </w:tcMar>
-            <w:vAlign w:val="top"/>
-          </w:tcPr>
-          <w:p>
-            <w:pPr>
-              <w:spacing w:after="30"/>
-            </w:pPr>
-            <w:r>
-              <w:rPr>
-                <w:rFonts w:ascii="Calibri" w:cs="Calibri" w:eastAsia="Calibri" w:hAnsi="Calibri"/>
-                <w:b/>
-                <w:bCs/>
-                <w:i w:val="false"/>
-                <w:iCs w:val="false"/>
-                <w:color w:val="3A3A38"/>
-                <w:sz w:val="18"/>
-                <w:szCs w:val="18"/>
-              </w:rPr>
-              <w:t xml:space="preserve">Kept out of every live surface</w:t>
-            </w:r>
-          </w:p>
-          <w:p>
-            <w:pPr>
-              <w:spacing w:after="0"/>
-            </w:pPr>
-            <w:r>
-              <w:rPr>
-                <w:rFonts w:ascii="Calibri" w:cs="Calibri" w:eastAsia="Calibri" w:hAnsi="Calibri"/>
-                <w:b/>
-                <w:bCs/>
-                <w:color w:val="43724E"/>
-                <w:spacing w:val="6"/>
-                <w:sz w:val="14"/>
-                <w:szCs w:val="14"/>
-              </w:rPr>
-              <w:t xml:space="preserve">CONFIRMED</w:t>
-            </w:r>
-          </w:p>
-        </w:tc>
-        <w:tc>
-          <w:tcPr>
-            <w:tcW w:type="dxa" w:w="7308"/>
-            <w:tcBorders>
-              <w:top w:val="none"/>
-              <w:left w:val="none"/>
-              <w:bottom w:val="none"/>
-              <w:right w:val="none"/>
-            </w:tcBorders>
-            <w:tcMar>
-              <w:top w:type="dxa" w:w="46"/>
-              <w:left w:type="dxa" w:w="40"/>
-              <w:bottom w:type="dxa" w:w="46"/>
-              <w:right w:type="dxa" w:w="150"/>
-            </w:tcMar>
-            <w:vAlign w:val="top"/>
-          </w:tcPr>
-          <w:p>
-            <w:pPr>
-              <w:spacing w:after="0" w:line="244" w:lineRule="auto"/>
-            </w:pPr>
-            <w:r>
-              <w:rPr>
-                <w:rFonts w:ascii="Calibri" w:cs="Calibri" w:eastAsia="Calibri" w:hAnsi="Calibri"/>
-                <w:b w:val="false"/>
-                <w:bCs w:val="false"/>
-                <w:i w:val="false"/>
-                <w:iCs w:val="false"/>
-                <w:color w:val="3A3A38"/>
-                <w:sz w:val="18"/>
-                <w:szCs w:val="18"/>
-              </w:rPr>
-              <w:t xml:space="preserve">The practice report must appear in no live surface. Four are confirmed: supervisor alerts, KPI and dashboard figures, the Pronect Action Tracker, and the guard’s own activity list. Reports, exports, integrations and the stores behind them are the likely rest, listed for engineering. The filter that excludes training-flagged data does not exist yet, which is why archived data is still visible in production. It must be built and verified before go-live; until then this stays in DEV/UAT.</w:t>
-            </w:r>
-          </w:p>
-        </w:tc>
-      </w:tr>
-      <w:tr>
-        <w:trPr>
-          <w:cantSplit/>
-        </w:trPr>
-        <w:tc>
-          <w:tcPr>
-            <w:tcW w:type="dxa" w:w="2340"/>
-            <w:tcBorders>
-              <w:top w:val="none"/>
-              <w:left w:val="none"/>
-              <w:bottom w:val="none"/>
-              <w:right w:val="none"/>
-            </w:tcBorders>
-            <w:tcMar>
-              <w:top w:type="dxa" w:w="46"/>
-              <w:left w:type="dxa" w:w="40"/>
-              <w:bottom w:type="dxa" w:w="46"/>
-              <w:right w:type="dxa" w:w="150"/>
-            </w:tcMar>
-            <w:vAlign w:val="top"/>
-          </w:tcPr>
-          <w:p>
-            <w:pPr>
-              <w:spacing w:after="30"/>
-            </w:pPr>
-            <w:r>
-              <w:rPr>
-                <w:rFonts w:ascii="Calibri" w:cs="Calibri" w:eastAsia="Calibri" w:hAnsi="Calibri"/>
-                <w:b/>
-                <w:bCs/>
-                <w:i w:val="false"/>
-                <w:iCs w:val="false"/>
-                <w:color w:val="3A3A38"/>
-                <w:sz w:val="18"/>
-                <w:szCs w:val="18"/>
-              </w:rPr>
-              <w:t xml:space="preserve">Check the settings each session</w:t>
-            </w:r>
-          </w:p>
-          <w:p>
-            <w:pPr>
-              <w:spacing w:after="0"/>
-            </w:pPr>
-            <w:r>
-              <w:rPr>
-                <w:rFonts w:ascii="Calibri" w:cs="Calibri" w:eastAsia="Calibri" w:hAnsi="Calibri"/>
-                <w:b/>
-                <w:bCs/>
-                <w:color w:val="43724E"/>
-                <w:spacing w:val="6"/>
-                <w:sz w:val="14"/>
-                <w:szCs w:val="14"/>
-              </w:rPr>
-              <w:t xml:space="preserve">CONFIRMED</w:t>
-            </w:r>
-          </w:p>
-        </w:tc>
-        <w:tc>
-          <w:tcPr>
-            <w:tcW w:type="dxa" w:w="7308"/>
-            <w:tcBorders>
-              <w:top w:val="none"/>
-              <w:left w:val="none"/>
-              <w:bottom w:val="none"/>
-              <w:right w:val="none"/>
-            </w:tcBorders>
-            <w:tcMar>
-              <w:top w:type="dxa" w:w="46"/>
-              <w:left w:type="dxa" w:w="40"/>
-              <w:bottom w:type="dxa" w:w="46"/>
-              <w:right w:type="dxa" w:w="150"/>
-            </w:tcMar>
-            <w:vAlign w:val="top"/>
-          </w:tcPr>
-          <w:p>
-            <w:pPr>
-              <w:spacing w:after="0" w:line="244" w:lineRule="auto"/>
-            </w:pPr>
-            <w:r>
-              <w:rPr>
-                <w:rFonts w:ascii="Calibri" w:cs="Calibri" w:eastAsia="Calibri" w:hAnsi="Calibri"/>
-                <w:b w:val="false"/>
-                <w:bCs w:val="false"/>
-                <w:i w:val="false"/>
-                <w:iCs w:val="false"/>
-                <w:color w:val="3A3A38"/>
-                <w:sz w:val="18"/>
-                <w:szCs w:val="18"/>
-              </w:rPr>
-              <w:t xml:space="preserve">Guards share handsets, so the phone being ready cannot be recorded against the guard. Instead of tracking which phone is set up, the three settings are checked again when a guard starts a session, and anything off is walked through. A check that passes costs seconds and needs no per-phone record.</w:t>
-            </w:r>
-          </w:p>
-        </w:tc>
-      </w:tr>
-      <w:tr>
-        <w:trPr>
-          <w:cantSplit/>
-        </w:trPr>
-        <w:tc>
-          <w:tcPr>
-            <w:tcW w:type="dxa" w:w="2340"/>
-            <w:tcBorders>
-              <w:top w:val="none"/>
-              <w:left w:val="none"/>
-              <w:bottom w:val="none"/>
-              <w:right w:val="none"/>
-            </w:tcBorders>
-            <w:tcMar>
-              <w:top w:type="dxa" w:w="46"/>
-              <w:left w:type="dxa" w:w="40"/>
-              <w:bottom w:type="dxa" w:w="46"/>
-              <w:right w:type="dxa" w:w="150"/>
-            </w:tcMar>
-            <w:vAlign w:val="top"/>
-          </w:tcPr>
-          <w:p>
-            <w:pPr>
-              <w:spacing w:after="30"/>
-            </w:pPr>
-            <w:r>
-              <w:rPr>
-                <w:rFonts w:ascii="Calibri" w:cs="Calibri" w:eastAsia="Calibri" w:hAnsi="Calibri"/>
-                <w:b/>
-                <w:bCs/>
-                <w:i w:val="false"/>
-                <w:iCs w:val="false"/>
-                <w:color w:val="3A3A38"/>
-                <w:sz w:val="18"/>
-                <w:szCs w:val="18"/>
-              </w:rPr>
-              <w:t xml:space="preserve">Finishing means the phone works too</w:t>
-            </w:r>
-          </w:p>
-          <w:p>
-            <w:pPr>
-              <w:spacing w:after="0"/>
-            </w:pPr>
-            <w:r>
-              <w:rPr>
-                <w:rFonts w:ascii="Calibri" w:cs="Calibri" w:eastAsia="Calibri" w:hAnsi="Calibri"/>
-                <w:b/>
-                <w:bCs/>
-                <w:color w:val="8A6A1F"/>
-                <w:spacing w:val="6"/>
-                <w:sz w:val="14"/>
-                <w:szCs w:val="14"/>
-              </w:rPr>
-              <w:t xml:space="preserve">PROPOSED</w:t>
-            </w:r>
-          </w:p>
-        </w:tc>
-        <w:tc>
-          <w:tcPr>
-            <w:tcW w:type="dxa" w:w="7308"/>
-            <w:tcBorders>
-              <w:top w:val="none"/>
-              <w:left w:val="none"/>
-              <w:bottom w:val="none"/>
-              <w:right w:val="none"/>
-            </w:tcBorders>
-            <w:tcMar>
-              <w:top w:type="dxa" w:w="46"/>
-              <w:left w:type="dxa" w:w="40"/>
-              <w:bottom w:type="dxa" w:w="46"/>
-              <w:right w:type="dxa" w:w="150"/>
-            </w:tcMar>
-            <w:vAlign w:val="top"/>
-          </w:tcPr>
-          <w:p>
-            <w:pPr>
-              <w:spacing w:after="0" w:line="244" w:lineRule="auto"/>
-            </w:pPr>
-            <w:r>
-              <w:rPr>
-                <w:rFonts w:ascii="Calibri" w:cs="Calibri" w:eastAsia="Calibri" w:hAnsi="Calibri"/>
-                <w:b w:val="false"/>
-                <w:bCs w:val="false"/>
-                <w:i w:val="false"/>
-                <w:iCs w:val="false"/>
-                <w:color w:val="3A3A38"/>
-                <w:sz w:val="18"/>
-                <w:szCs w:val="18"/>
-              </w:rPr>
-              <w:t xml:space="preserve">Completion requires both halves: the three actions done for real, and the device set up. The app can see a permission that is off and will not advance past it. Three it cannot read — location at “allow all the time”, background activity, physical activity — are guided, trusted, and re-checked next session.</w:t>
-            </w:r>
-          </w:p>
-        </w:tc>
-      </w:tr>
-      <w:tr>
-        <w:trPr>
-          <w:cantSplit/>
-        </w:trPr>
-        <w:tc>
-          <w:tcPr>
-            <w:tcW w:type="dxa" w:w="2340"/>
-            <w:tcBorders>
-              <w:top w:val="none"/>
-              <w:left w:val="none"/>
-              <w:bottom w:val="none"/>
-              <w:right w:val="none"/>
-            </w:tcBorders>
-            <w:tcMar>
-              <w:top w:type="dxa" w:w="46"/>
-              <w:left w:type="dxa" w:w="40"/>
-              <w:bottom w:type="dxa" w:w="46"/>
-              <w:right w:type="dxa" w:w="150"/>
-            </w:tcMar>
-            <w:vAlign w:val="top"/>
-          </w:tcPr>
-          <w:p>
-            <w:pPr>
-              <w:spacing w:after="30"/>
-            </w:pPr>
-            <w:r>
-              <w:rPr>
-                <w:rFonts w:ascii="Calibri" w:cs="Calibri" w:eastAsia="Calibri" w:hAnsi="Calibri"/>
-                <w:b/>
-                <w:bCs/>
-                <w:i w:val="false"/>
-                <w:iCs w:val="false"/>
-                <w:color w:val="3A3A38"/>
-                <w:sz w:val="18"/>
-                <w:szCs w:val="18"/>
-              </w:rPr>
-              <w:t xml:space="preserve">Finishing is earned &amp; remembered</w:t>
-            </w:r>
-          </w:p>
-          <w:p>
-            <w:pPr>
-              <w:spacing w:after="0"/>
-            </w:pPr>
-            <w:r>
-              <w:rPr>
-                <w:rFonts w:ascii="Calibri" w:cs="Calibri" w:eastAsia="Calibri" w:hAnsi="Calibri"/>
-                <w:b/>
-                <w:bCs/>
-                <w:color w:val="8A6A1F"/>
-                <w:spacing w:val="6"/>
-                <w:sz w:val="14"/>
-                <w:szCs w:val="14"/>
-              </w:rPr>
-              <w:t xml:space="preserve">PROPOSED</w:t>
-            </w:r>
-          </w:p>
-        </w:tc>
-        <w:tc>
-          <w:tcPr>
-            <w:tcW w:type="dxa" w:w="7308"/>
-            <w:tcBorders>
-              <w:top w:val="none"/>
-              <w:left w:val="none"/>
-              <w:bottom w:val="none"/>
-              <w:right w:val="none"/>
-            </w:tcBorders>
-            <w:tcMar>
-              <w:top w:type="dxa" w:w="46"/>
-              <w:left w:type="dxa" w:w="40"/>
-              <w:bottom w:type="dxa" w:w="46"/>
-              <w:right w:type="dxa" w:w="150"/>
-            </w:tcMar>
-            <w:vAlign w:val="top"/>
-          </w:tcPr>
-          <w:p>
-            <w:pPr>
-              <w:spacing w:after="0" w:line="244" w:lineRule="auto"/>
-            </w:pPr>
-            <w:r>
-              <w:rPr>
-                <w:rFonts w:ascii="Calibri" w:cs="Calibri" w:eastAsia="Calibri" w:hAnsi="Calibri"/>
-                <w:b w:val="false"/>
-                <w:bCs w:val="false"/>
-                <w:i w:val="false"/>
-                <w:iCs w:val="false"/>
-                <w:color w:val="3A3A38"/>
-                <w:sz w:val="18"/>
-                <w:szCs w:val="18"/>
-              </w:rPr>
-              <w:t xml:space="preserve">Recorded only after SAM sees each step done for real. A quiz or an “I’m done” button does not count. Held on the server, issued once per guard, surviving a closed app or a change of handset.</w:t>
-            </w:r>
-          </w:p>
-        </w:tc>
-      </w:tr>
-      <w:tr>
-        <w:trPr>
-          <w:cantSplit/>
-        </w:trPr>
-        <w:tc>
-          <w:tcPr>
-            <w:tcW w:type="dxa" w:w="2340"/>
-            <w:tcBorders>
-              <w:top w:val="none"/>
-              <w:left w:val="none"/>
-              <w:bottom w:val="none"/>
-              <w:right w:val="none"/>
-            </w:tcBorders>
-            <w:tcMar>
-              <w:top w:type="dxa" w:w="46"/>
-              <w:left w:type="dxa" w:w="40"/>
-              <w:bottom w:type="dxa" w:w="46"/>
-              <w:right w:type="dxa" w:w="150"/>
-            </w:tcMar>
-            <w:vAlign w:val="top"/>
-          </w:tcPr>
-          <w:p>
-            <w:pPr>
-              <w:spacing w:after="30"/>
-            </w:pPr>
-            <w:r>
-              <w:rPr>
-                <w:rFonts w:ascii="Calibri" w:cs="Calibri" w:eastAsia="Calibri" w:hAnsi="Calibri"/>
-                <w:b/>
-                <w:bCs/>
-                <w:i w:val="false"/>
-                <w:iCs w:val="false"/>
-                <w:color w:val="3A3A38"/>
-                <w:sz w:val="18"/>
-                <w:szCs w:val="18"/>
-              </w:rPr>
-              <w:t xml:space="preserve">Tips taught in context</w:t>
-            </w:r>
-          </w:p>
-          <w:p>
-            <w:pPr>
-              <w:spacing w:after="0"/>
-            </w:pPr>
-            <w:r>
-              <w:rPr>
-                <w:rFonts w:ascii="Calibri" w:cs="Calibri" w:eastAsia="Calibri" w:hAnsi="Calibri"/>
-                <w:b/>
-                <w:bCs/>
-                <w:color w:val="43724E"/>
-                <w:spacing w:val="6"/>
-                <w:sz w:val="14"/>
-                <w:szCs w:val="14"/>
-              </w:rPr>
-              <w:t xml:space="preserve">CONFIRMED</w:t>
-            </w:r>
-          </w:p>
-        </w:tc>
-        <w:tc>
-          <w:tcPr>
-            <w:tcW w:type="dxa" w:w="7308"/>
-            <w:tcBorders>
-              <w:top w:val="none"/>
-              <w:left w:val="none"/>
-              <w:bottom w:val="none"/>
-              <w:right w:val="none"/>
-            </w:tcBorders>
-            <w:tcMar>
-              <w:top w:type="dxa" w:w="46"/>
-              <w:left w:type="dxa" w:w="40"/>
-              <w:bottom w:type="dxa" w:w="46"/>
-              <w:right w:type="dxa" w:w="150"/>
-            </w:tcMar>
-            <w:vAlign w:val="top"/>
-          </w:tcPr>
-          <w:p>
-            <w:pPr>
-              <w:spacing w:after="0" w:line="244" w:lineRule="auto"/>
-            </w:pPr>
-            <w:r>
-              <w:rPr>
-                <w:rFonts w:ascii="Calibri" w:cs="Calibri" w:eastAsia="Calibri" w:hAnsi="Calibri"/>
-                <w:b w:val="false"/>
-                <w:bCs w:val="false"/>
-                <w:i w:val="false"/>
-                <w:iCs w:val="false"/>
-                <w:color w:val="3A3A38"/>
-                <w:sz w:val="18"/>
-                <w:szCs w:val="18"/>
-              </w:rPr>
-              <w:t xml:space="preserve">All eight tips from the deck’s General recommendations slide are inside SAM’s spoken lines, at the step where each becomes useful. Two are practised rather than told: pressing and holding text to fix a mistake is the manual-fix step, and speaking in full sentences is what the report prompt asks for.</w:t>
-            </w:r>
-          </w:p>
-        </w:tc>
-      </w:tr>
-      <w:tr>
-        <w:trPr>
-          <w:cantSplit/>
-        </w:trPr>
-        <w:tc>
-          <w:tcPr>
-            <w:tcW w:type="dxa" w:w="2340"/>
-            <w:tcBorders>
-              <w:top w:val="none"/>
-              <w:left w:val="none"/>
-              <w:bottom w:val="none"/>
-              <w:right w:val="none"/>
-            </w:tcBorders>
-            <w:tcMar>
-              <w:top w:type="dxa" w:w="46"/>
-              <w:left w:type="dxa" w:w="40"/>
-              <w:bottom w:type="dxa" w:w="46"/>
-              <w:right w:type="dxa" w:w="150"/>
-            </w:tcMar>
-            <w:vAlign w:val="top"/>
-          </w:tcPr>
-          <w:p>
-            <w:pPr>
-              <w:spacing w:after="30"/>
-            </w:pPr>
-            <w:r>
-              <w:rPr>
-                <w:rFonts w:ascii="Calibri" w:cs="Calibri" w:eastAsia="Calibri" w:hAnsi="Calibri"/>
-                <w:b/>
-                <w:bCs/>
-                <w:i w:val="false"/>
-                <w:iCs w:val="false"/>
-                <w:color w:val="3A3A38"/>
-                <w:sz w:val="18"/>
-                <w:szCs w:val="18"/>
-              </w:rPr>
-              <w:t xml:space="preserve">Say what is tracked</w:t>
-            </w:r>
-          </w:p>
-          <w:p>
-            <w:pPr>
-              <w:spacing w:after="0"/>
-            </w:pPr>
-            <w:r>
-              <w:rPr>
-                <w:rFonts w:ascii="Calibri" w:cs="Calibri" w:eastAsia="Calibri" w:hAnsi="Calibri"/>
-                <w:b/>
-                <w:bCs/>
-                <w:color w:val="A05A38"/>
-                <w:spacing w:val="6"/>
-                <w:sz w:val="14"/>
-                <w:szCs w:val="14"/>
-              </w:rPr>
-              <w:t xml:space="preserve">CHECK W/ ENG.</w:t>
-            </w:r>
-          </w:p>
-        </w:tc>
-        <w:tc>
-          <w:tcPr>
-            <w:tcW w:type="dxa" w:w="7308"/>
-            <w:tcBorders>
-              <w:top w:val="none"/>
-              <w:left w:val="none"/>
-              <w:bottom w:val="none"/>
-              <w:right w:val="none"/>
-            </w:tcBorders>
-            <w:tcMar>
-              <w:top w:type="dxa" w:w="46"/>
-              <w:left w:type="dxa" w:w="40"/>
-              <w:bottom w:type="dxa" w:w="46"/>
-              <w:right w:type="dxa" w:w="150"/>
-            </w:tcMar>
-            <w:vAlign w:val="top"/>
-          </w:tcPr>
-          <w:p>
-            <w:pPr>
-              <w:spacing w:after="0" w:line="244" w:lineRule="auto"/>
-            </w:pPr>
-            <w:r>
-              <w:rPr>
-                <w:rFonts w:ascii="Calibri" w:cs="Calibri" w:eastAsia="Calibri" w:hAnsi="Calibri"/>
-                <w:b w:val="false"/>
-                <w:bCs w:val="false"/>
-                <w:i w:val="false"/>
-                <w:iCs w:val="false"/>
-                <w:color w:val="3A3A38"/>
-                <w:sz w:val="18"/>
-                <w:szCs w:val="18"/>
-              </w:rPr>
-              <w:t xml:space="preserve">Guards are asked for location and background tracking on a work phone and will ask what is done with it. One plain line belongs in the flow. The wording must come from Pronect. What a supervisor sees is not ours to state, and this document does not state it.</w:t>
-            </w:r>
-          </w:p>
-        </w:tc>
-      </w:tr>
-      <w:tr>
-        <w:trPr>
-          <w:cantSplit/>
-        </w:trPr>
-        <w:tc>
-          <w:tcPr>
-            <w:tcW w:type="dxa" w:w="2340"/>
-            <w:tcBorders>
-              <w:top w:val="none"/>
-              <w:left w:val="none"/>
-              <w:bottom w:val="none"/>
-              <w:right w:val="none"/>
-            </w:tcBorders>
-            <w:tcMar>
-              <w:top w:type="dxa" w:w="46"/>
-              <w:left w:type="dxa" w:w="40"/>
-              <w:bottom w:type="dxa" w:w="46"/>
-              <w:right w:type="dxa" w:w="150"/>
-            </w:tcMar>
-            <w:vAlign w:val="top"/>
-          </w:tcPr>
-          <w:p>
-            <w:pPr>
-              <w:spacing w:after="30"/>
-            </w:pPr>
-            <w:r>
-              <w:rPr>
-                <w:rFonts w:ascii="Calibri" w:cs="Calibri" w:eastAsia="Calibri" w:hAnsi="Calibri"/>
-                <w:b/>
-                <w:bCs/>
-                <w:i w:val="false"/>
-                <w:iCs w:val="false"/>
-                <w:color w:val="3A3A38"/>
-                <w:sz w:val="18"/>
-                <w:szCs w:val="18"/>
-              </w:rPr>
-              <w:t xml:space="preserve">A way out for a real incident</w:t>
-            </w:r>
-          </w:p>
-          <w:p>
-            <w:pPr>
-              <w:spacing w:after="0"/>
-            </w:pPr>
-            <w:r>
-              <w:rPr>
-                <w:rFonts w:ascii="Calibri" w:cs="Calibri" w:eastAsia="Calibri" w:hAnsi="Calibri"/>
-                <w:b/>
-                <w:bCs/>
-                <w:color w:val="8A6A1F"/>
-                <w:spacing w:val="6"/>
-                <w:sz w:val="14"/>
-                <w:szCs w:val="14"/>
-              </w:rPr>
-              <w:t xml:space="preserve">PROPOSED</w:t>
-            </w:r>
-          </w:p>
-        </w:tc>
-        <w:tc>
-          <w:tcPr>
-            <w:tcW w:type="dxa" w:w="7308"/>
-            <w:tcBorders>
-              <w:top w:val="none"/>
-              <w:left w:val="none"/>
-              <w:bottom w:val="none"/>
-              <w:right w:val="none"/>
-            </w:tcBorders>
-            <w:tcMar>
-              <w:top w:type="dxa" w:w="46"/>
-              <w:left w:type="dxa" w:w="40"/>
-              <w:bottom w:type="dxa" w:w="46"/>
-              <w:right w:type="dxa" w:w="150"/>
-            </w:tcMar>
-            <w:vAlign w:val="top"/>
-          </w:tcPr>
-          <w:p>
-            <w:pPr>
-              <w:spacing w:after="0" w:line="244" w:lineRule="auto"/>
-            </w:pPr>
-            <w:r>
-              <w:rPr>
-                <w:rFonts w:ascii="Calibri" w:cs="Calibri" w:eastAsia="Calibri" w:hAnsi="Calibri"/>
-                <w:b w:val="false"/>
-                <w:bCs w:val="false"/>
-                <w:i w:val="false"/>
-                <w:iCs w:val="false"/>
-                <w:color w:val="3A3A38"/>
-                <w:sz w:val="18"/>
-                <w:szCs w:val="18"/>
-              </w:rPr>
-              <w:t xml:space="preserve">Leave onboarding, report a real incident, return to the saved stage, with completion neither granted nor skipped. Reachable from every step. Crossing it must be unmistakable: the banner clears and the guard is told this one is live. Before the microphone exists it must offer typed reporting or say to call it in, or it is unusable exactly where it is most needed.</w:t>
+              <w:t xml:space="preserve">Guards are asked for location and background tracking on a work phone and will ask what is done with it. One plain line belongs in the flow, and the wording must come from Pronect. What a supervisor sees is not ours to state, and this document does not state it.</w:t>
             </w:r>
           </w:p>
         </w:tc>
@@ -2611,7 +1626,7 @@
           <w:sz w:val="20"/>
           <w:szCs w:val="20"/>
         </w:rPr>
-        <w:t xml:space="preserve">PRACTICE DATA MUST NEVER REACH LIVE OPERATIONS</w:t>
+        <w:t xml:space="preserve">PRACTICE DATA REACHING LIVE OPERATIONS</w:t>
       </w:r>
     </w:p>
     <w:p>
@@ -2629,7 +1644,7 @@
           <w:sz w:val="19"/>
           <w:szCs w:val="19"/>
         </w:rPr>
-        <w:t xml:space="preserve">A pretend stolen laptop must never pull a real supervisor out of bed. The practice report is stamped with the training flag at creation. </w:t>
+        <w:t xml:space="preserve">A pretend stolen laptop must never pull a real supervisor out of bed. The report is flagged at creation, but nothing acts on that flag yet and archived items still show in production. The exclusion has to be written into </w:t>
       </w:r>
       <w:r>
         <w:rPr>
@@ -2642,32 +1657,6 @@
           <w:sz w:val="19"/>
           <w:szCs w:val="19"/>
         </w:rPr>
-        <w:t xml:space="preserve">The catch:</w:t>
-      </w:r>
-      <w:r>
-        <w:rPr>
-          <w:rFonts w:ascii="Calibri" w:cs="Calibri" w:eastAsia="Calibri" w:hAnsi="Calibri"/>
-          <w:b w:val="false"/>
-          <w:bCs w:val="false"/>
-          <w:i w:val="false"/>
-          <w:iCs w:val="false"/>
-          <w:color w:val="3A3A38"/>
-          <w:sz w:val="19"/>
-          <w:szCs w:val="19"/>
-        </w:rPr>
-        <w:t xml:space="preserve"> nothing acts on that flag yet, and archived items still show in production. The exclusion has to be written first, into </w:t>
-      </w:r>
-      <w:r>
-        <w:rPr>
-          <w:rFonts w:ascii="Calibri" w:cs="Calibri" w:eastAsia="Calibri" w:hAnsi="Calibri"/>
-          <w:b/>
-          <w:bCs/>
-          <w:i w:val="false"/>
-          <w:iCs w:val="false"/>
-          <w:color w:val="3A3A38"/>
-          <w:sz w:val="19"/>
-          <w:szCs w:val="19"/>
-        </w:rPr>
         <w:t xml:space="preserve">the reporting layer</w:t>
       </w:r>
       <w:r>
@@ -2681,7 +1670,7 @@
           <w:sz w:val="19"/>
           <w:szCs w:val="19"/>
         </w:rPr>
-        <w:t xml:space="preserve">, where the product owner has said it belongs. Until it is built this stays in DEV/UAT. Switching it on in production later must be gated on the filter by something firmer than memory: a dispatched alert cannot be recalled.</w:t>
+        <w:t xml:space="preserve"> first. Until it is built and verified this stays in DEV/UAT, and turning it on in production later must be gated on the filter by something firmer than memory: a dispatched alert cannot be recalled.</w:t>
       </w:r>
     </w:p>
     <w:p>
@@ -2717,7 +1706,7 @@
           <w:sz w:val="19"/>
           <w:szCs w:val="19"/>
         </w:rPr>
-        <w:t xml:space="preserve">A real incident reported during practice would be flagged training and hidden from the supervisor it should reach. For the MVP the answer is cheap: a practice banner on every step, carrying the way out to normal reporting. Detection of what the guard actually said is deliberately deferred.</w:t>
+        <w:t xml:space="preserve">A real incident reported during practice would be flagged training and hidden from the supervisor it should reach. The MVP answer is cheap: a practice banner on every step, carrying the way out to normal reporting.</w:t>
       </w:r>
     </w:p>
     <w:p>
@@ -2735,25 +1724,25 @@
           <w:sz w:val="20"/>
           <w:szCs w:val="20"/>
         </w:rPr>
-        <w:t xml:space="preserve">NOTHING MAY LEAVE A GUARD STUCK ON SHIFT</w:t>
-      </w:r>
-    </w:p>
-    <w:p>
-      <w:pPr>
-        <w:spacing w:after="40" w:line="252" w:lineRule="auto"/>
-      </w:pPr>
-      <w:r>
-        <w:rPr>
-          <w:rFonts w:ascii="Calibri" w:cs="Calibri" w:eastAsia="Calibri" w:hAnsi="Calibri"/>
-          <w:b w:val="false"/>
-          <w:bCs w:val="false"/>
-          <w:i w:val="false"/>
-          <w:iCs w:val="false"/>
-          <w:color w:val="3A3A38"/>
-          <w:sz w:val="19"/>
-          <w:szCs w:val="19"/>
-        </w:rPr>
-        <w:t xml:space="preserve">Failures preserve progress and offer a retry. Three failed spoken attempts offer typing. A guard who still cannot proceed reaches the home screen with completion unmarked, because being un-onboarded is a reporting problem and being locked out on shift is a safety one. A missed setting is the one gap the MVP accepts, except the microphone, which fails visibly at the first Talk press.</w:t>
+        <w:t xml:space="preserve">A GUARD STUCK ON SHIFT</w:t>
+      </w:r>
+    </w:p>
+    <w:p>
+      <w:pPr>
+        <w:spacing w:after="30" w:line="252" w:lineRule="auto"/>
+      </w:pPr>
+      <w:r>
+        <w:rPr>
+          <w:rFonts w:ascii="Calibri" w:cs="Calibri" w:eastAsia="Calibri" w:hAnsi="Calibri"/>
+          <w:b w:val="false"/>
+          <w:bCs w:val="false"/>
+          <w:i w:val="false"/>
+          <w:iCs w:val="false"/>
+          <w:color w:val="3A3A38"/>
+          <w:sz w:val="19"/>
+          <w:szCs w:val="19"/>
+        </w:rPr>
+        <w:t xml:space="preserve">Failures keep progress and offer a retry; three failed spoken attempts offer typing; a guard who still cannot proceed reaches the home screen with completion unmarked. Being un-onboarded is a reporting problem. Being locked out on shift is a safety one.</w:t>
       </w:r>
     </w:p>
     <w:p>
@@ -2784,25 +1773,25 @@
           <w:sz w:val="25"/>
           <w:szCs w:val="25"/>
         </w:rPr>
-        <w:t xml:space="preserve">Confirm with engineering before building</w:t>
-      </w:r>
-    </w:p>
-    <w:p>
-      <w:pPr>
-        <w:spacing w:after="60" w:line="252" w:lineRule="auto"/>
-      </w:pPr>
-      <w:r>
-        <w:rPr>
-          <w:rFonts w:ascii="Calibri" w:cs="Calibri" w:eastAsia="Calibri" w:hAnsi="Calibri"/>
-          <w:b w:val="false"/>
-          <w:bCs w:val="false"/>
-          <w:i w:val="false"/>
-          <w:iCs w:val="false"/>
-          <w:color w:val="3A3A38"/>
-          <w:sz w:val="19"/>
-          <w:szCs w:val="19"/>
-        </w:rPr>
-        <w:t xml:space="preserve">None of these looks like a blocker.</w:t>
+        <w:t xml:space="preserve">Answers still needed</w:t>
+      </w:r>
+    </w:p>
+    <w:p>
+      <w:pPr>
+        <w:spacing w:after="50" w:line="252" w:lineRule="auto"/>
+      </w:pPr>
+      <w:r>
+        <w:rPr>
+          <w:rFonts w:ascii="Calibri" w:cs="Calibri" w:eastAsia="Calibri" w:hAnsi="Calibri"/>
+          <w:b w:val="false"/>
+          <w:bCs w:val="false"/>
+          <w:i w:val="false"/>
+          <w:iCs w:val="false"/>
+          <w:color w:val="3A3A38"/>
+          <w:sz w:val="19"/>
+          <w:szCs w:val="19"/>
+        </w:rPr>
+        <w:t xml:space="preserve">None looks like a blocker.</w:t>
       </w:r>
     </w:p>
     <w:p>
@@ -2825,7 +1814,7 @@
           <w:sz w:val="19"/>
           <w:szCs w:val="19"/>
         </w:rPr>
-        <w:t xml:space="preserve">Can it be launched on its own, outside whatever normally starts a scenario?</w:t>
+        <w:t xml:space="preserve">Does SAM need the notifications permission, and does it prompt for itself like the microphone and camera?</w:t>
       </w:r>
     </w:p>
     <w:p>
@@ -2848,7 +1837,7 @@
           <w:sz w:val="19"/>
           <w:szCs w:val="19"/>
         </w:rPr>
-        <w:t xml:space="preserve">Is there a practice mode in which neither the conversation nor the report enters live reporting?</w:t>
+        <w:t xml:space="preserve">What is the physical activity permission for, and does SAM need it at all?</w:t>
       </w:r>
     </w:p>
     <w:p>
@@ -2871,7 +1860,7 @@
           <w:sz w:val="19"/>
           <w:szCs w:val="19"/>
         </w:rPr>
-        <w:t xml:space="preserve">Does SAM need the notifications permission, and does it prompt for itself like the microphone and camera?</w:t>
+        <w:t xml:space="preserve">Can the app read whether NFC is on, and whether the handset has an NFC chip?</w:t>
       </w:r>
     </w:p>
     <w:p>
@@ -2894,7 +1883,7 @@
           <w:sz w:val="19"/>
           <w:szCs w:val="19"/>
         </w:rPr>
-        <w:t xml:space="preserve">Can the app read whether NFC is on, and whether the handset has an NFC chip at all?</w:t>
+        <w:t xml:space="preserve">Can setup stop the phone removing permissions from unused apps?</w:t>
       </w:r>
     </w:p>
     <w:p>
@@ -2917,7 +1906,7 @@
           <w:sz w:val="19"/>
           <w:szCs w:val="19"/>
         </w:rPr>
-        <w:t xml:space="preserve">What is the physical activity permission for, and does SAM need it?</w:t>
+        <w:t xml:space="preserve">Can the practice question be kept out of the activity table entirely? It writes a row today.</w:t>
       </w:r>
     </w:p>
     <w:p>
@@ -2940,53 +1929,7 @@
           <w:sz w:val="19"/>
           <w:szCs w:val="19"/>
         </w:rPr>
-        <w:t xml:space="preserve">Which permissions and grant levels does the app need, can setup stop the phone’s automatic permission removal for unused apps, and does granting permissions always require a restart?</w:t>
-      </w:r>
-    </w:p>
-    <w:p>
-      <w:pPr>
-        <w:pStyle w:val="ListParagraph"/>
-        <w:numPr>
-          <w:ilvl w:val="0"/>
-          <w:numId w:val="3"/>
-        </w:numPr>
-        <w:spacing w:after="48" w:line="250" w:lineRule="auto"/>
-      </w:pPr>
-      <w:r>
-        <w:rPr>
-          <w:rFonts w:ascii="Calibri" w:cs="Calibri" w:eastAsia="Calibri" w:hAnsi="Calibri"/>
-          <w:b w:val="false"/>
-          <w:bCs w:val="false"/>
-          <w:i w:val="false"/>
-          <w:iCs w:val="false"/>
-          <w:color w:val="3A3A38"/>
-          <w:sz w:val="19"/>
-          <w:szCs w:val="19"/>
-        </w:rPr>
-        <w:t xml:space="preserve">Which live surfaces must the exclusion filter cover, and where are reports created so the training flag is set there?</w:t>
-      </w:r>
-    </w:p>
-    <w:p>
-      <w:pPr>
-        <w:pStyle w:val="ListParagraph"/>
-        <w:numPr>
-          <w:ilvl w:val="0"/>
-          <w:numId w:val="3"/>
-        </w:numPr>
-        <w:spacing w:after="48" w:line="250" w:lineRule="auto"/>
-      </w:pPr>
-      <w:r>
-        <w:rPr>
-          <w:rFonts w:ascii="Calibri" w:cs="Calibri" w:eastAsia="Calibri" w:hAnsi="Calibri"/>
-          <w:b w:val="false"/>
-          <w:bCs w:val="false"/>
-          <w:i w:val="false"/>
-          <w:iCs w:val="false"/>
-          <w:color w:val="3A3A38"/>
-          <w:sz w:val="19"/>
-          <w:szCs w:val="19"/>
-        </w:rPr>
-        <w:t xml:space="preserve">Is there already a place to store a guard’s onboarding completion, or must one be added?</w:t>
+        <w:t xml:space="preserve">Which live surfaces must the exclusion filter cover, and where are reports created so the flag is set there?</w:t>
       </w:r>
     </w:p>
     <w:p>
@@ -3017,69 +1960,25 @@
           <w:sz w:val="25"/>
           <w:szCs w:val="25"/>
         </w:rPr>
-        <w:t xml:space="preserve">Rollout, guardrails, and done</w:t>
-      </w:r>
-    </w:p>
-    <w:p>
-      <w:pPr>
-        <w:spacing w:after="60" w:line="252" w:lineRule="auto"/>
-      </w:pPr>
-      <w:r>
-        <w:rPr>
-          <w:rFonts w:ascii="Calibri" w:cs="Calibri" w:eastAsia="Calibri" w:hAnsi="Calibri"/>
-          <w:b w:val="false"/>
-          <w:bCs w:val="false"/>
-          <w:i w:val="false"/>
-          <w:iCs w:val="false"/>
-          <w:color w:val="3A3A38"/>
-          <w:sz w:val="19"/>
-          <w:szCs w:val="19"/>
-        </w:rPr>
-        <w:t xml:space="preserve">Production go-live is </w:t>
-      </w:r>
-      <w:r>
-        <w:rPr>
-          <w:rFonts w:ascii="Calibri" w:cs="Calibri" w:eastAsia="Calibri" w:hAnsi="Calibri"/>
-          <w:b/>
-          <w:bCs/>
-          <w:i w:val="false"/>
-          <w:iCs w:val="false"/>
-          <w:color w:val="3A3A38"/>
-          <w:sz w:val="19"/>
-          <w:szCs w:val="19"/>
-        </w:rPr>
-        <w:t xml:space="preserve">blocked</w:t>
-      </w:r>
-      <w:r>
-        <w:rPr>
-          <w:rFonts w:ascii="Calibri" w:cs="Calibri" w:eastAsia="Calibri" w:hAnsi="Calibri"/>
-          <w:b w:val="false"/>
-          <w:bCs w:val="false"/>
-          <w:i w:val="false"/>
-          <w:iCs w:val="false"/>
-          <w:color w:val="3A3A38"/>
-          <w:sz w:val="19"/>
-          <w:szCs w:val="19"/>
-        </w:rPr>
-        <w:t xml:space="preserve"> until the exclusion filter is built and verified; until then it runs only in DEV/UAT with a dedicated test tenant and test guards. Roll out behind a switch: on gradually, off instantly, and never erasing anyone’s completed status. Universal for all guards, no customer-specific setup, no changes to existing templates.</w:t>
-      </w:r>
-    </w:p>
-    <w:p>
-      <w:pPr>
-        <w:pStyle w:val="Heading2"/>
-        <w:keepNext/>
-        <w:spacing w:after="60" w:before="160"/>
-      </w:pPr>
-      <w:r>
-        <w:rPr>
-          <w:rFonts w:ascii="Georgia" w:cs="Georgia" w:eastAsia="Georgia" w:hAnsi="Georgia"/>
-          <w:b/>
-          <w:bCs/>
-          <w:color w:val="2E3A44"/>
-          <w:sz w:val="20"/>
-          <w:szCs w:val="20"/>
-        </w:rPr>
-        <w:t xml:space="preserve">DONE MEANS</w:t>
+        <w:t xml:space="preserve">Rollout and done</w:t>
+      </w:r>
+    </w:p>
+    <w:p>
+      <w:pPr>
+        <w:spacing w:after="50" w:line="252" w:lineRule="auto"/>
+      </w:pPr>
+      <w:r>
+        <w:rPr>
+          <w:rFonts w:ascii="Calibri" w:cs="Calibri" w:eastAsia="Calibri" w:hAnsi="Calibri"/>
+          <w:b w:val="false"/>
+          <w:bCs w:val="false"/>
+          <w:i w:val="false"/>
+          <w:iCs w:val="false"/>
+          <w:color w:val="3A3A38"/>
+          <w:sz w:val="19"/>
+          <w:szCs w:val="19"/>
+        </w:rPr>
+        <w:t xml:space="preserve">Go-live is blocked until the exclusion filter is built and verified; until then, DEV/UAT only, with a test tenant and test guards. Behind a switch: on gradually, off instantly, never erasing a completed status. Universal for all guards, no customer-specific setup, no template changes.</w:t>
       </w:r>
     </w:p>
     <w:p>
@@ -3102,7 +2001,7 @@
           <w:sz w:val="19"/>
           <w:szCs w:val="19"/>
         </w:rPr>
-        <w:t xml:space="preserve">Every guard, new or existing, completes it once by doing the real steps and ends with a set-up phone; the refresher preserves completion.</w:t>
+        <w:t xml:space="preserve">Every guard completes it once by doing the real steps and ends with a set-up phone.</w:t>
       </w:r>
     </w:p>
     <w:p>
@@ -3125,7 +2024,7 @@
           <w:sz w:val="19"/>
           <w:szCs w:val="19"/>
         </w:rPr>
-        <w:t xml:space="preserve">The exclusion filter is built, the practice report is proven absent from every live surface, and a forced hide-failure withholds completion.</w:t>
+        <w:t xml:space="preserve">The practice report is proven absent from every live surface, and a forced hide-failure withholds completion.</w:t>
       </w:r>
     </w:p>
     <w:p>
@@ -3148,7 +2047,7 @@
           <w:sz w:val="19"/>
           <w:szCs w:val="19"/>
         </w:rPr>
-        <w:t xml:space="preserve">The confirm-with-engineering items are answered and Vincent Smeyers has signed off.</w:t>
+        <w:t xml:space="preserve">The open questions are answered and Vincent Smeyers has signed off.</w:t>
       </w:r>
     </w:p>
     <w:p>
@@ -3156,7 +2055,7 @@
         <w:pBdr>
           <w:top w:val="single" w:color="E6E4DF" w:sz="5" w:space="5"/>
         </w:pBdr>
-        <w:spacing w:before="90"/>
+        <w:spacing w:before="80"/>
       </w:pPr>
       <w:r>
         <w:rPr>

</xml_diff>

<commit_message>
Shorten section 03 and gloss DEV/UAT once
Same three risks, same facts, fewer words and plainer wording. The
reverse-direction risk is now told as a sequence rather than a
conditional, which is easier to follow cold. DEV/UAT is glossed at its
first use so a non-technical reader is not stopped by it.
</commit_message>
<xml_diff>
--- a/deliverables/US1117/SAM_OnSite_Guard_Onboarding_Spec.docx
+++ b/deliverables/US1117/SAM_OnSite_Guard_Onboarding_Spec.docx
@@ -286,7 +286,7 @@
                 <w:sz w:val="19"/>
                 <w:szCs w:val="19"/>
               </w:rPr>
-              <w:t xml:space="preserve">At first sign-in SAM introduces itself, sets the phone up (location, NFC, background tracking) and teaches three actions — ask, report, correct — on a made-up incident. Roughly three to five minutes, mandatory, saves progress, done only when each step is genuinely done. It replaces the deck’s app-setup slides and absorbs its tips. Practice data must stay out of every live surface; the filter that enforces that is not built, so this runs in DEV/UAT until it is.</w:t>
+              <w:t xml:space="preserve">At first sign-in SAM introduces itself, sets the phone up (location, NFC, background tracking) and teaches three actions — ask, report, correct — on a made-up incident. Roughly three to five minutes, mandatory, saves progress, done only when each step is genuinely done. It replaces the deck’s app-setup slides and absorbs its tips. Practice data must stay out of every live surface; the filter that enforces that is not built, so this runs in DEV/UAT — the internal test systems — until it is.</w:t>
             </w:r>
           </w:p>
         </w:tc>
@@ -1532,7 +1532,7 @@
           <w:sz w:val="19"/>
           <w:szCs w:val="19"/>
         </w:rPr>
-        <w:t xml:space="preserve">A pretend stolen laptop must never pull a real supervisor out of bed. The report is flagged at creation, but nothing acts on that flag yet and archived items still show in production. The exclusion has to be written into </w:t>
+        <w:t xml:space="preserve">A pretend stolen laptop must never wake a real supervisor. Practice reports are flagged the moment they are created, but nothing acts on that flag yet, so archived items still show in production. The filter has to be built into </w:t>
       </w:r>
       <w:r>
         <w:rPr>
@@ -1558,7 +1558,7 @@
           <w:sz w:val="19"/>
           <w:szCs w:val="19"/>
         </w:rPr>
-        <w:t xml:space="preserve"> first. That work sits outside this specification and is not scoped here, and it sets the go-live date. Until it exists this stays in DEV/UAT. Turning it on in production later should be enforced by a server-side check that refuses to start onboarding when the filter is absent, since a dispatched alert cannot be recalled. Practice records are hidden, not deleted; clearing them is a separate database task with no date.</w:t>
+        <w:t xml:space="preserve"> first. That work is not scoped here and it sets the go-live date. Until then this stays in DEV/UAT, and a check on the server should refuse to start onboarding without the filter, because a dispatched alert cannot be recalled. Flagged records are hidden, not deleted; clearing them is a separate job with no date.</w:t>
       </w:r>
     </w:p>
     <w:p>
@@ -1594,7 +1594,7 @@
           <w:sz w:val="19"/>
           <w:szCs w:val="19"/>
         </w:rPr>
-        <w:t xml:space="preserve">A real incident reported during practice would be flagged training and hidden from the supervisor it should reach. The MVP answer is cheap: a practice banner on every step, carrying the way out to normal reporting.</w:t>
+        <w:t xml:space="preserve">Something real happens while the guard is practising. They report it, and the training flag hides it from the supervisor who needed it. The fix is cheap: a practice banner on every step, with the way out to normal reporting on it.</w:t>
       </w:r>
     </w:p>
     <w:p>
@@ -1630,7 +1630,7 @@
           <w:sz w:val="19"/>
           <w:szCs w:val="19"/>
         </w:rPr>
-        <w:t xml:space="preserve">Failures keep progress and offer a retry; three failed spoken attempts offer typing; a guard who still cannot proceed reaches the home screen with completion unmarked. Being un-onboarded is a reporting problem. Being locked out on shift is a safety one.</w:t>
+        <w:t xml:space="preserve">A failure keeps progress and offers a retry. Three failed spoken attempts offer typing. A guard who still cannot get past a step reaches the home screen anyway, with completion unmarked. Being un-onboarded is a reporting problem; being locked out mid-shift is a safety one.</w:t>
       </w:r>
     </w:p>
     <w:p>

</xml_diff>